<commit_message>
Atualiza para v1.3: script generico, multifonte (Eta/BESM 13 meses), config YAML e prepara_gfs
- rf_previsto.py: qualquer horizonte (h/d/meses) e fonte (--fonte gfs|eta|besm)
- rf_fontes.py: camada de fontes, layouts por_tempo/serie, BESM T062 real
- rf_config.py + config_exemplo.yaml: entradas configuraveis via YAML (--config)
- prepara_gfs.py: download do GFS via NOMADS/OpenDAP e preparo das entradas
- rf_core.py: calcula_risco_fogo_dados (arrays) para o modo multifonte
- 4 suites de teste novas; manual v1.3, relatorio e instrucoes de git
</commit_message>
<xml_diff>
--- a/docs/manual_usuario.docx
+++ b/docs/manual_usuario.docx
@@ -46,7 +46,7 @@
           <w:sz w:val="22"/>
           <w:szCs w:val="22"/>
         </w:rPr>
-        <w:t xml:space="preserve">Versão 1.0 · 4 de agosto de 2026</w:t>
+        <w:t xml:space="preserve">Versão 1.3 · 4 de agosto de 2026</w:t>
       </w:r>
     </w:p>
     <w:p>
@@ -157,7 +157,7 @@
           <w:sz w:val="22"/>
           <w:szCs w:val="22"/>
         </w:rPr>
-        <w:t xml:space="preserve">Este pacote calcula o Risco de Fogo (RF) previsto em resolução de 1 km para a América do Sul, combinando a precipitação observada do IMERG (últimos 119 dias), as previsões do GFS (precipitação, temperatura e umidade relativa a 2 m), o mapa de vegetação (MapBiomas/IGBP) e a topografia (GTOPO30). São dois programas:</w:t>
+        <w:t xml:space="preserve">Este pacote calcula o Risco de Fogo (RF) previsto em resolução de 1 km para a América do Sul, combinando a precipitação observada do IMERG (últimos 119 dias), as previsões do GFS (precipitação, temperatura e umidade relativa a 2 m), o mapa de vegetação (MapBiomas/IGBP) e a topografia (GTOPO30). São três programas:</w:t>
       </w:r>
     </w:p>
     <w:p>
@@ -224,6 +224,37 @@
     </w:p>
     <w:p>
       <w:pPr>
+        <w:pStyle w:val="ListParagraph"/>
+        <w:numPr>
+          <w:ilvl w:val="0"/>
+          <w:numId w:val="2"/>
+        </w:numPr>
+        <w:spacing w:after="100" w:line="276"/>
+        <w:jc w:val="both"/>
+      </w:pPr>
+      <w:r>
+        <w:rPr>
+          <w:rFonts w:ascii="Calibri" w:cs="Calibri" w:eastAsia="Calibri" w:hAnsi="Calibri"/>
+          <w:b/>
+          <w:bCs/>
+          <w:sz w:val="22"/>
+          <w:szCs w:val="22"/>
+        </w:rPr>
+        <w:t xml:space="preserve">rf_previsto.py</w:t>
+      </w:r>
+      <w:r>
+        <w:rPr>
+          <w:rFonts w:ascii="Calibri" w:cs="Calibri" w:eastAsia="Calibri" w:hAnsi="Calibri"/>
+          <w:b w:val="false"/>
+          <w:bCs w:val="false"/>
+          <w:sz w:val="22"/>
+          <w:szCs w:val="22"/>
+        </w:rPr>
+        <w:t xml:space="preserve"> — script genérico: gera o RF para qualquer horizonte de previsão e diferentes fontes de dados (GFS, Eta, BESM) informados na linha de comando (seção 5).</w:t>
+      </w:r>
+    </w:p>
+    <w:p>
+      <w:pPr>
         <w:spacing w:after="160" w:line="276"/>
         <w:jc w:val="both"/>
       </w:pPr>
@@ -305,7 +336,7 @@
           <w:sz w:val="19"/>
           <w:szCs w:val="19"/>
         </w:rPr>
-        <w:t xml:space="preserve">pip install numpy xarray netCDF4 rasterio</w:t>
+        <w:t xml:space="preserve">pip install numpy xarray netCDF4 rasterio pyyaml</w:t>
       </w:r>
     </w:p>
     <w:p>
@@ -990,7 +1021,7 @@
           <w:sz w:val="22"/>
           <w:szCs w:val="22"/>
         </w:rPr>
-        <w:t xml:space="preserve">Copie os quatro arquivos para o diretório de scripts do modelo (os três primeiros são obrigatórios; o teste é opcional):</w:t>
+        <w:t xml:space="preserve">Copie os arquivos para o diretório de scripts do modelo (os testes são opcionais):</w:t>
       </w:r>
     </w:p>
     <w:p>
@@ -1018,7 +1049,7 @@
           <w:sz w:val="19"/>
           <w:szCs w:val="19"/>
         </w:rPr>
-        <w:t xml:space="preserve">rf_previsto_1_5dias.py</w:t>
+        <w:t xml:space="preserve">rf_fontes.py</w:t>
       </w:r>
     </w:p>
     <w:p>
@@ -1032,13 +1063,13 @@
           <w:sz w:val="19"/>
           <w:szCs w:val="19"/>
         </w:rPr>
-        <w:t xml:space="preserve">rf_previsto_1_2_semanas.py</w:t>
+        <w:t xml:space="preserve">rf_config.py</w:t>
       </w:r>
     </w:p>
     <w:p>
       <w:pPr>
         <w:shd w:fill="F2F2F2" w:val="clear"/>
-        <w:spacing w:after="160"/>
+        <w:spacing w:after="0"/>
       </w:pPr>
       <w:r>
         <w:rPr>
@@ -1046,7 +1077,91 @@
           <w:sz w:val="19"/>
           <w:szCs w:val="19"/>
         </w:rPr>
+        <w:t xml:space="preserve">config_exemplo.yaml</w:t>
+      </w:r>
+    </w:p>
+    <w:p>
+      <w:pPr>
+        <w:shd w:fill="F2F2F2" w:val="clear"/>
+        <w:spacing w:after="0"/>
+      </w:pPr>
+      <w:r>
+        <w:rPr>
+          <w:rFonts w:ascii="Consolas" w:cs="Consolas" w:eastAsia="Consolas" w:hAnsi="Consolas"/>
+          <w:sz w:val="19"/>
+          <w:szCs w:val="19"/>
+        </w:rPr>
+        <w:t xml:space="preserve">rf_previsto_1_5dias.py</w:t>
+      </w:r>
+    </w:p>
+    <w:p>
+      <w:pPr>
+        <w:shd w:fill="F2F2F2" w:val="clear"/>
+        <w:spacing w:after="0"/>
+      </w:pPr>
+      <w:r>
+        <w:rPr>
+          <w:rFonts w:ascii="Consolas" w:cs="Consolas" w:eastAsia="Consolas" w:hAnsi="Consolas"/>
+          <w:sz w:val="19"/>
+          <w:szCs w:val="19"/>
+        </w:rPr>
+        <w:t xml:space="preserve">rf_previsto_1_2_semanas.py</w:t>
+      </w:r>
+    </w:p>
+    <w:p>
+      <w:pPr>
+        <w:shd w:fill="F2F2F2" w:val="clear"/>
+        <w:spacing w:after="0"/>
+      </w:pPr>
+      <w:r>
+        <w:rPr>
+          <w:rFonts w:ascii="Consolas" w:cs="Consolas" w:eastAsia="Consolas" w:hAnsi="Consolas"/>
+          <w:sz w:val="19"/>
+          <w:szCs w:val="19"/>
+        </w:rPr>
+        <w:t xml:space="preserve">rf_previsto.py</w:t>
+      </w:r>
+    </w:p>
+    <w:p>
+      <w:pPr>
+        <w:shd w:fill="F2F2F2" w:val="clear"/>
+        <w:spacing w:after="0"/>
+      </w:pPr>
+      <w:r>
+        <w:rPr>
+          <w:rFonts w:ascii="Consolas" w:cs="Consolas" w:eastAsia="Consolas" w:hAnsi="Consolas"/>
+          <w:sz w:val="19"/>
+          <w:szCs w:val="19"/>
+        </w:rPr>
         <w:t xml:space="preserve">teste_rf.py</w:t>
+      </w:r>
+    </w:p>
+    <w:p>
+      <w:pPr>
+        <w:shd w:fill="F2F2F2" w:val="clear"/>
+        <w:spacing w:after="0"/>
+      </w:pPr>
+      <w:r>
+        <w:rPr>
+          <w:rFonts w:ascii="Consolas" w:cs="Consolas" w:eastAsia="Consolas" w:hAnsi="Consolas"/>
+          <w:sz w:val="19"/>
+          <w:szCs w:val="19"/>
+        </w:rPr>
+        <w:t xml:space="preserve">teste_rf_previsto.py</w:t>
+      </w:r>
+    </w:p>
+    <w:p>
+      <w:pPr>
+        <w:shd w:fill="F2F2F2" w:val="clear"/>
+        <w:spacing w:after="160"/>
+      </w:pPr>
+      <w:r>
+        <w:rPr>
+          <w:rFonts w:ascii="Consolas" w:cs="Consolas" w:eastAsia="Consolas" w:hAnsi="Consolas"/>
+          <w:sz w:val="19"/>
+          <w:szCs w:val="19"/>
+        </w:rPr>
+        <w:t xml:space="preserve">teste_rf_multifonte.py</w:t>
       </w:r>
     </w:p>
     <w:p>
@@ -1065,7 +1180,7 @@
           <w:sz w:val="22"/>
           <w:szCs w:val="22"/>
         </w:rPr>
-        <w:t xml:space="preserve">Os três arquivos devem ficar no mesmo diretório (os orquestradores fazem import rf_core). Se desejar, torne-os executáveis:</w:t>
+        <w:t xml:space="preserve">Os scripts devem ficar no mesmo diretório (os orquestradores fazem import rf_core). Se desejar, torne-os executáveis:</w:t>
       </w:r>
     </w:p>
     <w:p>
@@ -1808,7 +1923,26 @@
           <w:sz w:val="30"/>
           <w:szCs w:val="30"/>
         </w:rPr>
-        <w:t xml:space="preserve">5. Saídas</w:t>
+        <w:t xml:space="preserve">5. Script genérico para qualquer horizonte (rf_previsto.py)</w:t>
+      </w:r>
+    </w:p>
+    <w:p>
+      <w:pPr>
+        <w:spacing w:after="160" w:line="276"/>
+        <w:jc w:val="both"/>
+      </w:pPr>
+      <w:r>
+        <w:rPr>
+          <w:rFonts w:ascii="Calibri" w:cs="Calibri" w:eastAsia="Calibri" w:hAnsi="Calibri"/>
+          <w:b w:val="false"/>
+          <w:bCs w:val="false"/>
+          <w:i w:val="false"/>
+          <w:iCs w:val="false"/>
+          <w:color w:val="000000"/>
+          <w:sz w:val="22"/>
+          <w:szCs w:val="22"/>
+        </w:rPr>
+        <w:t xml:space="preserve">O rf_previsto.py generaliza os dois produtos: os horizontes de previsão são informados na linha de comando, contados a partir das 00 UTC da data do modelo. Um horizonte pode ser escrito como Nh (horas), Nd (dias), Nm (meses de calendário), combinações como 4d18h ou 1m15d, ou como data/hora absoluta YYYYMMDDHH.</w:t>
       </w:r>
     </w:p>
     <w:p>
@@ -1825,7 +1959,3072 @@
           <w:sz w:val="25"/>
           <w:szCs w:val="25"/>
         </w:rPr>
-        <w:t xml:space="preserve">5.1 Produto diário (1 a 5 dias)</w:t>
+        <w:t xml:space="preserve">5.1 Exemplos</w:t>
+      </w:r>
+    </w:p>
+    <w:p>
+      <w:pPr>
+        <w:shd w:fill="F2F2F2" w:val="clear"/>
+        <w:spacing w:after="0"/>
+      </w:pPr>
+      <w:r>
+        <w:rPr>
+          <w:rFonts w:ascii="Consolas" w:cs="Consolas" w:eastAsia="Consolas" w:hAnsi="Consolas"/>
+          <w:sz w:val="19"/>
+          <w:szCs w:val="19"/>
+        </w:rPr>
+        <w:t xml:space="preserve"># Um único horizonte: 36 horas</w:t>
+      </w:r>
+    </w:p>
+    <w:p>
+      <w:pPr>
+        <w:shd w:fill="F2F2F2" w:val="clear"/>
+        <w:spacing w:after="0"/>
+      </w:pPr>
+      <w:r>
+        <w:rPr>
+          <w:rFonts w:ascii="Consolas" w:cs="Consolas" w:eastAsia="Consolas" w:hAnsi="Consolas"/>
+          <w:sz w:val="19"/>
+          <w:szCs w:val="19"/>
+        </w:rPr>
+        <w:t xml:space="preserve">python3 rf_previsto.py --horizontes 36h</w:t>
+      </w:r>
+    </w:p>
+    <w:p>
+      <w:pPr>
+        <w:shd w:fill="F2F2F2" w:val="clear"/>
+        <w:spacing w:after="0"/>
+      </w:pPr>
+      <w:r>
+        <w:rPr>
+          <w:rFonts w:ascii="Consolas" w:cs="Consolas" w:eastAsia="Consolas" w:hAnsi="Consolas"/>
+          <w:sz w:val="19"/>
+          <w:szCs w:val="19"/>
+        </w:rPr>
+        <w:t xml:space="preserve"> </w:t>
+      </w:r>
+    </w:p>
+    <w:p>
+      <w:pPr>
+        <w:shd w:fill="F2F2F2" w:val="clear"/>
+        <w:spacing w:after="0"/>
+      </w:pPr>
+      <w:r>
+        <w:rPr>
+          <w:rFonts w:ascii="Consolas" w:cs="Consolas" w:eastAsia="Consolas" w:hAnsi="Consolas"/>
+          <w:sz w:val="19"/>
+          <w:szCs w:val="19"/>
+        </w:rPr>
+        <w:t xml:space="preserve"># Lista de horizontes: 1, 3, 7 e 14 dias às 18 UTC</w:t>
+      </w:r>
+    </w:p>
+    <w:p>
+      <w:pPr>
+        <w:shd w:fill="F2F2F2" w:val="clear"/>
+        <w:spacing w:after="0"/>
+      </w:pPr>
+      <w:r>
+        <w:rPr>
+          <w:rFonts w:ascii="Consolas" w:cs="Consolas" w:eastAsia="Consolas" w:hAnsi="Consolas"/>
+          <w:sz w:val="19"/>
+          <w:szCs w:val="19"/>
+        </w:rPr>
+        <w:t xml:space="preserve">python3 rf_previsto.py --horizontes 18h,2d18h,6d18h,13d18h</w:t>
+      </w:r>
+    </w:p>
+    <w:p>
+      <w:pPr>
+        <w:shd w:fill="F2F2F2" w:val="clear"/>
+        <w:spacing w:after="0"/>
+      </w:pPr>
+      <w:r>
+        <w:rPr>
+          <w:rFonts w:ascii="Consolas" w:cs="Consolas" w:eastAsia="Consolas" w:hAnsi="Consolas"/>
+          <w:sz w:val="19"/>
+          <w:szCs w:val="19"/>
+        </w:rPr>
+        <w:t xml:space="preserve"> </w:t>
+      </w:r>
+    </w:p>
+    <w:p>
+      <w:pPr>
+        <w:shd w:fill="F2F2F2" w:val="clear"/>
+        <w:spacing w:after="0"/>
+      </w:pPr>
+      <w:r>
+        <w:rPr>
+          <w:rFonts w:ascii="Consolas" w:cs="Consolas" w:eastAsia="Consolas" w:hAnsi="Consolas"/>
+          <w:sz w:val="19"/>
+          <w:szCs w:val="19"/>
+        </w:rPr>
+        <w:t xml:space="preserve"># Intervalo (equivalente ao produto diário de 1 a 5 dias)</w:t>
+      </w:r>
+    </w:p>
+    <w:p>
+      <w:pPr>
+        <w:shd w:fill="F2F2F2" w:val="clear"/>
+        <w:spacing w:after="0"/>
+      </w:pPr>
+      <w:r>
+        <w:rPr>
+          <w:rFonts w:ascii="Consolas" w:cs="Consolas" w:eastAsia="Consolas" w:hAnsi="Consolas"/>
+          <w:sz w:val="19"/>
+          <w:szCs w:val="19"/>
+        </w:rPr>
+        <w:t xml:space="preserve">python3 rf_previsto.py --de 6h --ate 4d18h --passo 6h</w:t>
+      </w:r>
+    </w:p>
+    <w:p>
+      <w:pPr>
+        <w:shd w:fill="F2F2F2" w:val="clear"/>
+        <w:spacing w:after="0"/>
+      </w:pPr>
+      <w:r>
+        <w:rPr>
+          <w:rFonts w:ascii="Consolas" w:cs="Consolas" w:eastAsia="Consolas" w:hAnsi="Consolas"/>
+          <w:sz w:val="19"/>
+          <w:szCs w:val="19"/>
+        </w:rPr>
+        <w:t xml:space="preserve"> </w:t>
+      </w:r>
+    </w:p>
+    <w:p>
+      <w:pPr>
+        <w:shd w:fill="F2F2F2" w:val="clear"/>
+        <w:spacing w:after="0"/>
+      </w:pPr>
+      <w:r>
+        <w:rPr>
+          <w:rFonts w:ascii="Consolas" w:cs="Consolas" w:eastAsia="Consolas" w:hAnsi="Consolas"/>
+          <w:sz w:val="19"/>
+          <w:szCs w:val="19"/>
+        </w:rPr>
+        <w:t xml:space="preserve"># Equivalente ao produto semanal (7 e 14 dias)</w:t>
+      </w:r>
+    </w:p>
+    <w:p>
+      <w:pPr>
+        <w:shd w:fill="F2F2F2" w:val="clear"/>
+        <w:spacing w:after="0"/>
+      </w:pPr>
+      <w:r>
+        <w:rPr>
+          <w:rFonts w:ascii="Consolas" w:cs="Consolas" w:eastAsia="Consolas" w:hAnsi="Consolas"/>
+          <w:sz w:val="19"/>
+          <w:szCs w:val="19"/>
+        </w:rPr>
+        <w:t xml:space="preserve">python3 rf_previsto.py --horizontes 7d18h,14d18h --rb-max 0.8 --fallback-gfs</w:t>
+      </w:r>
+    </w:p>
+    <w:p>
+      <w:pPr>
+        <w:shd w:fill="F2F2F2" w:val="clear"/>
+        <w:spacing w:after="0"/>
+      </w:pPr>
+      <w:r>
+        <w:rPr>
+          <w:rFonts w:ascii="Consolas" w:cs="Consolas" w:eastAsia="Consolas" w:hAnsi="Consolas"/>
+          <w:sz w:val="19"/>
+          <w:szCs w:val="19"/>
+        </w:rPr>
+        <w:t xml:space="preserve"> </w:t>
+      </w:r>
+    </w:p>
+    <w:p>
+      <w:pPr>
+        <w:shd w:fill="F2F2F2" w:val="clear"/>
+        <w:spacing w:after="0"/>
+      </w:pPr>
+      <w:r>
+        <w:rPr>
+          <w:rFonts w:ascii="Consolas" w:cs="Consolas" w:eastAsia="Consolas" w:hAnsi="Consolas"/>
+          <w:sz w:val="19"/>
+          <w:szCs w:val="19"/>
+        </w:rPr>
+        <w:t xml:space="preserve"># Data/hora absoluta com reprocessamento</w:t>
+      </w:r>
+    </w:p>
+    <w:p>
+      <w:pPr>
+        <w:shd w:fill="F2F2F2" w:val="clear"/>
+        <w:spacing w:after="0"/>
+      </w:pPr>
+      <w:r>
+        <w:rPr>
+          <w:rFonts w:ascii="Consolas" w:cs="Consolas" w:eastAsia="Consolas" w:hAnsi="Consolas"/>
+          <w:sz w:val="19"/>
+          <w:szCs w:val="19"/>
+        </w:rPr>
+        <w:t xml:space="preserve">python3 rf_previsto.py --data-final 20260801 --horizontes 2026080618</w:t>
+      </w:r>
+    </w:p>
+    <w:p>
+      <w:pPr>
+        <w:shd w:fill="F2F2F2" w:val="clear"/>
+        <w:spacing w:after="0"/>
+      </w:pPr>
+      <w:r>
+        <w:rPr>
+          <w:rFonts w:ascii="Consolas" w:cs="Consolas" w:eastAsia="Consolas" w:hAnsi="Consolas"/>
+          <w:sz w:val="19"/>
+          <w:szCs w:val="19"/>
+        </w:rPr>
+        <w:t xml:space="preserve"> </w:t>
+      </w:r>
+    </w:p>
+    <w:p>
+      <w:pPr>
+        <w:shd w:fill="F2F2F2" w:val="clear"/>
+        <w:spacing w:after="0"/>
+      </w:pPr>
+      <w:r>
+        <w:rPr>
+          <w:rFonts w:ascii="Consolas" w:cs="Consolas" w:eastAsia="Consolas" w:hAnsi="Consolas"/>
+          <w:sz w:val="19"/>
+          <w:szCs w:val="19"/>
+        </w:rPr>
+        <w:t xml:space="preserve"># Eta: previsões mensais de 1 a 13 meses</w:t>
+      </w:r>
+    </w:p>
+    <w:p>
+      <w:pPr>
+        <w:shd w:fill="F2F2F2" w:val="clear"/>
+        <w:spacing w:after="0"/>
+      </w:pPr>
+      <w:r>
+        <w:rPr>
+          <w:rFonts w:ascii="Consolas" w:cs="Consolas" w:eastAsia="Consolas" w:hAnsi="Consolas"/>
+          <w:sz w:val="19"/>
+          <w:szCs w:val="19"/>
+        </w:rPr>
+        <w:t xml:space="preserve">python3 rf_previsto.py --fonte eta --de 1m --ate 13m --passo 1m</w:t>
+      </w:r>
+    </w:p>
+    <w:p>
+      <w:pPr>
+        <w:shd w:fill="F2F2F2" w:val="clear"/>
+        <w:spacing w:after="0"/>
+      </w:pPr>
+      <w:r>
+        <w:rPr>
+          <w:rFonts w:ascii="Consolas" w:cs="Consolas" w:eastAsia="Consolas" w:hAnsi="Consolas"/>
+          <w:sz w:val="19"/>
+          <w:szCs w:val="19"/>
+        </w:rPr>
+        <w:t xml:space="preserve"> </w:t>
+      </w:r>
+    </w:p>
+    <w:p>
+      <w:pPr>
+        <w:shd w:fill="F2F2F2" w:val="clear"/>
+        <w:spacing w:after="0"/>
+      </w:pPr>
+      <w:r>
+        <w:rPr>
+          <w:rFonts w:ascii="Consolas" w:cs="Consolas" w:eastAsia="Consolas" w:hAnsi="Consolas"/>
+          <w:sz w:val="19"/>
+          <w:szCs w:val="19"/>
+        </w:rPr>
+        <w:t xml:space="preserve"># BESM (acúmulos de 12 h agregados automaticamente): 6 meses</w:t>
+      </w:r>
+    </w:p>
+    <w:p>
+      <w:pPr>
+        <w:shd w:fill="F2F2F2" w:val="clear"/>
+        <w:spacing w:after="160"/>
+      </w:pPr>
+      <w:r>
+        <w:rPr>
+          <w:rFonts w:ascii="Consolas" w:cs="Consolas" w:eastAsia="Consolas" w:hAnsi="Consolas"/>
+          <w:sz w:val="19"/>
+          <w:szCs w:val="19"/>
+        </w:rPr>
+        <w:t xml:space="preserve">python3 rf_previsto.py --fonte besm --horizontes 6m</w:t>
+      </w:r>
+    </w:p>
+    <w:p>
+      <w:pPr>
+        <w:pStyle w:val="Heading2"/>
+        <w:spacing w:after="160" w:before="280"/>
+      </w:pPr>
+      <w:r>
+        <w:rPr>
+          <w:rFonts w:ascii="Calibri" w:cs="Calibri" w:eastAsia="Calibri" w:hAnsi="Calibri"/>
+          <w:b/>
+          <w:bCs/>
+          <w:color w:val="1F4E79"/>
+          <w:sz w:val="25"/>
+          <w:szCs w:val="25"/>
+        </w:rPr>
+        <w:t xml:space="preserve">5.2 Opções</w:t>
+      </w:r>
+    </w:p>
+    <w:tbl>
+      <w:tblPr>
+        <w:tblW w:type="dxa" w:w="9026"/>
+        <w:tblBorders>
+          <w:top w:val="single" w:color="auto" w:sz="4"/>
+          <w:left w:val="single" w:color="auto" w:sz="4"/>
+          <w:bottom w:val="single" w:color="auto" w:sz="4"/>
+          <w:right w:val="single" w:color="auto" w:sz="4"/>
+          <w:insideH w:val="single" w:color="auto" w:sz="4"/>
+          <w:insideV w:val="single" w:color="auto" w:sz="4"/>
+        </w:tblBorders>
+      </w:tblPr>
+      <w:tblGrid>
+        <w:gridCol w:w="2166"/>
+        <w:gridCol w:w="4694"/>
+        <w:gridCol w:w="2166"/>
+      </w:tblGrid>
+      <w:tr>
+        <w:trPr>
+          <w:tblHeader/>
+        </w:trPr>
+        <w:tc>
+          <w:tcPr>
+            <w:tcW w:type="dxa" w:w="2166"/>
+            <w:tcBorders>
+              <w:top w:val="single" w:color="BFBFBF" w:sz="4"/>
+              <w:left w:val="single" w:color="BFBFBF" w:sz="4"/>
+              <w:bottom w:val="single" w:color="BFBFBF" w:sz="4"/>
+              <w:right w:val="single" w:color="BFBFBF" w:sz="4"/>
+            </w:tcBorders>
+            <w:shd w:fill="1F4E79" w:val="clear"/>
+            <w:tcMar>
+              <w:top w:type="dxa" w:w="60"/>
+              <w:left w:type="dxa" w:w="100"/>
+              <w:bottom w:type="dxa" w:w="60"/>
+              <w:right w:type="dxa" w:w="100"/>
+            </w:tcMar>
+          </w:tcPr>
+          <w:p>
+            <w:pPr>
+              <w:spacing w:after="0"/>
+            </w:pPr>
+            <w:r>
+              <w:rPr>
+                <w:rFonts w:ascii="Calibri" w:cs="Calibri" w:eastAsia="Calibri" w:hAnsi="Calibri"/>
+                <w:b/>
+                <w:bCs/>
+                <w:color w:val="FFFFFF"/>
+                <w:sz w:val="19"/>
+                <w:szCs w:val="19"/>
+              </w:rPr>
+              <w:t xml:space="preserve">Opção</w:t>
+            </w:r>
+          </w:p>
+        </w:tc>
+        <w:tc>
+          <w:tcPr>
+            <w:tcW w:type="dxa" w:w="4694"/>
+            <w:tcBorders>
+              <w:top w:val="single" w:color="BFBFBF" w:sz="4"/>
+              <w:left w:val="single" w:color="BFBFBF" w:sz="4"/>
+              <w:bottom w:val="single" w:color="BFBFBF" w:sz="4"/>
+              <w:right w:val="single" w:color="BFBFBF" w:sz="4"/>
+            </w:tcBorders>
+            <w:shd w:fill="1F4E79" w:val="clear"/>
+            <w:tcMar>
+              <w:top w:type="dxa" w:w="60"/>
+              <w:left w:type="dxa" w:w="100"/>
+              <w:bottom w:type="dxa" w:w="60"/>
+              <w:right w:type="dxa" w:w="100"/>
+            </w:tcMar>
+          </w:tcPr>
+          <w:p>
+            <w:pPr>
+              <w:spacing w:after="0"/>
+            </w:pPr>
+            <w:r>
+              <w:rPr>
+                <w:rFonts w:ascii="Calibri" w:cs="Calibri" w:eastAsia="Calibri" w:hAnsi="Calibri"/>
+                <w:b/>
+                <w:bCs/>
+                <w:color w:val="FFFFFF"/>
+                <w:sz w:val="19"/>
+                <w:szCs w:val="19"/>
+              </w:rPr>
+              <w:t xml:space="preserve">Efeito</w:t>
+            </w:r>
+          </w:p>
+        </w:tc>
+        <w:tc>
+          <w:tcPr>
+            <w:tcW w:type="dxa" w:w="2166"/>
+            <w:tcBorders>
+              <w:top w:val="single" w:color="BFBFBF" w:sz="4"/>
+              <w:left w:val="single" w:color="BFBFBF" w:sz="4"/>
+              <w:bottom w:val="single" w:color="BFBFBF" w:sz="4"/>
+              <w:right w:val="single" w:color="BFBFBF" w:sz="4"/>
+            </w:tcBorders>
+            <w:shd w:fill="1F4E79" w:val="clear"/>
+            <w:tcMar>
+              <w:top w:type="dxa" w:w="60"/>
+              <w:left w:type="dxa" w:w="100"/>
+              <w:bottom w:type="dxa" w:w="60"/>
+              <w:right w:type="dxa" w:w="100"/>
+            </w:tcMar>
+          </w:tcPr>
+          <w:p>
+            <w:pPr>
+              <w:spacing w:after="0"/>
+            </w:pPr>
+            <w:r>
+              <w:rPr>
+                <w:rFonts w:ascii="Calibri" w:cs="Calibri" w:eastAsia="Calibri" w:hAnsi="Calibri"/>
+                <w:b/>
+                <w:bCs/>
+                <w:color w:val="FFFFFF"/>
+                <w:sz w:val="19"/>
+                <w:szCs w:val="19"/>
+              </w:rPr>
+              <w:t xml:space="preserve">Padrão</w:t>
+            </w:r>
+          </w:p>
+        </w:tc>
+      </w:tr>
+      <w:tr>
+        <w:tc>
+          <w:tcPr>
+            <w:tcW w:type="dxa" w:w="2166"/>
+            <w:tcBorders>
+              <w:top w:val="single" w:color="BFBFBF" w:sz="4"/>
+              <w:left w:val="single" w:color="BFBFBF" w:sz="4"/>
+              <w:bottom w:val="single" w:color="BFBFBF" w:sz="4"/>
+              <w:right w:val="single" w:color="BFBFBF" w:sz="4"/>
+            </w:tcBorders>
+            <w:tcMar>
+              <w:top w:type="dxa" w:w="60"/>
+              <w:left w:type="dxa" w:w="100"/>
+              <w:bottom w:type="dxa" w:w="60"/>
+              <w:right w:type="dxa" w:w="100"/>
+            </w:tcMar>
+          </w:tcPr>
+          <w:p>
+            <w:pPr>
+              <w:spacing w:after="0"/>
+            </w:pPr>
+            <w:r>
+              <w:rPr>
+                <w:rFonts w:ascii="Calibri" w:cs="Calibri" w:eastAsia="Calibri" w:hAnsi="Calibri"/>
+                <w:b w:val="false"/>
+                <w:bCs w:val="false"/>
+                <w:color w:val="000000"/>
+                <w:sz w:val="19"/>
+                <w:szCs w:val="19"/>
+              </w:rPr>
+              <w:t xml:space="preserve">--horizontes LISTA</w:t>
+            </w:r>
+          </w:p>
+        </w:tc>
+        <w:tc>
+          <w:tcPr>
+            <w:tcW w:type="dxa" w:w="4694"/>
+            <w:tcBorders>
+              <w:top w:val="single" w:color="BFBFBF" w:sz="4"/>
+              <w:left w:val="single" w:color="BFBFBF" w:sz="4"/>
+              <w:bottom w:val="single" w:color="BFBFBF" w:sz="4"/>
+              <w:right w:val="single" w:color="BFBFBF" w:sz="4"/>
+            </w:tcBorders>
+            <w:tcMar>
+              <w:top w:type="dxa" w:w="60"/>
+              <w:left w:type="dxa" w:w="100"/>
+              <w:bottom w:type="dxa" w:w="60"/>
+              <w:right w:type="dxa" w:w="100"/>
+            </w:tcMar>
+          </w:tcPr>
+          <w:p>
+            <w:pPr>
+              <w:spacing w:after="0"/>
+            </w:pPr>
+            <w:r>
+              <w:rPr>
+                <w:rFonts w:ascii="Calibri" w:cs="Calibri" w:eastAsia="Calibri" w:hAnsi="Calibri"/>
+                <w:b w:val="false"/>
+                <w:bCs w:val="false"/>
+                <w:color w:val="000000"/>
+                <w:sz w:val="19"/>
+                <w:szCs w:val="19"/>
+              </w:rPr>
+              <w:t xml:space="preserve">Horizontes separados por vírgula (Nh, Nd, Nm, combinações ou YYYYMMDDHH)</w:t>
+            </w:r>
+          </w:p>
+        </w:tc>
+        <w:tc>
+          <w:tcPr>
+            <w:tcW w:type="dxa" w:w="2166"/>
+            <w:tcBorders>
+              <w:top w:val="single" w:color="BFBFBF" w:sz="4"/>
+              <w:left w:val="single" w:color="BFBFBF" w:sz="4"/>
+              <w:bottom w:val="single" w:color="BFBFBF" w:sz="4"/>
+              <w:right w:val="single" w:color="BFBFBF" w:sz="4"/>
+            </w:tcBorders>
+            <w:tcMar>
+              <w:top w:type="dxa" w:w="60"/>
+              <w:left w:type="dxa" w:w="100"/>
+              <w:bottom w:type="dxa" w:w="60"/>
+              <w:right w:type="dxa" w:w="100"/>
+            </w:tcMar>
+          </w:tcPr>
+          <w:p>
+            <w:pPr>
+              <w:spacing w:after="0"/>
+            </w:pPr>
+            <w:r>
+              <w:rPr>
+                <w:rFonts w:ascii="Calibri" w:cs="Calibri" w:eastAsia="Calibri" w:hAnsi="Calibri"/>
+                <w:b w:val="false"/>
+                <w:bCs w:val="false"/>
+                <w:color w:val="000000"/>
+                <w:sz w:val="19"/>
+                <w:szCs w:val="19"/>
+              </w:rPr>
+              <w:t xml:space="preserve">—</w:t>
+            </w:r>
+          </w:p>
+        </w:tc>
+      </w:tr>
+      <w:tr>
+        <w:tc>
+          <w:tcPr>
+            <w:tcW w:type="dxa" w:w="2166"/>
+            <w:tcBorders>
+              <w:top w:val="single" w:color="BFBFBF" w:sz="4"/>
+              <w:left w:val="single" w:color="BFBFBF" w:sz="4"/>
+              <w:bottom w:val="single" w:color="BFBFBF" w:sz="4"/>
+              <w:right w:val="single" w:color="BFBFBF" w:sz="4"/>
+            </w:tcBorders>
+            <w:tcMar>
+              <w:top w:type="dxa" w:w="60"/>
+              <w:left w:type="dxa" w:w="100"/>
+              <w:bottom w:type="dxa" w:w="60"/>
+              <w:right w:type="dxa" w:w="100"/>
+            </w:tcMar>
+          </w:tcPr>
+          <w:p>
+            <w:pPr>
+              <w:spacing w:after="0"/>
+            </w:pPr>
+            <w:r>
+              <w:rPr>
+                <w:rFonts w:ascii="Calibri" w:cs="Calibri" w:eastAsia="Calibri" w:hAnsi="Calibri"/>
+                <w:b w:val="false"/>
+                <w:bCs w:val="false"/>
+                <w:color w:val="000000"/>
+                <w:sz w:val="19"/>
+                <w:szCs w:val="19"/>
+              </w:rPr>
+              <w:t xml:space="preserve">--fonte NOME</w:t>
+            </w:r>
+          </w:p>
+        </w:tc>
+        <w:tc>
+          <w:tcPr>
+            <w:tcW w:type="dxa" w:w="4694"/>
+            <w:tcBorders>
+              <w:top w:val="single" w:color="BFBFBF" w:sz="4"/>
+              <w:left w:val="single" w:color="BFBFBF" w:sz="4"/>
+              <w:bottom w:val="single" w:color="BFBFBF" w:sz="4"/>
+              <w:right w:val="single" w:color="BFBFBF" w:sz="4"/>
+            </w:tcBorders>
+            <w:tcMar>
+              <w:top w:type="dxa" w:w="60"/>
+              <w:left w:type="dxa" w:w="100"/>
+              <w:bottom w:type="dxa" w:w="60"/>
+              <w:right w:type="dxa" w:w="100"/>
+            </w:tcMar>
+          </w:tcPr>
+          <w:p>
+            <w:pPr>
+              <w:spacing w:after="0"/>
+            </w:pPr>
+            <w:r>
+              <w:rPr>
+                <w:rFonts w:ascii="Calibri" w:cs="Calibri" w:eastAsia="Calibri" w:hAnsi="Calibri"/>
+                <w:b w:val="false"/>
+                <w:bCs w:val="false"/>
+                <w:color w:val="000000"/>
+                <w:sz w:val="19"/>
+                <w:szCs w:val="19"/>
+              </w:rPr>
+              <w:t xml:space="preserve">Fonte de previsão: gfs, eta, besm ou outra definida via JSON (seção 5.4)</w:t>
+            </w:r>
+          </w:p>
+        </w:tc>
+        <w:tc>
+          <w:tcPr>
+            <w:tcW w:type="dxa" w:w="2166"/>
+            <w:tcBorders>
+              <w:top w:val="single" w:color="BFBFBF" w:sz="4"/>
+              <w:left w:val="single" w:color="BFBFBF" w:sz="4"/>
+              <w:bottom w:val="single" w:color="BFBFBF" w:sz="4"/>
+              <w:right w:val="single" w:color="BFBFBF" w:sz="4"/>
+            </w:tcBorders>
+            <w:tcMar>
+              <w:top w:type="dxa" w:w="60"/>
+              <w:left w:type="dxa" w:w="100"/>
+              <w:bottom w:type="dxa" w:w="60"/>
+              <w:right w:type="dxa" w:w="100"/>
+            </w:tcMar>
+          </w:tcPr>
+          <w:p>
+            <w:pPr>
+              <w:spacing w:after="0"/>
+            </w:pPr>
+            <w:r>
+              <w:rPr>
+                <w:rFonts w:ascii="Calibri" w:cs="Calibri" w:eastAsia="Calibri" w:hAnsi="Calibri"/>
+                <w:b w:val="false"/>
+                <w:bCs w:val="false"/>
+                <w:color w:val="000000"/>
+                <w:sz w:val="19"/>
+                <w:szCs w:val="19"/>
+              </w:rPr>
+              <w:t xml:space="preserve">composição legada (GFS)</w:t>
+            </w:r>
+          </w:p>
+        </w:tc>
+      </w:tr>
+      <w:tr>
+        <w:tc>
+          <w:tcPr>
+            <w:tcW w:type="dxa" w:w="2166"/>
+            <w:tcBorders>
+              <w:top w:val="single" w:color="BFBFBF" w:sz="4"/>
+              <w:left w:val="single" w:color="BFBFBF" w:sz="4"/>
+              <w:bottom w:val="single" w:color="BFBFBF" w:sz="4"/>
+              <w:right w:val="single" w:color="BFBFBF" w:sz="4"/>
+            </w:tcBorders>
+            <w:tcMar>
+              <w:top w:type="dxa" w:w="60"/>
+              <w:left w:type="dxa" w:w="100"/>
+              <w:bottom w:type="dxa" w:w="60"/>
+              <w:right w:type="dxa" w:w="100"/>
+            </w:tcMar>
+          </w:tcPr>
+          <w:p>
+            <w:pPr>
+              <w:spacing w:after="0"/>
+            </w:pPr>
+            <w:r>
+              <w:rPr>
+                <w:rFonts w:ascii="Calibri" w:cs="Calibri" w:eastAsia="Calibri" w:hAnsi="Calibri"/>
+                <w:b w:val="false"/>
+                <w:bCs w:val="false"/>
+                <w:color w:val="000000"/>
+                <w:sz w:val="19"/>
+                <w:szCs w:val="19"/>
+              </w:rPr>
+              <w:t xml:space="preserve">--config-fontes ARQ</w:t>
+            </w:r>
+          </w:p>
+        </w:tc>
+        <w:tc>
+          <w:tcPr>
+            <w:tcW w:type="dxa" w:w="4694"/>
+            <w:tcBorders>
+              <w:top w:val="single" w:color="BFBFBF" w:sz="4"/>
+              <w:left w:val="single" w:color="BFBFBF" w:sz="4"/>
+              <w:bottom w:val="single" w:color="BFBFBF" w:sz="4"/>
+              <w:right w:val="single" w:color="BFBFBF" w:sz="4"/>
+            </w:tcBorders>
+            <w:tcMar>
+              <w:top w:type="dxa" w:w="60"/>
+              <w:left w:type="dxa" w:w="100"/>
+              <w:bottom w:type="dxa" w:w="60"/>
+              <w:right w:type="dxa" w:w="100"/>
+            </w:tcMar>
+          </w:tcPr>
+          <w:p>
+            <w:pPr>
+              <w:spacing w:after="0"/>
+            </w:pPr>
+            <w:r>
+              <w:rPr>
+                <w:rFonts w:ascii="Calibri" w:cs="Calibri" w:eastAsia="Calibri" w:hAnsi="Calibri"/>
+                <w:b w:val="false"/>
+                <w:bCs w:val="false"/>
+                <w:color w:val="000000"/>
+                <w:sz w:val="19"/>
+                <w:szCs w:val="19"/>
+              </w:rPr>
+              <w:t xml:space="preserve">Arquivo JSON que ajusta/acrescenta fontes (nomes de arquivos, variáveis, frequência)</w:t>
+            </w:r>
+          </w:p>
+        </w:tc>
+        <w:tc>
+          <w:tcPr>
+            <w:tcW w:type="dxa" w:w="2166"/>
+            <w:tcBorders>
+              <w:top w:val="single" w:color="BFBFBF" w:sz="4"/>
+              <w:left w:val="single" w:color="BFBFBF" w:sz="4"/>
+              <w:bottom w:val="single" w:color="BFBFBF" w:sz="4"/>
+              <w:right w:val="single" w:color="BFBFBF" w:sz="4"/>
+            </w:tcBorders>
+            <w:tcMar>
+              <w:top w:type="dxa" w:w="60"/>
+              <w:left w:type="dxa" w:w="100"/>
+              <w:bottom w:type="dxa" w:w="60"/>
+              <w:right w:type="dxa" w:w="100"/>
+            </w:tcMar>
+          </w:tcPr>
+          <w:p>
+            <w:pPr>
+              <w:spacing w:after="0"/>
+            </w:pPr>
+            <w:r>
+              <w:rPr>
+                <w:rFonts w:ascii="Calibri" w:cs="Calibri" w:eastAsia="Calibri" w:hAnsi="Calibri"/>
+                <w:b w:val="false"/>
+                <w:bCs w:val="false"/>
+                <w:color w:val="000000"/>
+                <w:sz w:val="19"/>
+                <w:szCs w:val="19"/>
+              </w:rPr>
+              <w:t xml:space="preserve">—</w:t>
+            </w:r>
+          </w:p>
+        </w:tc>
+      </w:tr>
+      <w:tr>
+        <w:tc>
+          <w:tcPr>
+            <w:tcW w:type="dxa" w:w="2166"/>
+            <w:tcBorders>
+              <w:top w:val="single" w:color="BFBFBF" w:sz="4"/>
+              <w:left w:val="single" w:color="BFBFBF" w:sz="4"/>
+              <w:bottom w:val="single" w:color="BFBFBF" w:sz="4"/>
+              <w:right w:val="single" w:color="BFBFBF" w:sz="4"/>
+            </w:tcBorders>
+            <w:tcMar>
+              <w:top w:type="dxa" w:w="60"/>
+              <w:left w:type="dxa" w:w="100"/>
+              <w:bottom w:type="dxa" w:w="60"/>
+              <w:right w:type="dxa" w:w="100"/>
+            </w:tcMar>
+          </w:tcPr>
+          <w:p>
+            <w:pPr>
+              <w:spacing w:after="0"/>
+            </w:pPr>
+            <w:r>
+              <w:rPr>
+                <w:rFonts w:ascii="Calibri" w:cs="Calibri" w:eastAsia="Calibri" w:hAnsi="Calibri"/>
+                <w:b w:val="false"/>
+                <w:bCs w:val="false"/>
+                <w:color w:val="000000"/>
+                <w:sz w:val="19"/>
+                <w:szCs w:val="19"/>
+              </w:rPr>
+              <w:t xml:space="preserve">--de / --ate / --passo</w:t>
+            </w:r>
+          </w:p>
+        </w:tc>
+        <w:tc>
+          <w:tcPr>
+            <w:tcW w:type="dxa" w:w="4694"/>
+            <w:tcBorders>
+              <w:top w:val="single" w:color="BFBFBF" w:sz="4"/>
+              <w:left w:val="single" w:color="BFBFBF" w:sz="4"/>
+              <w:bottom w:val="single" w:color="BFBFBF" w:sz="4"/>
+              <w:right w:val="single" w:color="BFBFBF" w:sz="4"/>
+            </w:tcBorders>
+            <w:tcMar>
+              <w:top w:type="dxa" w:w="60"/>
+              <w:left w:type="dxa" w:w="100"/>
+              <w:bottom w:type="dxa" w:w="60"/>
+              <w:right w:type="dxa" w:w="100"/>
+            </w:tcMar>
+          </w:tcPr>
+          <w:p>
+            <w:pPr>
+              <w:spacing w:after="0"/>
+            </w:pPr>
+            <w:r>
+              <w:rPr>
+                <w:rFonts w:ascii="Calibri" w:cs="Calibri" w:eastAsia="Calibri" w:hAnsi="Calibri"/>
+                <w:b w:val="false"/>
+                <w:bCs w:val="false"/>
+                <w:color w:val="000000"/>
+                <w:sz w:val="19"/>
+                <w:szCs w:val="19"/>
+              </w:rPr>
+              <w:t xml:space="preserve">Intervalo de horizontes relativo (pode ser combinado com --horizontes)</w:t>
+            </w:r>
+          </w:p>
+        </w:tc>
+        <w:tc>
+          <w:tcPr>
+            <w:tcW w:type="dxa" w:w="2166"/>
+            <w:tcBorders>
+              <w:top w:val="single" w:color="BFBFBF" w:sz="4"/>
+              <w:left w:val="single" w:color="BFBFBF" w:sz="4"/>
+              <w:bottom w:val="single" w:color="BFBFBF" w:sz="4"/>
+              <w:right w:val="single" w:color="BFBFBF" w:sz="4"/>
+            </w:tcBorders>
+            <w:tcMar>
+              <w:top w:type="dxa" w:w="60"/>
+              <w:left w:type="dxa" w:w="100"/>
+              <w:bottom w:type="dxa" w:w="60"/>
+              <w:right w:type="dxa" w:w="100"/>
+            </w:tcMar>
+          </w:tcPr>
+          <w:p>
+            <w:pPr>
+              <w:spacing w:after="0"/>
+            </w:pPr>
+            <w:r>
+              <w:rPr>
+                <w:rFonts w:ascii="Calibri" w:cs="Calibri" w:eastAsia="Calibri" w:hAnsi="Calibri"/>
+                <w:b w:val="false"/>
+                <w:bCs w:val="false"/>
+                <w:color w:val="000000"/>
+                <w:sz w:val="19"/>
+                <w:szCs w:val="19"/>
+              </w:rPr>
+              <w:t xml:space="preserve">passo 6h</w:t>
+            </w:r>
+          </w:p>
+        </w:tc>
+      </w:tr>
+      <w:tr>
+        <w:tc>
+          <w:tcPr>
+            <w:tcW w:type="dxa" w:w="2166"/>
+            <w:tcBorders>
+              <w:top w:val="single" w:color="BFBFBF" w:sz="4"/>
+              <w:left w:val="single" w:color="BFBFBF" w:sz="4"/>
+              <w:bottom w:val="single" w:color="BFBFBF" w:sz="4"/>
+              <w:right w:val="single" w:color="BFBFBF" w:sz="4"/>
+            </w:tcBorders>
+            <w:tcMar>
+              <w:top w:type="dxa" w:w="60"/>
+              <w:left w:type="dxa" w:w="100"/>
+              <w:bottom w:type="dxa" w:w="60"/>
+              <w:right w:type="dxa" w:w="100"/>
+            </w:tcMar>
+          </w:tcPr>
+          <w:p>
+            <w:pPr>
+              <w:spacing w:after="0"/>
+            </w:pPr>
+            <w:r>
+              <w:rPr>
+                <w:rFonts w:ascii="Calibri" w:cs="Calibri" w:eastAsia="Calibri" w:hAnsi="Calibri"/>
+                <w:b w:val="false"/>
+                <w:bCs w:val="false"/>
+                <w:color w:val="000000"/>
+                <w:sz w:val="19"/>
+                <w:szCs w:val="19"/>
+              </w:rPr>
+              <w:t xml:space="preserve">--rb-max X</w:t>
+            </w:r>
+          </w:p>
+        </w:tc>
+        <w:tc>
+          <w:tcPr>
+            <w:tcW w:type="dxa" w:w="4694"/>
+            <w:tcBorders>
+              <w:top w:val="single" w:color="BFBFBF" w:sz="4"/>
+              <w:left w:val="single" w:color="BFBFBF" w:sz="4"/>
+              <w:bottom w:val="single" w:color="BFBFBF" w:sz="4"/>
+              <w:right w:val="single" w:color="BFBFBF" w:sz="4"/>
+            </w:tcBorders>
+            <w:tcMar>
+              <w:top w:type="dxa" w:w="60"/>
+              <w:left w:type="dxa" w:w="100"/>
+              <w:bottom w:type="dxa" w:w="60"/>
+              <w:right w:type="dxa" w:w="100"/>
+            </w:tcMar>
+          </w:tcPr>
+          <w:p>
+            <w:pPr>
+              <w:spacing w:after="0"/>
+            </w:pPr>
+            <w:r>
+              <w:rPr>
+                <w:rFonts w:ascii="Calibri" w:cs="Calibri" w:eastAsia="Calibri" w:hAnsi="Calibri"/>
+                <w:b w:val="false"/>
+                <w:bCs w:val="false"/>
+                <w:color w:val="000000"/>
+                <w:sz w:val="19"/>
+                <w:szCs w:val="19"/>
+              </w:rPr>
+              <w:t xml:space="preserve">Risco básico máximo (o produto semanal usa 0.8)</w:t>
+            </w:r>
+          </w:p>
+        </w:tc>
+        <w:tc>
+          <w:tcPr>
+            <w:tcW w:type="dxa" w:w="2166"/>
+            <w:tcBorders>
+              <w:top w:val="single" w:color="BFBFBF" w:sz="4"/>
+              <w:left w:val="single" w:color="BFBFBF" w:sz="4"/>
+              <w:bottom w:val="single" w:color="BFBFBF" w:sz="4"/>
+              <w:right w:val="single" w:color="BFBFBF" w:sz="4"/>
+            </w:tcBorders>
+            <w:tcMar>
+              <w:top w:type="dxa" w:w="60"/>
+              <w:left w:type="dxa" w:w="100"/>
+              <w:bottom w:type="dxa" w:w="60"/>
+              <w:right w:type="dxa" w:w="100"/>
+            </w:tcMar>
+          </w:tcPr>
+          <w:p>
+            <w:pPr>
+              <w:spacing w:after="0"/>
+            </w:pPr>
+            <w:r>
+              <w:rPr>
+                <w:rFonts w:ascii="Calibri" w:cs="Calibri" w:eastAsia="Calibri" w:hAnsi="Calibri"/>
+                <w:b w:val="false"/>
+                <w:bCs w:val="false"/>
+                <w:color w:val="000000"/>
+                <w:sz w:val="19"/>
+                <w:szCs w:val="19"/>
+              </w:rPr>
+              <w:t xml:space="preserve">0.9</w:t>
+            </w:r>
+          </w:p>
+        </w:tc>
+      </w:tr>
+      <w:tr>
+        <w:tc>
+          <w:tcPr>
+            <w:tcW w:type="dxa" w:w="2166"/>
+            <w:tcBorders>
+              <w:top w:val="single" w:color="BFBFBF" w:sz="4"/>
+              <w:left w:val="single" w:color="BFBFBF" w:sz="4"/>
+              <w:bottom w:val="single" w:color="BFBFBF" w:sz="4"/>
+              <w:right w:val="single" w:color="BFBFBF" w:sz="4"/>
+            </w:tcBorders>
+            <w:tcMar>
+              <w:top w:type="dxa" w:w="60"/>
+              <w:left w:type="dxa" w:w="100"/>
+              <w:bottom w:type="dxa" w:w="60"/>
+              <w:right w:type="dxa" w:w="100"/>
+            </w:tcMar>
+          </w:tcPr>
+          <w:p>
+            <w:pPr>
+              <w:spacing w:after="0"/>
+            </w:pPr>
+            <w:r>
+              <w:rPr>
+                <w:rFonts w:ascii="Calibri" w:cs="Calibri" w:eastAsia="Calibri" w:hAnsi="Calibri"/>
+                <w:b w:val="false"/>
+                <w:bCs w:val="false"/>
+                <w:color w:val="000000"/>
+                <w:sz w:val="19"/>
+                <w:szCs w:val="19"/>
+              </w:rPr>
+              <w:t xml:space="preserve">--produto NOME</w:t>
+            </w:r>
+          </w:p>
+        </w:tc>
+        <w:tc>
+          <w:tcPr>
+            <w:tcW w:type="dxa" w:w="4694"/>
+            <w:tcBorders>
+              <w:top w:val="single" w:color="BFBFBF" w:sz="4"/>
+              <w:left w:val="single" w:color="BFBFBF" w:sz="4"/>
+              <w:bottom w:val="single" w:color="BFBFBF" w:sz="4"/>
+              <w:right w:val="single" w:color="BFBFBF" w:sz="4"/>
+            </w:tcBorders>
+            <w:tcMar>
+              <w:top w:type="dxa" w:w="60"/>
+              <w:left w:type="dxa" w:w="100"/>
+              <w:bottom w:type="dxa" w:w="60"/>
+              <w:right w:type="dxa" w:w="100"/>
+            </w:tcMar>
+          </w:tcPr>
+          <w:p>
+            <w:pPr>
+              <w:spacing w:after="0"/>
+            </w:pPr>
+            <w:r>
+              <w:rPr>
+                <w:rFonts w:ascii="Calibri" w:cs="Calibri" w:eastAsia="Calibri" w:hAnsi="Calibri"/>
+                <w:b w:val="false"/>
+                <w:bCs w:val="false"/>
+                <w:color w:val="000000"/>
+                <w:sz w:val="19"/>
+                <w:szCs w:val="19"/>
+              </w:rPr>
+              <w:t xml:space="preserve">Subdiretório de saída em data/output/2.2/</w:t>
+            </w:r>
+          </w:p>
+        </w:tc>
+        <w:tc>
+          <w:tcPr>
+            <w:tcW w:type="dxa" w:w="2166"/>
+            <w:tcBorders>
+              <w:top w:val="single" w:color="BFBFBF" w:sz="4"/>
+              <w:left w:val="single" w:color="BFBFBF" w:sz="4"/>
+              <w:bottom w:val="single" w:color="BFBFBF" w:sz="4"/>
+              <w:right w:val="single" w:color="BFBFBF" w:sz="4"/>
+            </w:tcBorders>
+            <w:tcMar>
+              <w:top w:type="dxa" w:w="60"/>
+              <w:left w:type="dxa" w:w="100"/>
+              <w:bottom w:type="dxa" w:w="60"/>
+              <w:right w:type="dxa" w:w="100"/>
+            </w:tcMar>
+          </w:tcPr>
+          <w:p>
+            <w:pPr>
+              <w:spacing w:after="0"/>
+            </w:pPr>
+            <w:r>
+              <w:rPr>
+                <w:rFonts w:ascii="Calibri" w:cs="Calibri" w:eastAsia="Calibri" w:hAnsi="Calibri"/>
+                <w:b w:val="false"/>
+                <w:bCs w:val="false"/>
+                <w:color w:val="000000"/>
+                <w:sz w:val="19"/>
+                <w:szCs w:val="19"/>
+              </w:rPr>
+              <w:t xml:space="preserve">RF_PREV_CUSTOM</w:t>
+            </w:r>
+          </w:p>
+        </w:tc>
+      </w:tr>
+      <w:tr>
+        <w:tc>
+          <w:tcPr>
+            <w:tcW w:type="dxa" w:w="2166"/>
+            <w:tcBorders>
+              <w:top w:val="single" w:color="BFBFBF" w:sz="4"/>
+              <w:left w:val="single" w:color="BFBFBF" w:sz="4"/>
+              <w:bottom w:val="single" w:color="BFBFBF" w:sz="4"/>
+              <w:right w:val="single" w:color="BFBFBF" w:sz="4"/>
+            </w:tcBorders>
+            <w:tcMar>
+              <w:top w:type="dxa" w:w="60"/>
+              <w:left w:type="dxa" w:w="100"/>
+              <w:bottom w:type="dxa" w:w="60"/>
+              <w:right w:type="dxa" w:w="100"/>
+            </w:tcMar>
+          </w:tcPr>
+          <w:p>
+            <w:pPr>
+              <w:spacing w:after="0"/>
+            </w:pPr>
+            <w:r>
+              <w:rPr>
+                <w:rFonts w:ascii="Calibri" w:cs="Calibri" w:eastAsia="Calibri" w:hAnsi="Calibri"/>
+                <w:b w:val="false"/>
+                <w:bCs w:val="false"/>
+                <w:color w:val="000000"/>
+                <w:sz w:val="19"/>
+                <w:szCs w:val="19"/>
+              </w:rPr>
+              <w:t xml:space="preserve">--base DIR</w:t>
+            </w:r>
+          </w:p>
+        </w:tc>
+        <w:tc>
+          <w:tcPr>
+            <w:tcW w:type="dxa" w:w="4694"/>
+            <w:tcBorders>
+              <w:top w:val="single" w:color="BFBFBF" w:sz="4"/>
+              <w:left w:val="single" w:color="BFBFBF" w:sz="4"/>
+              <w:bottom w:val="single" w:color="BFBFBF" w:sz="4"/>
+              <w:right w:val="single" w:color="BFBFBF" w:sz="4"/>
+            </w:tcBorders>
+            <w:tcMar>
+              <w:top w:type="dxa" w:w="60"/>
+              <w:left w:type="dxa" w:w="100"/>
+              <w:bottom w:type="dxa" w:w="60"/>
+              <w:right w:type="dxa" w:w="100"/>
+            </w:tcMar>
+          </w:tcPr>
+          <w:p>
+            <w:pPr>
+              <w:spacing w:after="0"/>
+            </w:pPr>
+            <w:r>
+              <w:rPr>
+                <w:rFonts w:ascii="Calibri" w:cs="Calibri" w:eastAsia="Calibri" w:hAnsi="Calibri"/>
+                <w:b w:val="false"/>
+                <w:bCs w:val="false"/>
+                <w:color w:val="000000"/>
+                <w:sz w:val="19"/>
+                <w:szCs w:val="19"/>
+              </w:rPr>
+              <w:t xml:space="preserve">Diretório base do modelo (permite rodar fora da produção)</w:t>
+            </w:r>
+          </w:p>
+        </w:tc>
+        <w:tc>
+          <w:tcPr>
+            <w:tcW w:type="dxa" w:w="2166"/>
+            <w:tcBorders>
+              <w:top w:val="single" w:color="BFBFBF" w:sz="4"/>
+              <w:left w:val="single" w:color="BFBFBF" w:sz="4"/>
+              <w:bottom w:val="single" w:color="BFBFBF" w:sz="4"/>
+              <w:right w:val="single" w:color="BFBFBF" w:sz="4"/>
+            </w:tcBorders>
+            <w:tcMar>
+              <w:top w:type="dxa" w:w="60"/>
+              <w:left w:type="dxa" w:w="100"/>
+              <w:bottom w:type="dxa" w:w="60"/>
+              <w:right w:type="dxa" w:w="100"/>
+            </w:tcMar>
+          </w:tcPr>
+          <w:p>
+            <w:pPr>
+              <w:spacing w:after="0"/>
+            </w:pPr>
+            <w:r>
+              <w:rPr>
+                <w:rFonts w:ascii="Calibri" w:cs="Calibri" w:eastAsia="Calibri" w:hAnsi="Calibri"/>
+                <w:b w:val="false"/>
+                <w:bCs w:val="false"/>
+                <w:color w:val="000000"/>
+                <w:sz w:val="19"/>
+                <w:szCs w:val="19"/>
+              </w:rPr>
+              <w:t xml:space="preserve">/home/queimadas/INPE_FireRiskModel</w:t>
+            </w:r>
+          </w:p>
+        </w:tc>
+      </w:tr>
+      <w:tr>
+        <w:tc>
+          <w:tcPr>
+            <w:tcW w:type="dxa" w:w="2166"/>
+            <w:tcBorders>
+              <w:top w:val="single" w:color="BFBFBF" w:sz="4"/>
+              <w:left w:val="single" w:color="BFBFBF" w:sz="4"/>
+              <w:bottom w:val="single" w:color="BFBFBF" w:sz="4"/>
+              <w:right w:val="single" w:color="BFBFBF" w:sz="4"/>
+            </w:tcBorders>
+            <w:tcMar>
+              <w:top w:type="dxa" w:w="60"/>
+              <w:left w:type="dxa" w:w="100"/>
+              <w:bottom w:type="dxa" w:w="60"/>
+              <w:right w:type="dxa" w:w="100"/>
+            </w:tcMar>
+          </w:tcPr>
+          <w:p>
+            <w:pPr>
+              <w:spacing w:after="0"/>
+            </w:pPr>
+            <w:r>
+              <w:rPr>
+                <w:rFonts w:ascii="Calibri" w:cs="Calibri" w:eastAsia="Calibri" w:hAnsi="Calibri"/>
+                <w:b w:val="false"/>
+                <w:bCs w:val="false"/>
+                <w:color w:val="000000"/>
+                <w:sz w:val="19"/>
+                <w:szCs w:val="19"/>
+              </w:rPr>
+              <w:t xml:space="preserve">--fallback-gfs</w:t>
+            </w:r>
+          </w:p>
+        </w:tc>
+        <w:tc>
+          <w:tcPr>
+            <w:tcW w:type="dxa" w:w="4694"/>
+            <w:tcBorders>
+              <w:top w:val="single" w:color="BFBFBF" w:sz="4"/>
+              <w:left w:val="single" w:color="BFBFBF" w:sz="4"/>
+              <w:bottom w:val="single" w:color="BFBFBF" w:sz="4"/>
+              <w:right w:val="single" w:color="BFBFBF" w:sz="4"/>
+            </w:tcBorders>
+            <w:tcMar>
+              <w:top w:type="dxa" w:w="60"/>
+              <w:left w:type="dxa" w:w="100"/>
+              <w:bottom w:type="dxa" w:w="60"/>
+              <w:right w:type="dxa" w:w="100"/>
+            </w:tcMar>
+          </w:tcPr>
+          <w:p>
+            <w:pPr>
+              <w:spacing w:after="0"/>
+            </w:pPr>
+            <w:r>
+              <w:rPr>
+                <w:rFonts w:ascii="Calibri" w:cs="Calibri" w:eastAsia="Calibri" w:hAnsi="Calibri"/>
+                <w:b w:val="false"/>
+                <w:bCs w:val="false"/>
+                <w:color w:val="000000"/>
+                <w:sz w:val="19"/>
+                <w:szCs w:val="19"/>
+              </w:rPr>
+              <w:t xml:space="preserve">Se o GFS do horário exato não existir, usa o horário anterior do mesmo dia (generaliza a cópia 12 UTC → 18 UTC do produto semanal)</w:t>
+            </w:r>
+          </w:p>
+        </w:tc>
+        <w:tc>
+          <w:tcPr>
+            <w:tcW w:type="dxa" w:w="2166"/>
+            <w:tcBorders>
+              <w:top w:val="single" w:color="BFBFBF" w:sz="4"/>
+              <w:left w:val="single" w:color="BFBFBF" w:sz="4"/>
+              <w:bottom w:val="single" w:color="BFBFBF" w:sz="4"/>
+              <w:right w:val="single" w:color="BFBFBF" w:sz="4"/>
+            </w:tcBorders>
+            <w:tcMar>
+              <w:top w:type="dxa" w:w="60"/>
+              <w:left w:type="dxa" w:w="100"/>
+              <w:bottom w:type="dxa" w:w="60"/>
+              <w:right w:type="dxa" w:w="100"/>
+            </w:tcMar>
+          </w:tcPr>
+          <w:p>
+            <w:pPr>
+              <w:spacing w:after="0"/>
+            </w:pPr>
+            <w:r>
+              <w:rPr>
+                <w:rFonts w:ascii="Calibri" w:cs="Calibri" w:eastAsia="Calibri" w:hAnsi="Calibri"/>
+                <w:b w:val="false"/>
+                <w:bCs w:val="false"/>
+                <w:color w:val="000000"/>
+                <w:sz w:val="19"/>
+                <w:szCs w:val="19"/>
+              </w:rPr>
+              <w:t xml:space="preserve">desativado</w:t>
+            </w:r>
+          </w:p>
+        </w:tc>
+      </w:tr>
+      <w:tr>
+        <w:tc>
+          <w:tcPr>
+            <w:tcW w:type="dxa" w:w="2166"/>
+            <w:tcBorders>
+              <w:top w:val="single" w:color="BFBFBF" w:sz="4"/>
+              <w:left w:val="single" w:color="BFBFBF" w:sz="4"/>
+              <w:bottom w:val="single" w:color="BFBFBF" w:sz="4"/>
+              <w:right w:val="single" w:color="BFBFBF" w:sz="4"/>
+            </w:tcBorders>
+            <w:tcMar>
+              <w:top w:type="dxa" w:w="60"/>
+              <w:left w:type="dxa" w:w="100"/>
+              <w:bottom w:type="dxa" w:w="60"/>
+              <w:right w:type="dxa" w:w="100"/>
+            </w:tcMar>
+          </w:tcPr>
+          <w:p>
+            <w:pPr>
+              <w:spacing w:after="0"/>
+            </w:pPr>
+            <w:r>
+              <w:rPr>
+                <w:rFonts w:ascii="Calibri" w:cs="Calibri" w:eastAsia="Calibri" w:hAnsi="Calibri"/>
+                <w:b w:val="false"/>
+                <w:bCs w:val="false"/>
+                <w:color w:val="000000"/>
+                <w:sz w:val="19"/>
+                <w:szCs w:val="19"/>
+              </w:rPr>
+              <w:t xml:space="preserve">--sem-tif</w:t>
+            </w:r>
+          </w:p>
+        </w:tc>
+        <w:tc>
+          <w:tcPr>
+            <w:tcW w:type="dxa" w:w="4694"/>
+            <w:tcBorders>
+              <w:top w:val="single" w:color="BFBFBF" w:sz="4"/>
+              <w:left w:val="single" w:color="BFBFBF" w:sz="4"/>
+              <w:bottom w:val="single" w:color="BFBFBF" w:sz="4"/>
+              <w:right w:val="single" w:color="BFBFBF" w:sz="4"/>
+            </w:tcBorders>
+            <w:tcMar>
+              <w:top w:type="dxa" w:w="60"/>
+              <w:left w:type="dxa" w:w="100"/>
+              <w:bottom w:type="dxa" w:w="60"/>
+              <w:right w:type="dxa" w:w="100"/>
+            </w:tcMar>
+          </w:tcPr>
+          <w:p>
+            <w:pPr>
+              <w:spacing w:after="0"/>
+            </w:pPr>
+            <w:r>
+              <w:rPr>
+                <w:rFonts w:ascii="Calibri" w:cs="Calibri" w:eastAsia="Calibri" w:hAnsi="Calibri"/>
+                <w:b w:val="false"/>
+                <w:bCs w:val="false"/>
+                <w:color w:val="000000"/>
+                <w:sz w:val="19"/>
+                <w:szCs w:val="19"/>
+              </w:rPr>
+              <w:t xml:space="preserve">Gera apenas os NetCDF, sem GeoTIFF</w:t>
+            </w:r>
+          </w:p>
+        </w:tc>
+        <w:tc>
+          <w:tcPr>
+            <w:tcW w:type="dxa" w:w="2166"/>
+            <w:tcBorders>
+              <w:top w:val="single" w:color="BFBFBF" w:sz="4"/>
+              <w:left w:val="single" w:color="BFBFBF" w:sz="4"/>
+              <w:bottom w:val="single" w:color="BFBFBF" w:sz="4"/>
+              <w:right w:val="single" w:color="BFBFBF" w:sz="4"/>
+            </w:tcBorders>
+            <w:tcMar>
+              <w:top w:type="dxa" w:w="60"/>
+              <w:left w:type="dxa" w:w="100"/>
+              <w:bottom w:type="dxa" w:w="60"/>
+              <w:right w:type="dxa" w:w="100"/>
+            </w:tcMar>
+          </w:tcPr>
+          <w:p>
+            <w:pPr>
+              <w:spacing w:after="0"/>
+            </w:pPr>
+            <w:r>
+              <w:rPr>
+                <w:rFonts w:ascii="Calibri" w:cs="Calibri" w:eastAsia="Calibri" w:hAnsi="Calibri"/>
+                <w:b w:val="false"/>
+                <w:bCs w:val="false"/>
+                <w:color w:val="000000"/>
+                <w:sz w:val="19"/>
+                <w:szCs w:val="19"/>
+              </w:rPr>
+              <w:t xml:space="preserve">TIF ativado</w:t>
+            </w:r>
+          </w:p>
+        </w:tc>
+      </w:tr>
+      <w:tr>
+        <w:tc>
+          <w:tcPr>
+            <w:tcW w:type="dxa" w:w="2166"/>
+            <w:tcBorders>
+              <w:top w:val="single" w:color="BFBFBF" w:sz="4"/>
+              <w:left w:val="single" w:color="BFBFBF" w:sz="4"/>
+              <w:bottom w:val="single" w:color="BFBFBF" w:sz="4"/>
+              <w:right w:val="single" w:color="BFBFBF" w:sz="4"/>
+            </w:tcBorders>
+            <w:tcMar>
+              <w:top w:type="dxa" w:w="60"/>
+              <w:left w:type="dxa" w:w="100"/>
+              <w:bottom w:type="dxa" w:w="60"/>
+              <w:right w:type="dxa" w:w="100"/>
+            </w:tcMar>
+          </w:tcPr>
+          <w:p>
+            <w:pPr>
+              <w:spacing w:after="0"/>
+            </w:pPr>
+            <w:r>
+              <w:rPr>
+                <w:rFonts w:ascii="Calibri" w:cs="Calibri" w:eastAsia="Calibri" w:hAnsi="Calibri"/>
+                <w:b w:val="false"/>
+                <w:bCs w:val="false"/>
+                <w:color w:val="000000"/>
+                <w:sz w:val="19"/>
+                <w:szCs w:val="19"/>
+              </w:rPr>
+              <w:t xml:space="preserve">--fogograma</w:t>
+            </w:r>
+          </w:p>
+        </w:tc>
+        <w:tc>
+          <w:tcPr>
+            <w:tcW w:type="dxa" w:w="4694"/>
+            <w:tcBorders>
+              <w:top w:val="single" w:color="BFBFBF" w:sz="4"/>
+              <w:left w:val="single" w:color="BFBFBF" w:sz="4"/>
+              <w:bottom w:val="single" w:color="BFBFBF" w:sz="4"/>
+              <w:right w:val="single" w:color="BFBFBF" w:sz="4"/>
+            </w:tcBorders>
+            <w:tcMar>
+              <w:top w:type="dxa" w:w="60"/>
+              <w:left w:type="dxa" w:w="100"/>
+              <w:bottom w:type="dxa" w:w="60"/>
+              <w:right w:type="dxa" w:w="100"/>
+            </w:tcMar>
+          </w:tcPr>
+          <w:p>
+            <w:pPr>
+              <w:spacing w:after="0"/>
+            </w:pPr>
+            <w:r>
+              <w:rPr>
+                <w:rFonts w:ascii="Calibri" w:cs="Calibri" w:eastAsia="Calibri" w:hAnsi="Calibri"/>
+                <w:b w:val="false"/>
+                <w:bCs w:val="false"/>
+                <w:color w:val="000000"/>
+                <w:sz w:val="19"/>
+                <w:szCs w:val="19"/>
+              </w:rPr>
+              <w:t xml:space="preserve">Gera também um único NetCDF com todos os horizontes</w:t>
+            </w:r>
+          </w:p>
+        </w:tc>
+        <w:tc>
+          <w:tcPr>
+            <w:tcW w:type="dxa" w:w="2166"/>
+            <w:tcBorders>
+              <w:top w:val="single" w:color="BFBFBF" w:sz="4"/>
+              <w:left w:val="single" w:color="BFBFBF" w:sz="4"/>
+              <w:bottom w:val="single" w:color="BFBFBF" w:sz="4"/>
+              <w:right w:val="single" w:color="BFBFBF" w:sz="4"/>
+            </w:tcBorders>
+            <w:tcMar>
+              <w:top w:type="dxa" w:w="60"/>
+              <w:left w:type="dxa" w:w="100"/>
+              <w:bottom w:type="dxa" w:w="60"/>
+              <w:right w:type="dxa" w:w="100"/>
+            </w:tcMar>
+          </w:tcPr>
+          <w:p>
+            <w:pPr>
+              <w:spacing w:after="0"/>
+            </w:pPr>
+            <w:r>
+              <w:rPr>
+                <w:rFonts w:ascii="Calibri" w:cs="Calibri" w:eastAsia="Calibri" w:hAnsi="Calibri"/>
+                <w:b w:val="false"/>
+                <w:bCs w:val="false"/>
+                <w:color w:val="000000"/>
+                <w:sz w:val="19"/>
+                <w:szCs w:val="19"/>
+              </w:rPr>
+              <w:t xml:space="preserve">desativado</w:t>
+            </w:r>
+          </w:p>
+        </w:tc>
+      </w:tr>
+      <w:tr>
+        <w:tc>
+          <w:tcPr>
+            <w:tcW w:type="dxa" w:w="2166"/>
+            <w:tcBorders>
+              <w:top w:val="single" w:color="BFBFBF" w:sz="4"/>
+              <w:left w:val="single" w:color="BFBFBF" w:sz="4"/>
+              <w:bottom w:val="single" w:color="BFBFBF" w:sz="4"/>
+              <w:right w:val="single" w:color="BFBFBF" w:sz="4"/>
+            </w:tcBorders>
+            <w:tcMar>
+              <w:top w:type="dxa" w:w="60"/>
+              <w:left w:type="dxa" w:w="100"/>
+              <w:bottom w:type="dxa" w:w="60"/>
+              <w:right w:type="dxa" w:w="100"/>
+            </w:tcMar>
+          </w:tcPr>
+          <w:p>
+            <w:pPr>
+              <w:spacing w:after="0"/>
+            </w:pPr>
+            <w:r>
+              <w:rPr>
+                <w:rFonts w:ascii="Calibri" w:cs="Calibri" w:eastAsia="Calibri" w:hAnsi="Calibri"/>
+                <w:b w:val="false"/>
+                <w:bCs w:val="false"/>
+                <w:color w:val="000000"/>
+                <w:sz w:val="19"/>
+                <w:szCs w:val="19"/>
+              </w:rPr>
+              <w:t xml:space="preserve">--data-final / --jobs N</w:t>
+            </w:r>
+          </w:p>
+        </w:tc>
+        <w:tc>
+          <w:tcPr>
+            <w:tcW w:type="dxa" w:w="4694"/>
+            <w:tcBorders>
+              <w:top w:val="single" w:color="BFBFBF" w:sz="4"/>
+              <w:left w:val="single" w:color="BFBFBF" w:sz="4"/>
+              <w:bottom w:val="single" w:color="BFBFBF" w:sz="4"/>
+              <w:right w:val="single" w:color="BFBFBF" w:sz="4"/>
+            </w:tcBorders>
+            <w:tcMar>
+              <w:top w:type="dxa" w:w="60"/>
+              <w:left w:type="dxa" w:w="100"/>
+              <w:bottom w:type="dxa" w:w="60"/>
+              <w:right w:type="dxa" w:w="100"/>
+            </w:tcMar>
+          </w:tcPr>
+          <w:p>
+            <w:pPr>
+              <w:spacing w:after="0"/>
+            </w:pPr>
+            <w:r>
+              <w:rPr>
+                <w:rFonts w:ascii="Calibri" w:cs="Calibri" w:eastAsia="Calibri" w:hAnsi="Calibri"/>
+                <w:b w:val="false"/>
+                <w:bCs w:val="false"/>
+                <w:color w:val="000000"/>
+                <w:sz w:val="19"/>
+                <w:szCs w:val="19"/>
+              </w:rPr>
+              <w:t xml:space="preserve">Como nos demais scripts</w:t>
+            </w:r>
+          </w:p>
+        </w:tc>
+        <w:tc>
+          <w:tcPr>
+            <w:tcW w:type="dxa" w:w="2166"/>
+            <w:tcBorders>
+              <w:top w:val="single" w:color="BFBFBF" w:sz="4"/>
+              <w:left w:val="single" w:color="BFBFBF" w:sz="4"/>
+              <w:bottom w:val="single" w:color="BFBFBF" w:sz="4"/>
+              <w:right w:val="single" w:color="BFBFBF" w:sz="4"/>
+            </w:tcBorders>
+            <w:tcMar>
+              <w:top w:type="dxa" w:w="60"/>
+              <w:left w:type="dxa" w:w="100"/>
+              <w:bottom w:type="dxa" w:w="60"/>
+              <w:right w:type="dxa" w:w="100"/>
+            </w:tcMar>
+          </w:tcPr>
+          <w:p>
+            <w:pPr>
+              <w:spacing w:after="0"/>
+            </w:pPr>
+            <w:r>
+              <w:rPr>
+                <w:rFonts w:ascii="Calibri" w:cs="Calibri" w:eastAsia="Calibri" w:hAnsi="Calibri"/>
+                <w:b w:val="false"/>
+                <w:bCs w:val="false"/>
+                <w:color w:val="000000"/>
+                <w:sz w:val="19"/>
+                <w:szCs w:val="19"/>
+              </w:rPr>
+              <w:t xml:space="preserve">hoje / 4</w:t>
+            </w:r>
+          </w:p>
+        </w:tc>
+      </w:tr>
+    </w:tbl>
+    <w:p>
+      <w:pPr>
+        <w:spacing w:after="160" w:line="276"/>
+        <w:jc w:val="both"/>
+      </w:pPr>
+      <w:r>
+        <w:rPr>
+          <w:rFonts w:ascii="Calibri" w:cs="Calibri" w:eastAsia="Calibri" w:hAnsi="Calibri"/>
+          <w:b w:val="false"/>
+          <w:bCs w:val="false"/>
+          <w:i w:val="false"/>
+          <w:iCs w:val="false"/>
+          <w:color w:val="000000"/>
+          <w:sz w:val="22"/>
+          <w:szCs w:val="22"/>
+        </w:rPr>
+        <w:t xml:space="preserve"/>
+      </w:r>
+    </w:p>
+    <w:p>
+      <w:pPr>
+        <w:spacing w:after="160" w:line="276"/>
+        <w:jc w:val="both"/>
+      </w:pPr>
+      <w:r>
+        <w:rPr>
+          <w:rFonts w:ascii="Calibri" w:cs="Calibri" w:eastAsia="Calibri" w:hAnsi="Calibri"/>
+          <w:b w:val="false"/>
+          <w:bCs w:val="false"/>
+          <w:i w:val="false"/>
+          <w:iCs w:val="false"/>
+          <w:color w:val="000000"/>
+          <w:sz w:val="22"/>
+          <w:szCs w:val="22"/>
+        </w:rPr>
+        <w:t xml:space="preserve">As saídas seguem o mesmo formato dos demais produtos (RF.PREV.YYYYMMDDHH.nc e .tif), gravadas em data/output/2.2/&lt;produto&gt;/netcdf|tif/&lt;modelo&gt;/. O script genérico não gera links D1–D5, cópias T7/T14 nem faz envio a servidores — para os produtos operacionais, use os scripts dedicados.</w:t>
+      </w:r>
+    </w:p>
+    <w:p>
+      <w:pPr>
+        <w:pStyle w:val="Heading2"/>
+        <w:spacing w:after="160" w:before="280"/>
+      </w:pPr>
+      <w:r>
+        <w:rPr>
+          <w:rFonts w:ascii="Calibri" w:cs="Calibri" w:eastAsia="Calibri" w:hAnsi="Calibri"/>
+          <w:b/>
+          <w:bCs/>
+          <w:color w:val="1F4E79"/>
+          <w:sz w:val="25"/>
+          <w:szCs w:val="25"/>
+        </w:rPr>
+        <w:t xml:space="preserve">5.3 Fontes de dados e horizontes longos (--fonte)</w:t>
+      </w:r>
+    </w:p>
+    <w:p>
+      <w:pPr>
+        <w:spacing w:after="160" w:line="276"/>
+        <w:jc w:val="both"/>
+      </w:pPr>
+      <w:r>
+        <w:rPr>
+          <w:rFonts w:ascii="Calibri" w:cs="Calibri" w:eastAsia="Calibri" w:hAnsi="Calibri"/>
+          <w:b w:val="false"/>
+          <w:bCs w:val="false"/>
+          <w:i w:val="false"/>
+          <w:iCs w:val="false"/>
+          <w:color w:val="000000"/>
+          <w:sz w:val="22"/>
+          <w:szCs w:val="22"/>
+        </w:rPr>
+        <w:t xml:space="preserve">O alcance depende da fonte de previsão escolhida com --fonte:</w:t>
+      </w:r>
+    </w:p>
+    <w:tbl>
+      <w:tblPr>
+        <w:tblW w:type="dxa" w:w="9026"/>
+        <w:tblBorders>
+          <w:top w:val="single" w:color="auto" w:sz="4"/>
+          <w:left w:val="single" w:color="auto" w:sz="4"/>
+          <w:bottom w:val="single" w:color="auto" w:sz="4"/>
+          <w:right w:val="single" w:color="auto" w:sz="4"/>
+          <w:insideH w:val="single" w:color="auto" w:sz="4"/>
+          <w:insideV w:val="single" w:color="auto" w:sz="4"/>
+        </w:tblBorders>
+      </w:tblPr>
+      <w:tblGrid>
+        <w:gridCol w:w="1805"/>
+        <w:gridCol w:w="3610"/>
+        <w:gridCol w:w="3610"/>
+      </w:tblGrid>
+      <w:tr>
+        <w:trPr>
+          <w:tblHeader/>
+        </w:trPr>
+        <w:tc>
+          <w:tcPr>
+            <w:tcW w:type="dxa" w:w="1805"/>
+            <w:tcBorders>
+              <w:top w:val="single" w:color="BFBFBF" w:sz="4"/>
+              <w:left w:val="single" w:color="BFBFBF" w:sz="4"/>
+              <w:bottom w:val="single" w:color="BFBFBF" w:sz="4"/>
+              <w:right w:val="single" w:color="BFBFBF" w:sz="4"/>
+            </w:tcBorders>
+            <w:shd w:fill="1F4E79" w:val="clear"/>
+            <w:tcMar>
+              <w:top w:type="dxa" w:w="60"/>
+              <w:left w:type="dxa" w:w="100"/>
+              <w:bottom w:type="dxa" w:w="60"/>
+              <w:right w:type="dxa" w:w="100"/>
+            </w:tcMar>
+          </w:tcPr>
+          <w:p>
+            <w:pPr>
+              <w:spacing w:after="0"/>
+            </w:pPr>
+            <w:r>
+              <w:rPr>
+                <w:rFonts w:ascii="Calibri" w:cs="Calibri" w:eastAsia="Calibri" w:hAnsi="Calibri"/>
+                <w:b/>
+                <w:bCs/>
+                <w:color w:val="FFFFFF"/>
+                <w:sz w:val="19"/>
+                <w:szCs w:val="19"/>
+              </w:rPr>
+              <w:t xml:space="preserve">Fonte</w:t>
+            </w:r>
+          </w:p>
+        </w:tc>
+        <w:tc>
+          <w:tcPr>
+            <w:tcW w:type="dxa" w:w="3610"/>
+            <w:tcBorders>
+              <w:top w:val="single" w:color="BFBFBF" w:sz="4"/>
+              <w:left w:val="single" w:color="BFBFBF" w:sz="4"/>
+              <w:bottom w:val="single" w:color="BFBFBF" w:sz="4"/>
+              <w:right w:val="single" w:color="BFBFBF" w:sz="4"/>
+            </w:tcBorders>
+            <w:shd w:fill="1F4E79" w:val="clear"/>
+            <w:tcMar>
+              <w:top w:type="dxa" w:w="60"/>
+              <w:left w:type="dxa" w:w="100"/>
+              <w:bottom w:type="dxa" w:w="60"/>
+              <w:right w:type="dxa" w:w="100"/>
+            </w:tcMar>
+          </w:tcPr>
+          <w:p>
+            <w:pPr>
+              <w:spacing w:after="0"/>
+            </w:pPr>
+            <w:r>
+              <w:rPr>
+                <w:rFonts w:ascii="Calibri" w:cs="Calibri" w:eastAsia="Calibri" w:hAnsi="Calibri"/>
+                <w:b/>
+                <w:bCs/>
+                <w:color w:val="FFFFFF"/>
+                <w:sz w:val="19"/>
+                <w:szCs w:val="19"/>
+              </w:rPr>
+              <w:t xml:space="preserve">Alcance</w:t>
+            </w:r>
+          </w:p>
+        </w:tc>
+        <w:tc>
+          <w:tcPr>
+            <w:tcW w:type="dxa" w:w="3610"/>
+            <w:tcBorders>
+              <w:top w:val="single" w:color="BFBFBF" w:sz="4"/>
+              <w:left w:val="single" w:color="BFBFBF" w:sz="4"/>
+              <w:bottom w:val="single" w:color="BFBFBF" w:sz="4"/>
+              <w:right w:val="single" w:color="BFBFBF" w:sz="4"/>
+            </w:tcBorders>
+            <w:shd w:fill="1F4E79" w:val="clear"/>
+            <w:tcMar>
+              <w:top w:type="dxa" w:w="60"/>
+              <w:left w:type="dxa" w:w="100"/>
+              <w:bottom w:type="dxa" w:w="60"/>
+              <w:right w:type="dxa" w:w="100"/>
+            </w:tcMar>
+          </w:tcPr>
+          <w:p>
+            <w:pPr>
+              <w:spacing w:after="0"/>
+            </w:pPr>
+            <w:r>
+              <w:rPr>
+                <w:rFonts w:ascii="Calibri" w:cs="Calibri" w:eastAsia="Calibri" w:hAnsi="Calibri"/>
+                <w:b/>
+                <w:bCs/>
+                <w:color w:val="FFFFFF"/>
+                <w:sz w:val="19"/>
+                <w:szCs w:val="19"/>
+              </w:rPr>
+              <w:t xml:space="preserve">Frequência padrão dos acúmulos</w:t>
+            </w:r>
+          </w:p>
+        </w:tc>
+      </w:tr>
+      <w:tr>
+        <w:tc>
+          <w:tcPr>
+            <w:tcW w:type="dxa" w:w="1805"/>
+            <w:tcBorders>
+              <w:top w:val="single" w:color="BFBFBF" w:sz="4"/>
+              <w:left w:val="single" w:color="BFBFBF" w:sz="4"/>
+              <w:bottom w:val="single" w:color="BFBFBF" w:sz="4"/>
+              <w:right w:val="single" w:color="BFBFBF" w:sz="4"/>
+            </w:tcBorders>
+            <w:tcMar>
+              <w:top w:type="dxa" w:w="60"/>
+              <w:left w:type="dxa" w:w="100"/>
+              <w:bottom w:type="dxa" w:w="60"/>
+              <w:right w:type="dxa" w:w="100"/>
+            </w:tcMar>
+          </w:tcPr>
+          <w:p>
+            <w:pPr>
+              <w:spacing w:after="0"/>
+            </w:pPr>
+            <w:r>
+              <w:rPr>
+                <w:rFonts w:ascii="Calibri" w:cs="Calibri" w:eastAsia="Calibri" w:hAnsi="Calibri"/>
+                <w:b w:val="false"/>
+                <w:bCs w:val="false"/>
+                <w:color w:val="000000"/>
+                <w:sz w:val="19"/>
+                <w:szCs w:val="19"/>
+              </w:rPr>
+              <w:t xml:space="preserve">gfs</w:t>
+            </w:r>
+          </w:p>
+        </w:tc>
+        <w:tc>
+          <w:tcPr>
+            <w:tcW w:type="dxa" w:w="3610"/>
+            <w:tcBorders>
+              <w:top w:val="single" w:color="BFBFBF" w:sz="4"/>
+              <w:left w:val="single" w:color="BFBFBF" w:sz="4"/>
+              <w:bottom w:val="single" w:color="BFBFBF" w:sz="4"/>
+              <w:right w:val="single" w:color="BFBFBF" w:sz="4"/>
+            </w:tcBorders>
+            <w:tcMar>
+              <w:top w:type="dxa" w:w="60"/>
+              <w:left w:type="dxa" w:w="100"/>
+              <w:bottom w:type="dxa" w:w="60"/>
+              <w:right w:type="dxa" w:w="100"/>
+            </w:tcMar>
+          </w:tcPr>
+          <w:p>
+            <w:pPr>
+              <w:spacing w:after="0"/>
+            </w:pPr>
+            <w:r>
+              <w:rPr>
+                <w:rFonts w:ascii="Calibri" w:cs="Calibri" w:eastAsia="Calibri" w:hAnsi="Calibri"/>
+                <w:b w:val="false"/>
+                <w:bCs w:val="false"/>
+                <w:color w:val="000000"/>
+                <w:sz w:val="19"/>
+                <w:szCs w:val="19"/>
+              </w:rPr>
+              <w:t xml:space="preserve">~16 dias</w:t>
+            </w:r>
+          </w:p>
+        </w:tc>
+        <w:tc>
+          <w:tcPr>
+            <w:tcW w:type="dxa" w:w="3610"/>
+            <w:tcBorders>
+              <w:top w:val="single" w:color="BFBFBF" w:sz="4"/>
+              <w:left w:val="single" w:color="BFBFBF" w:sz="4"/>
+              <w:bottom w:val="single" w:color="BFBFBF" w:sz="4"/>
+              <w:right w:val="single" w:color="BFBFBF" w:sz="4"/>
+            </w:tcBorders>
+            <w:tcMar>
+              <w:top w:type="dxa" w:w="60"/>
+              <w:left w:type="dxa" w:w="100"/>
+              <w:bottom w:type="dxa" w:w="60"/>
+              <w:right w:type="dxa" w:w="100"/>
+            </w:tcMar>
+          </w:tcPr>
+          <w:p>
+            <w:pPr>
+              <w:spacing w:after="0"/>
+            </w:pPr>
+            <w:r>
+              <w:rPr>
+                <w:rFonts w:ascii="Calibri" w:cs="Calibri" w:eastAsia="Calibri" w:hAnsi="Calibri"/>
+                <w:b w:val="false"/>
+                <w:bCs w:val="false"/>
+                <w:color w:val="000000"/>
+                <w:sz w:val="19"/>
+                <w:szCs w:val="19"/>
+              </w:rPr>
+              <w:t xml:space="preserve">1 dia</w:t>
+            </w:r>
+          </w:p>
+        </w:tc>
+      </w:tr>
+      <w:tr>
+        <w:tc>
+          <w:tcPr>
+            <w:tcW w:type="dxa" w:w="1805"/>
+            <w:tcBorders>
+              <w:top w:val="single" w:color="BFBFBF" w:sz="4"/>
+              <w:left w:val="single" w:color="BFBFBF" w:sz="4"/>
+              <w:bottom w:val="single" w:color="BFBFBF" w:sz="4"/>
+              <w:right w:val="single" w:color="BFBFBF" w:sz="4"/>
+            </w:tcBorders>
+            <w:tcMar>
+              <w:top w:type="dxa" w:w="60"/>
+              <w:left w:type="dxa" w:w="100"/>
+              <w:bottom w:type="dxa" w:w="60"/>
+              <w:right w:type="dxa" w:w="100"/>
+            </w:tcMar>
+          </w:tcPr>
+          <w:p>
+            <w:pPr>
+              <w:spacing w:after="0"/>
+            </w:pPr>
+            <w:r>
+              <w:rPr>
+                <w:rFonts w:ascii="Calibri" w:cs="Calibri" w:eastAsia="Calibri" w:hAnsi="Calibri"/>
+                <w:b w:val="false"/>
+                <w:bCs w:val="false"/>
+                <w:color w:val="000000"/>
+                <w:sz w:val="19"/>
+                <w:szCs w:val="19"/>
+              </w:rPr>
+              <w:t xml:space="preserve">eta</w:t>
+            </w:r>
+          </w:p>
+        </w:tc>
+        <w:tc>
+          <w:tcPr>
+            <w:tcW w:type="dxa" w:w="3610"/>
+            <w:tcBorders>
+              <w:top w:val="single" w:color="BFBFBF" w:sz="4"/>
+              <w:left w:val="single" w:color="BFBFBF" w:sz="4"/>
+              <w:bottom w:val="single" w:color="BFBFBF" w:sz="4"/>
+              <w:right w:val="single" w:color="BFBFBF" w:sz="4"/>
+            </w:tcBorders>
+            <w:tcMar>
+              <w:top w:type="dxa" w:w="60"/>
+              <w:left w:type="dxa" w:w="100"/>
+              <w:bottom w:type="dxa" w:w="60"/>
+              <w:right w:type="dxa" w:w="100"/>
+            </w:tcMar>
+          </w:tcPr>
+          <w:p>
+            <w:pPr>
+              <w:spacing w:after="0"/>
+            </w:pPr>
+            <w:r>
+              <w:rPr>
+                <w:rFonts w:ascii="Calibri" w:cs="Calibri" w:eastAsia="Calibri" w:hAnsi="Calibri"/>
+                <w:b w:val="false"/>
+                <w:bCs w:val="false"/>
+                <w:color w:val="000000"/>
+                <w:sz w:val="19"/>
+                <w:szCs w:val="19"/>
+              </w:rPr>
+              <w:t xml:space="preserve">até 13 meses</w:t>
+            </w:r>
+          </w:p>
+        </w:tc>
+        <w:tc>
+          <w:tcPr>
+            <w:tcW w:type="dxa" w:w="3610"/>
+            <w:tcBorders>
+              <w:top w:val="single" w:color="BFBFBF" w:sz="4"/>
+              <w:left w:val="single" w:color="BFBFBF" w:sz="4"/>
+              <w:bottom w:val="single" w:color="BFBFBF" w:sz="4"/>
+              <w:right w:val="single" w:color="BFBFBF" w:sz="4"/>
+            </w:tcBorders>
+            <w:tcMar>
+              <w:top w:type="dxa" w:w="60"/>
+              <w:left w:type="dxa" w:w="100"/>
+              <w:bottom w:type="dxa" w:w="60"/>
+              <w:right w:type="dxa" w:w="100"/>
+            </w:tcMar>
+          </w:tcPr>
+          <w:p>
+            <w:pPr>
+              <w:spacing w:after="0"/>
+            </w:pPr>
+            <w:r>
+              <w:rPr>
+                <w:rFonts w:ascii="Calibri" w:cs="Calibri" w:eastAsia="Calibri" w:hAnsi="Calibri"/>
+                <w:b w:val="false"/>
+                <w:bCs w:val="false"/>
+                <w:color w:val="000000"/>
+                <w:sz w:val="19"/>
+                <w:szCs w:val="19"/>
+              </w:rPr>
+              <w:t xml:space="preserve">1 dia</w:t>
+            </w:r>
+          </w:p>
+        </w:tc>
+      </w:tr>
+      <w:tr>
+        <w:tc>
+          <w:tcPr>
+            <w:tcW w:type="dxa" w:w="1805"/>
+            <w:tcBorders>
+              <w:top w:val="single" w:color="BFBFBF" w:sz="4"/>
+              <w:left w:val="single" w:color="BFBFBF" w:sz="4"/>
+              <w:bottom w:val="single" w:color="BFBFBF" w:sz="4"/>
+              <w:right w:val="single" w:color="BFBFBF" w:sz="4"/>
+            </w:tcBorders>
+            <w:tcMar>
+              <w:top w:type="dxa" w:w="60"/>
+              <w:left w:type="dxa" w:w="100"/>
+              <w:bottom w:type="dxa" w:w="60"/>
+              <w:right w:type="dxa" w:w="100"/>
+            </w:tcMar>
+          </w:tcPr>
+          <w:p>
+            <w:pPr>
+              <w:spacing w:after="0"/>
+            </w:pPr>
+            <w:r>
+              <w:rPr>
+                <w:rFonts w:ascii="Calibri" w:cs="Calibri" w:eastAsia="Calibri" w:hAnsi="Calibri"/>
+                <w:b w:val="false"/>
+                <w:bCs w:val="false"/>
+                <w:color w:val="000000"/>
+                <w:sz w:val="19"/>
+                <w:szCs w:val="19"/>
+              </w:rPr>
+              <w:t xml:space="preserve">besm</w:t>
+            </w:r>
+          </w:p>
+        </w:tc>
+        <w:tc>
+          <w:tcPr>
+            <w:tcW w:type="dxa" w:w="3610"/>
+            <w:tcBorders>
+              <w:top w:val="single" w:color="BFBFBF" w:sz="4"/>
+              <w:left w:val="single" w:color="BFBFBF" w:sz="4"/>
+              <w:bottom w:val="single" w:color="BFBFBF" w:sz="4"/>
+              <w:right w:val="single" w:color="BFBFBF" w:sz="4"/>
+            </w:tcBorders>
+            <w:tcMar>
+              <w:top w:type="dxa" w:w="60"/>
+              <w:left w:type="dxa" w:w="100"/>
+              <w:bottom w:type="dxa" w:w="60"/>
+              <w:right w:type="dxa" w:w="100"/>
+            </w:tcMar>
+          </w:tcPr>
+          <w:p>
+            <w:pPr>
+              <w:spacing w:after="0"/>
+            </w:pPr>
+            <w:r>
+              <w:rPr>
+                <w:rFonts w:ascii="Calibri" w:cs="Calibri" w:eastAsia="Calibri" w:hAnsi="Calibri"/>
+                <w:b w:val="false"/>
+                <w:bCs w:val="false"/>
+                <w:color w:val="000000"/>
+                <w:sz w:val="19"/>
+                <w:szCs w:val="19"/>
+              </w:rPr>
+              <w:t xml:space="preserve">até 13 meses</w:t>
+            </w:r>
+          </w:p>
+        </w:tc>
+        <w:tc>
+          <w:tcPr>
+            <w:tcW w:type="dxa" w:w="3610"/>
+            <w:tcBorders>
+              <w:top w:val="single" w:color="BFBFBF" w:sz="4"/>
+              <w:left w:val="single" w:color="BFBFBF" w:sz="4"/>
+              <w:bottom w:val="single" w:color="BFBFBF" w:sz="4"/>
+              <w:right w:val="single" w:color="BFBFBF" w:sz="4"/>
+            </w:tcBorders>
+            <w:tcMar>
+              <w:top w:type="dxa" w:w="60"/>
+              <w:left w:type="dxa" w:w="100"/>
+              <w:bottom w:type="dxa" w:w="60"/>
+              <w:right w:type="dxa" w:w="100"/>
+            </w:tcMar>
+          </w:tcPr>
+          <w:p>
+            <w:pPr>
+              <w:spacing w:after="0"/>
+            </w:pPr>
+            <w:r>
+              <w:rPr>
+                <w:rFonts w:ascii="Calibri" w:cs="Calibri" w:eastAsia="Calibri" w:hAnsi="Calibri"/>
+                <w:b w:val="false"/>
+                <w:bCs w:val="false"/>
+                <w:color w:val="000000"/>
+                <w:sz w:val="19"/>
+                <w:szCs w:val="19"/>
+              </w:rPr>
+              <w:t xml:space="preserve">1 dia (arquivo único por variável)</w:t>
+            </w:r>
+          </w:p>
+        </w:tc>
+      </w:tr>
+    </w:tbl>
+    <w:p>
+      <w:pPr>
+        <w:spacing w:after="160" w:line="276"/>
+        <w:jc w:val="both"/>
+      </w:pPr>
+      <w:r>
+        <w:rPr>
+          <w:rFonts w:ascii="Calibri" w:cs="Calibri" w:eastAsia="Calibri" w:hAnsi="Calibri"/>
+          <w:b w:val="false"/>
+          <w:bCs w:val="false"/>
+          <w:i w:val="false"/>
+          <w:iCs w:val="false"/>
+          <w:color w:val="000000"/>
+          <w:sz w:val="22"/>
+          <w:szCs w:val="22"/>
+        </w:rPr>
+        <w:t xml:space="preserve"/>
+      </w:r>
+    </w:p>
+    <w:p>
+      <w:pPr>
+        <w:spacing w:after="160" w:line="276"/>
+        <w:jc w:val="both"/>
+      </w:pPr>
+      <w:r>
+        <w:rPr>
+          <w:rFonts w:ascii="Calibri" w:cs="Calibri" w:eastAsia="Calibri" w:hAnsi="Calibri"/>
+          <w:b/>
+          <w:bCs/>
+          <w:i w:val="false"/>
+          <w:iCs w:val="false"/>
+          <w:color w:val="000000"/>
+          <w:sz w:val="22"/>
+          <w:szCs w:val="22"/>
+        </w:rPr>
+        <w:t xml:space="preserve">Sem --fonte</w:t>
+      </w:r>
+      <w:r>
+        <w:rPr>
+          <w:rFonts w:ascii="Calibri" w:cs="Calibri" w:eastAsia="Calibri" w:hAnsi="Calibri"/>
+          <w:b w:val="false"/>
+          <w:bCs w:val="false"/>
+          <w:i w:val="false"/>
+          <w:iCs w:val="false"/>
+          <w:color w:val="000000"/>
+          <w:sz w:val="22"/>
+          <w:szCs w:val="22"/>
+        </w:rPr>
+        <w:t xml:space="preserve">, o script usa a composição original dos produtos operacionais: 119 dias de IMERG observado + o acumulado do GFS do dia previsto (idêntica aos scripts dedicados, limitada ao alcance do GFS).</w:t>
+      </w:r>
+    </w:p>
+    <w:p>
+      <w:pPr>
+        <w:spacing w:after="160" w:line="276"/>
+        <w:jc w:val="both"/>
+      </w:pPr>
+      <w:r>
+        <w:rPr>
+          <w:rFonts w:ascii="Calibri" w:cs="Calibri" w:eastAsia="Calibri" w:hAnsi="Calibri"/>
+          <w:b/>
+          <w:bCs/>
+          <w:i w:val="false"/>
+          <w:iCs w:val="false"/>
+          <w:color w:val="000000"/>
+          <w:sz w:val="22"/>
+          <w:szCs w:val="22"/>
+        </w:rPr>
+        <w:t xml:space="preserve">Com --fonte</w:t>
+      </w:r>
+      <w:r>
+        <w:rPr>
+          <w:rFonts w:ascii="Calibri" w:cs="Calibri" w:eastAsia="Calibri" w:hAnsi="Calibri"/>
+          <w:b w:val="false"/>
+          <w:bCs w:val="false"/>
+          <w:i w:val="false"/>
+          <w:iCs w:val="false"/>
+          <w:color w:val="000000"/>
+          <w:sz w:val="22"/>
+          <w:szCs w:val="22"/>
+        </w:rPr>
+        <w:t xml:space="preserve">, a série diária de 120 tempos que antecede cada data prevista é montada de forma completa: IMERG observado para os dias anteriores à rodada e precipitação PREVISTA da fonte para os dias entre a rodada e a data válida. É isso que viabiliza horizontes de semanas a 13 meses (Eta/BESM) — num horizonte de 13 meses, os 120 dias da janela são inteiramente previstos. Os acúmulos da fonte podem vir em qualquer frequência (1h, 12h, 1d): são somados para o passo diário automaticamente, e campos em grade diferente da do IMERG são regradeados por interpolação bilinear. O horizonte pedido é validado contra o alcance da fonte (horizonte_max_dias).</w:t>
+      </w:r>
+    </w:p>
+    <w:p>
+      <w:pPr>
+        <w:pStyle w:val="Heading2"/>
+        <w:spacing w:after="160" w:before="280"/>
+      </w:pPr>
+      <w:r>
+        <w:rPr>
+          <w:rFonts w:ascii="Calibri" w:cs="Calibri" w:eastAsia="Calibri" w:hAnsi="Calibri"/>
+          <w:b/>
+          <w:bCs/>
+          <w:color w:val="1F4E79"/>
+          <w:sz w:val="25"/>
+          <w:szCs w:val="25"/>
+        </w:rPr>
+        <w:t xml:space="preserve">5.4 Configuração das fontes (rf_fontes.py e --config-fontes)</w:t>
+      </w:r>
+    </w:p>
+    <w:p>
+      <w:pPr>
+        <w:spacing w:after="160" w:line="276"/>
+        <w:jc w:val="both"/>
+      </w:pPr>
+      <w:r>
+        <w:rPr>
+          <w:rFonts w:ascii="Calibri" w:cs="Calibri" w:eastAsia="Calibri" w:hAnsi="Calibri"/>
+          <w:b w:val="false"/>
+          <w:bCs w:val="false"/>
+          <w:i w:val="false"/>
+          <w:iCs w:val="false"/>
+          <w:color w:val="000000"/>
+          <w:sz w:val="22"/>
+          <w:szCs w:val="22"/>
+        </w:rPr>
+        <w:t xml:space="preserve">Cada fonte é descrita em rf_fontes.py por: </w:t>
+      </w:r>
+      <w:r>
+        <w:rPr>
+          <w:rFonts w:ascii="Calibri" w:cs="Calibri" w:eastAsia="Calibri" w:hAnsi="Calibri"/>
+          <w:b/>
+          <w:bCs/>
+          <w:i w:val="false"/>
+          <w:iCs w:val="false"/>
+          <w:color w:val="000000"/>
+          <w:sz w:val="22"/>
+          <w:szCs w:val="22"/>
+        </w:rPr>
+        <w:t xml:space="preserve">layout</w:t>
+      </w:r>
+      <w:r>
+        <w:rPr>
+          <w:rFonts w:ascii="Calibri" w:cs="Calibri" w:eastAsia="Calibri" w:hAnsi="Calibri"/>
+          <w:b w:val="false"/>
+          <w:bCs w:val="false"/>
+          <w:i w:val="false"/>
+          <w:iCs w:val="false"/>
+          <w:color w:val="000000"/>
+          <w:sz w:val="22"/>
+          <w:szCs w:val="22"/>
+        </w:rPr>
+        <w:t xml:space="preserve"> dos arquivos (por_tempo = um arquivo por horário previsto, como o GFS deste pipeline; serie = um arquivo por variável com todos os tempos da rodada, como o BESM T062), subdiretório dos dados, padrões de nome dos arquivos (com os marcadores {modelo} e {valida}), nomes das variáveis (var_prec, var_temp, var_ur), frequência dos acúmulos (freq_prec: 1h, 12h, 1d), tipo de acumulação (intervalo = acumulado do próprio intervalo; desde_inicio = acumulado desde o início da rodada), unidades (unidade_temp: K/C; unidade_ur: %/frac) e alcance (horizonte_max_dias).</w:t>
+      </w:r>
+    </w:p>
+    <w:p>
+      <w:pPr>
+        <w:spacing w:after="160" w:line="276"/>
+        <w:jc w:val="both"/>
+      </w:pPr>
+      <w:r>
+        <w:rPr>
+          <w:rFonts w:ascii="Calibri" w:cs="Calibri" w:eastAsia="Calibri" w:hAnsi="Calibri"/>
+          <w:b/>
+          <w:bCs/>
+          <w:i w:val="false"/>
+          <w:iCs w:val="false"/>
+          <w:color w:val="000000"/>
+          <w:sz w:val="22"/>
+          <w:szCs w:val="22"/>
+        </w:rPr>
+        <w:t xml:space="preserve">A fonte besm já vem configurada com a convenção real do BESM T062 (pacote besm_queimada do CPTEC): </w:t>
+      </w:r>
+      <w:r>
+        <w:rPr>
+          <w:rFonts w:ascii="Calibri" w:cs="Calibri" w:eastAsia="Calibri" w:hAnsi="Calibri"/>
+          <w:b w:val="false"/>
+          <w:bCs w:val="false"/>
+          <w:i w:val="false"/>
+          <w:iCs w:val="false"/>
+          <w:color w:val="000000"/>
+          <w:sz w:val="22"/>
+          <w:szCs w:val="22"/>
+        </w:rPr>
+        <w:t xml:space="preserve">layout serie com tmp_prec.nc (mm/dia), tmp_t2mt.nc (K, média diária) e tmp_rsmt.nc (%, 0–100) em BESM/netcdf/&lt;modelo&gt;/, 396 tempos diários (rodada+1 até rodada+13 meses), grade gaussiana ~1,875° com latitude norte→sul (invertida automaticamente na leitura). Como a série começa em rodada+1, o dia da própria rodada é preenchido com o IMERG observado, se existir, ou aproximado pelo primeiro dia da série (aviso no log). Os padrões do Eta seguem PROVISÓRIOS — ajuste-os à convenção real com um JSON, sem alterar o código:</w:t>
+      </w:r>
+    </w:p>
+    <w:p>
+      <w:pPr>
+        <w:shd w:fill="F2F2F2" w:val="clear"/>
+        <w:spacing w:after="0"/>
+      </w:pPr>
+      <w:r>
+        <w:rPr>
+          <w:rFonts w:ascii="Consolas" w:cs="Consolas" w:eastAsia="Consolas" w:hAnsi="Consolas"/>
+          <w:sz w:val="19"/>
+          <w:szCs w:val="19"/>
+        </w:rPr>
+        <w:t xml:space="preserve">{</w:t>
+      </w:r>
+    </w:p>
+    <w:p>
+      <w:pPr>
+        <w:shd w:fill="F2F2F2" w:val="clear"/>
+        <w:spacing w:after="0"/>
+      </w:pPr>
+      <w:r>
+        <w:rPr>
+          <w:rFonts w:ascii="Consolas" w:cs="Consolas" w:eastAsia="Consolas" w:hAnsi="Consolas"/>
+          <w:sz w:val="19"/>
+          <w:szCs w:val="19"/>
+        </w:rPr>
+        <w:t xml:space="preserve">  "eta": {</w:t>
+      </w:r>
+    </w:p>
+    <w:p>
+      <w:pPr>
+        <w:shd w:fill="F2F2F2" w:val="clear"/>
+        <w:spacing w:after="0"/>
+      </w:pPr>
+      <w:r>
+        <w:rPr>
+          <w:rFonts w:ascii="Consolas" w:cs="Consolas" w:eastAsia="Consolas" w:hAnsi="Consolas"/>
+          <w:sz w:val="19"/>
+          <w:szCs w:val="19"/>
+        </w:rPr>
+        <w:t xml:space="preserve">    "subdir": "ETA/netcdf/{modelo}",</w:t>
+      </w:r>
+    </w:p>
+    <w:p>
+      <w:pPr>
+        <w:shd w:fill="F2F2F2" w:val="clear"/>
+        <w:spacing w:after="0"/>
+      </w:pPr>
+      <w:r>
+        <w:rPr>
+          <w:rFonts w:ascii="Consolas" w:cs="Consolas" w:eastAsia="Consolas" w:hAnsi="Consolas"/>
+          <w:sz w:val="19"/>
+          <w:szCs w:val="19"/>
+        </w:rPr>
+        <w:t xml:space="preserve">    "padrao_prec": "ETA.PREV.PREC.{modelo}.{valida}.nc",</w:t>
+      </w:r>
+    </w:p>
+    <w:p>
+      <w:pPr>
+        <w:shd w:fill="F2F2F2" w:val="clear"/>
+        <w:spacing w:after="0"/>
+      </w:pPr>
+      <w:r>
+        <w:rPr>
+          <w:rFonts w:ascii="Consolas" w:cs="Consolas" w:eastAsia="Consolas" w:hAnsi="Consolas"/>
+          <w:sz w:val="19"/>
+          <w:szCs w:val="19"/>
+        </w:rPr>
+        <w:t xml:space="preserve">    "padrao_temp_ur": "ETA.PREV.TEMP2m.RH2m.{modelo}.{valida}.nc",</w:t>
+      </w:r>
+    </w:p>
+    <w:p>
+      <w:pPr>
+        <w:shd w:fill="F2F2F2" w:val="clear"/>
+        <w:spacing w:after="0"/>
+      </w:pPr>
+      <w:r>
+        <w:rPr>
+          <w:rFonts w:ascii="Consolas" w:cs="Consolas" w:eastAsia="Consolas" w:hAnsi="Consolas"/>
+          <w:sz w:val="19"/>
+          <w:szCs w:val="19"/>
+        </w:rPr>
+        <w:t xml:space="preserve">    "var_prec": "prec",</w:t>
+      </w:r>
+    </w:p>
+    <w:p>
+      <w:pPr>
+        <w:shd w:fill="F2F2F2" w:val="clear"/>
+        <w:spacing w:after="0"/>
+      </w:pPr>
+      <w:r>
+        <w:rPr>
+          <w:rFonts w:ascii="Consolas" w:cs="Consolas" w:eastAsia="Consolas" w:hAnsi="Consolas"/>
+          <w:sz w:val="19"/>
+          <w:szCs w:val="19"/>
+        </w:rPr>
+        <w:t xml:space="preserve">    "freq_prec": "1d",</w:t>
+      </w:r>
+    </w:p>
+    <w:p>
+      <w:pPr>
+        <w:shd w:fill="F2F2F2" w:val="clear"/>
+        <w:spacing w:after="0"/>
+      </w:pPr>
+      <w:r>
+        <w:rPr>
+          <w:rFonts w:ascii="Consolas" w:cs="Consolas" w:eastAsia="Consolas" w:hAnsi="Consolas"/>
+          <w:sz w:val="19"/>
+          <w:szCs w:val="19"/>
+        </w:rPr>
+        <w:t xml:space="preserve">    "horizonte_max_dias": 396</w:t>
+      </w:r>
+    </w:p>
+    <w:p>
+      <w:pPr>
+        <w:shd w:fill="F2F2F2" w:val="clear"/>
+        <w:spacing w:after="0"/>
+      </w:pPr>
+      <w:r>
+        <w:rPr>
+          <w:rFonts w:ascii="Consolas" w:cs="Consolas" w:eastAsia="Consolas" w:hAnsi="Consolas"/>
+          <w:sz w:val="19"/>
+          <w:szCs w:val="19"/>
+        </w:rPr>
+        <w:t xml:space="preserve">  },</w:t>
+      </w:r>
+    </w:p>
+    <w:p>
+      <w:pPr>
+        <w:shd w:fill="F2F2F2" w:val="clear"/>
+        <w:spacing w:after="0"/>
+      </w:pPr>
+      <w:r>
+        <w:rPr>
+          <w:rFonts w:ascii="Consolas" w:cs="Consolas" w:eastAsia="Consolas" w:hAnsi="Consolas"/>
+          <w:sz w:val="19"/>
+          <w:szCs w:val="19"/>
+        </w:rPr>
+        <w:t xml:space="preserve">  "besm": { "freq_prec": "12h" }</w:t>
+      </w:r>
+    </w:p>
+    <w:p>
+      <w:pPr>
+        <w:shd w:fill="F2F2F2" w:val="clear"/>
+        <w:spacing w:after="160"/>
+      </w:pPr>
+      <w:r>
+        <w:rPr>
+          <w:rFonts w:ascii="Consolas" w:cs="Consolas" w:eastAsia="Consolas" w:hAnsi="Consolas"/>
+          <w:sz w:val="19"/>
+          <w:szCs w:val="19"/>
+        </w:rPr>
+        <w:t xml:space="preserve">}</w:t>
+      </w:r>
+    </w:p>
+    <w:p>
+      <w:pPr>
+        <w:shd w:fill="F2F2F2" w:val="clear"/>
+        <w:spacing w:after="160"/>
+      </w:pPr>
+      <w:r>
+        <w:rPr>
+          <w:rFonts w:ascii="Consolas" w:cs="Consolas" w:eastAsia="Consolas" w:hAnsi="Consolas"/>
+          <w:sz w:val="19"/>
+          <w:szCs w:val="19"/>
+        </w:rPr>
+        <w:t xml:space="preserve">python3 rf_previsto.py --fonte eta --horizontes 13m --config-fontes fontes.json</w:t>
+      </w:r>
+    </w:p>
+    <w:p>
+      <w:pPr>
+        <w:spacing w:after="160" w:line="276"/>
+        <w:jc w:val="both"/>
+      </w:pPr>
+      <w:r>
+        <w:rPr>
+          <w:rFonts w:ascii="Calibri" w:cs="Calibri" w:eastAsia="Calibri" w:hAnsi="Calibri"/>
+          <w:b w:val="false"/>
+          <w:bCs w:val="false"/>
+          <w:i w:val="false"/>
+          <w:iCs w:val="false"/>
+          <w:color w:val="000000"/>
+          <w:sz w:val="22"/>
+          <w:szCs w:val="22"/>
+        </w:rPr>
+        <w:t xml:space="preserve">Os arquivos das fontes devem ser NetCDF em grade regular lat/lon (como os do GFS já pré-processados neste pipeline); saídas nativas (grib do Eta, espectral do BESM) precisam ser convertidas antes. Novas fontes podem ser acrescentadas no mesmo JSON — o nome da chave passa a valer em --fonte.</w:t>
+      </w:r>
+    </w:p>
+    <w:p>
+      <w:pPr>
+        <w:pStyle w:val="Heading2"/>
+        <w:spacing w:after="160" w:before="280"/>
+      </w:pPr>
+      <w:r>
+        <w:rPr>
+          <w:rFonts w:ascii="Calibri" w:cs="Calibri" w:eastAsia="Calibri" w:hAnsi="Calibri"/>
+          <w:b/>
+          <w:bCs/>
+          <w:color w:val="1F4E79"/>
+          <w:sz w:val="25"/>
+          <w:szCs w:val="25"/>
+        </w:rPr>
+        <w:t xml:space="preserve">5.5 Arquivo de configuração YAML (--config)</w:t>
+      </w:r>
+    </w:p>
+    <w:p>
+      <w:pPr>
+        <w:spacing w:after="160" w:line="276"/>
+        <w:jc w:val="both"/>
+      </w:pPr>
+      <w:r>
+        <w:rPr>
+          <w:rFonts w:ascii="Calibri" w:cs="Calibri" w:eastAsia="Calibri" w:hAnsi="Calibri"/>
+          <w:b w:val="false"/>
+          <w:bCs w:val="false"/>
+          <w:i w:val="false"/>
+          <w:iCs w:val="false"/>
+          <w:color w:val="000000"/>
+          <w:sz w:val="22"/>
+          <w:szCs w:val="22"/>
+        </w:rPr>
+        <w:t xml:space="preserve">O --config arquivo.yaml centraliza toda a configuração dos dados de entrada num único arquivo YAML (ou JSON), com seções opcionais — o que não for informado usa os padrões da produção, e a linha de comando sempre prevalece sobre o arquivo:</w:t>
+      </w:r>
+    </w:p>
+    <w:tbl>
+      <w:tblPr>
+        <w:tblW w:type="dxa" w:w="9026"/>
+        <w:tblBorders>
+          <w:top w:val="single" w:color="auto" w:sz="4"/>
+          <w:left w:val="single" w:color="auto" w:sz="4"/>
+          <w:bottom w:val="single" w:color="auto" w:sz="4"/>
+          <w:right w:val="single" w:color="auto" w:sz="4"/>
+          <w:insideH w:val="single" w:color="auto" w:sz="4"/>
+          <w:insideV w:val="single" w:color="auto" w:sz="4"/>
+        </w:tblBorders>
+      </w:tblPr>
+      <w:tblGrid>
+        <w:gridCol w:w="1805"/>
+        <w:gridCol w:w="7221"/>
+      </w:tblGrid>
+      <w:tr>
+        <w:trPr>
+          <w:tblHeader/>
+        </w:trPr>
+        <w:tc>
+          <w:tcPr>
+            <w:tcW w:type="dxa" w:w="1805"/>
+            <w:tcBorders>
+              <w:top w:val="single" w:color="BFBFBF" w:sz="4"/>
+              <w:left w:val="single" w:color="BFBFBF" w:sz="4"/>
+              <w:bottom w:val="single" w:color="BFBFBF" w:sz="4"/>
+              <w:right w:val="single" w:color="BFBFBF" w:sz="4"/>
+            </w:tcBorders>
+            <w:shd w:fill="1F4E79" w:val="clear"/>
+            <w:tcMar>
+              <w:top w:type="dxa" w:w="60"/>
+              <w:left w:type="dxa" w:w="100"/>
+              <w:bottom w:type="dxa" w:w="60"/>
+              <w:right w:type="dxa" w:w="100"/>
+            </w:tcMar>
+          </w:tcPr>
+          <w:p>
+            <w:pPr>
+              <w:spacing w:after="0"/>
+            </w:pPr>
+            <w:r>
+              <w:rPr>
+                <w:rFonts w:ascii="Calibri" w:cs="Calibri" w:eastAsia="Calibri" w:hAnsi="Calibri"/>
+                <w:b/>
+                <w:bCs/>
+                <w:color w:val="FFFFFF"/>
+                <w:sz w:val="19"/>
+                <w:szCs w:val="19"/>
+              </w:rPr>
+              <w:t xml:space="preserve">Seção</w:t>
+            </w:r>
+          </w:p>
+        </w:tc>
+        <w:tc>
+          <w:tcPr>
+            <w:tcW w:type="dxa" w:w="7221"/>
+            <w:tcBorders>
+              <w:top w:val="single" w:color="BFBFBF" w:sz="4"/>
+              <w:left w:val="single" w:color="BFBFBF" w:sz="4"/>
+              <w:bottom w:val="single" w:color="BFBFBF" w:sz="4"/>
+              <w:right w:val="single" w:color="BFBFBF" w:sz="4"/>
+            </w:tcBorders>
+            <w:shd w:fill="1F4E79" w:val="clear"/>
+            <w:tcMar>
+              <w:top w:type="dxa" w:w="60"/>
+              <w:left w:type="dxa" w:w="100"/>
+              <w:bottom w:type="dxa" w:w="60"/>
+              <w:right w:type="dxa" w:w="100"/>
+            </w:tcMar>
+          </w:tcPr>
+          <w:p>
+            <w:pPr>
+              <w:spacing w:after="0"/>
+            </w:pPr>
+            <w:r>
+              <w:rPr>
+                <w:rFonts w:ascii="Calibri" w:cs="Calibri" w:eastAsia="Calibri" w:hAnsi="Calibri"/>
+                <w:b/>
+                <w:bCs/>
+                <w:color w:val="FFFFFF"/>
+                <w:sz w:val="19"/>
+                <w:szCs w:val="19"/>
+              </w:rPr>
+              <w:t xml:space="preserve">Conteúdo</w:t>
+            </w:r>
+          </w:p>
+        </w:tc>
+      </w:tr>
+      <w:tr>
+        <w:tc>
+          <w:tcPr>
+            <w:tcW w:type="dxa" w:w="1805"/>
+            <w:tcBorders>
+              <w:top w:val="single" w:color="BFBFBF" w:sz="4"/>
+              <w:left w:val="single" w:color="BFBFBF" w:sz="4"/>
+              <w:bottom w:val="single" w:color="BFBFBF" w:sz="4"/>
+              <w:right w:val="single" w:color="BFBFBF" w:sz="4"/>
+            </w:tcBorders>
+            <w:tcMar>
+              <w:top w:type="dxa" w:w="60"/>
+              <w:left w:type="dxa" w:w="100"/>
+              <w:bottom w:type="dxa" w:w="60"/>
+              <w:right w:type="dxa" w:w="100"/>
+            </w:tcMar>
+          </w:tcPr>
+          <w:p>
+            <w:pPr>
+              <w:spacing w:after="0"/>
+            </w:pPr>
+            <w:r>
+              <w:rPr>
+                <w:rFonts w:ascii="Calibri" w:cs="Calibri" w:eastAsia="Calibri" w:hAnsi="Calibri"/>
+                <w:b w:val="false"/>
+                <w:bCs w:val="false"/>
+                <w:color w:val="000000"/>
+                <w:sz w:val="19"/>
+                <w:szCs w:val="19"/>
+              </w:rPr>
+              <w:t xml:space="preserve">base</w:t>
+            </w:r>
+          </w:p>
+        </w:tc>
+        <w:tc>
+          <w:tcPr>
+            <w:tcW w:type="dxa" w:w="7221"/>
+            <w:tcBorders>
+              <w:top w:val="single" w:color="BFBFBF" w:sz="4"/>
+              <w:left w:val="single" w:color="BFBFBF" w:sz="4"/>
+              <w:bottom w:val="single" w:color="BFBFBF" w:sz="4"/>
+              <w:right w:val="single" w:color="BFBFBF" w:sz="4"/>
+            </w:tcBorders>
+            <w:tcMar>
+              <w:top w:type="dxa" w:w="60"/>
+              <w:left w:type="dxa" w:w="100"/>
+              <w:bottom w:type="dxa" w:w="60"/>
+              <w:right w:type="dxa" w:w="100"/>
+            </w:tcMar>
+          </w:tcPr>
+          <w:p>
+            <w:pPr>
+              <w:spacing w:after="0"/>
+            </w:pPr>
+            <w:r>
+              <w:rPr>
+                <w:rFonts w:ascii="Calibri" w:cs="Calibri" w:eastAsia="Calibri" w:hAnsi="Calibri"/>
+                <w:b w:val="false"/>
+                <w:bCs w:val="false"/>
+                <w:color w:val="000000"/>
+                <w:sz w:val="19"/>
+                <w:szCs w:val="19"/>
+              </w:rPr>
+              <w:t xml:space="preserve">Diretório base do modelo; os caminhos relativos são ancorados nele</w:t>
+            </w:r>
+          </w:p>
+        </w:tc>
+      </w:tr>
+      <w:tr>
+        <w:tc>
+          <w:tcPr>
+            <w:tcW w:type="dxa" w:w="1805"/>
+            <w:tcBorders>
+              <w:top w:val="single" w:color="BFBFBF" w:sz="4"/>
+              <w:left w:val="single" w:color="BFBFBF" w:sz="4"/>
+              <w:bottom w:val="single" w:color="BFBFBF" w:sz="4"/>
+              <w:right w:val="single" w:color="BFBFBF" w:sz="4"/>
+            </w:tcBorders>
+            <w:tcMar>
+              <w:top w:type="dxa" w:w="60"/>
+              <w:left w:type="dxa" w:w="100"/>
+              <w:bottom w:type="dxa" w:w="60"/>
+              <w:right w:type="dxa" w:w="100"/>
+            </w:tcMar>
+          </w:tcPr>
+          <w:p>
+            <w:pPr>
+              <w:spacing w:after="0"/>
+            </w:pPr>
+            <w:r>
+              <w:rPr>
+                <w:rFonts w:ascii="Calibri" w:cs="Calibri" w:eastAsia="Calibri" w:hAnsi="Calibri"/>
+                <w:b w:val="false"/>
+                <w:bCs w:val="false"/>
+                <w:color w:val="000000"/>
+                <w:sz w:val="19"/>
+                <w:szCs w:val="19"/>
+              </w:rPr>
+              <w:t xml:space="preserve">caminhos</w:t>
+            </w:r>
+          </w:p>
+        </w:tc>
+        <w:tc>
+          <w:tcPr>
+            <w:tcW w:type="dxa" w:w="7221"/>
+            <w:tcBorders>
+              <w:top w:val="single" w:color="BFBFBF" w:sz="4"/>
+              <w:left w:val="single" w:color="BFBFBF" w:sz="4"/>
+              <w:bottom w:val="single" w:color="BFBFBF" w:sz="4"/>
+              <w:right w:val="single" w:color="BFBFBF" w:sz="4"/>
+            </w:tcBorders>
+            <w:tcMar>
+              <w:top w:type="dxa" w:w="60"/>
+              <w:left w:type="dxa" w:w="100"/>
+              <w:bottom w:type="dxa" w:w="60"/>
+              <w:right w:type="dxa" w:w="100"/>
+            </w:tcMar>
+          </w:tcPr>
+          <w:p>
+            <w:pPr>
+              <w:spacing w:after="0"/>
+            </w:pPr>
+            <w:r>
+              <w:rPr>
+                <w:rFonts w:ascii="Calibri" w:cs="Calibri" w:eastAsia="Calibri" w:hAnsi="Calibri"/>
+                <w:b w:val="false"/>
+                <w:bCs w:val="false"/>
+                <w:color w:val="000000"/>
+                <w:sz w:val="19"/>
+                <w:szCs w:val="19"/>
+              </w:rPr>
+              <w:t xml:space="preserve">Onde estão os dados de entrada: imerg_dir, imerg_subpastas ({ano}/{mes}), imerg_padrao ({data}), mapa_vegetacao ({ano_veg}), topografia, log</w:t>
+            </w:r>
+          </w:p>
+        </w:tc>
+      </w:tr>
+      <w:tr>
+        <w:tc>
+          <w:tcPr>
+            <w:tcW w:type="dxa" w:w="1805"/>
+            <w:tcBorders>
+              <w:top w:val="single" w:color="BFBFBF" w:sz="4"/>
+              <w:left w:val="single" w:color="BFBFBF" w:sz="4"/>
+              <w:bottom w:val="single" w:color="BFBFBF" w:sz="4"/>
+              <w:right w:val="single" w:color="BFBFBF" w:sz="4"/>
+            </w:tcBorders>
+            <w:tcMar>
+              <w:top w:type="dxa" w:w="60"/>
+              <w:left w:type="dxa" w:w="100"/>
+              <w:bottom w:type="dxa" w:w="60"/>
+              <w:right w:type="dxa" w:w="100"/>
+            </w:tcMar>
+          </w:tcPr>
+          <w:p>
+            <w:pPr>
+              <w:spacing w:after="0"/>
+            </w:pPr>
+            <w:r>
+              <w:rPr>
+                <w:rFonts w:ascii="Calibri" w:cs="Calibri" w:eastAsia="Calibri" w:hAnsi="Calibri"/>
+                <w:b w:val="false"/>
+                <w:bCs w:val="false"/>
+                <w:color w:val="000000"/>
+                <w:sz w:val="19"/>
+                <w:szCs w:val="19"/>
+              </w:rPr>
+              <w:t xml:space="preserve">fontes</w:t>
+            </w:r>
+          </w:p>
+        </w:tc>
+        <w:tc>
+          <w:tcPr>
+            <w:tcW w:type="dxa" w:w="7221"/>
+            <w:tcBorders>
+              <w:top w:val="single" w:color="BFBFBF" w:sz="4"/>
+              <w:left w:val="single" w:color="BFBFBF" w:sz="4"/>
+              <w:bottom w:val="single" w:color="BFBFBF" w:sz="4"/>
+              <w:right w:val="single" w:color="BFBFBF" w:sz="4"/>
+            </w:tcBorders>
+            <w:tcMar>
+              <w:top w:type="dxa" w:w="60"/>
+              <w:left w:type="dxa" w:w="100"/>
+              <w:bottom w:type="dxa" w:w="60"/>
+              <w:right w:type="dxa" w:w="100"/>
+            </w:tcMar>
+          </w:tcPr>
+          <w:p>
+            <w:pPr>
+              <w:spacing w:after="0"/>
+            </w:pPr>
+            <w:r>
+              <w:rPr>
+                <w:rFonts w:ascii="Calibri" w:cs="Calibri" w:eastAsia="Calibri" w:hAnsi="Calibri"/>
+                <w:b w:val="false"/>
+                <w:bCs w:val="false"/>
+                <w:color w:val="000000"/>
+                <w:sz w:val="19"/>
+                <w:szCs w:val="19"/>
+              </w:rPr>
+              <w:t xml:space="preserve">Mesmas chaves do --config-fontes: ajusta ou acrescenta fontes (gfs, eta, besm, ...)</w:t>
+            </w:r>
+          </w:p>
+        </w:tc>
+      </w:tr>
+      <w:tr>
+        <w:tc>
+          <w:tcPr>
+            <w:tcW w:type="dxa" w:w="1805"/>
+            <w:tcBorders>
+              <w:top w:val="single" w:color="BFBFBF" w:sz="4"/>
+              <w:left w:val="single" w:color="BFBFBF" w:sz="4"/>
+              <w:bottom w:val="single" w:color="BFBFBF" w:sz="4"/>
+              <w:right w:val="single" w:color="BFBFBF" w:sz="4"/>
+            </w:tcBorders>
+            <w:tcMar>
+              <w:top w:type="dxa" w:w="60"/>
+              <w:left w:type="dxa" w:w="100"/>
+              <w:bottom w:type="dxa" w:w="60"/>
+              <w:right w:type="dxa" w:w="100"/>
+            </w:tcMar>
+          </w:tcPr>
+          <w:p>
+            <w:pPr>
+              <w:spacing w:after="0"/>
+            </w:pPr>
+            <w:r>
+              <w:rPr>
+                <w:rFonts w:ascii="Calibri" w:cs="Calibri" w:eastAsia="Calibri" w:hAnsi="Calibri"/>
+                <w:b w:val="false"/>
+                <w:bCs w:val="false"/>
+                <w:color w:val="000000"/>
+                <w:sz w:val="19"/>
+                <w:szCs w:val="19"/>
+              </w:rPr>
+              <w:t xml:space="preserve">execucao</w:t>
+            </w:r>
+          </w:p>
+        </w:tc>
+        <w:tc>
+          <w:tcPr>
+            <w:tcW w:type="dxa" w:w="7221"/>
+            <w:tcBorders>
+              <w:top w:val="single" w:color="BFBFBF" w:sz="4"/>
+              <w:left w:val="single" w:color="BFBFBF" w:sz="4"/>
+              <w:bottom w:val="single" w:color="BFBFBF" w:sz="4"/>
+              <w:right w:val="single" w:color="BFBFBF" w:sz="4"/>
+            </w:tcBorders>
+            <w:tcMar>
+              <w:top w:type="dxa" w:w="60"/>
+              <w:left w:type="dxa" w:w="100"/>
+              <w:bottom w:type="dxa" w:w="60"/>
+              <w:right w:type="dxa" w:w="100"/>
+            </w:tcMar>
+          </w:tcPr>
+          <w:p>
+            <w:pPr>
+              <w:spacing w:after="0"/>
+            </w:pPr>
+            <w:r>
+              <w:rPr>
+                <w:rFonts w:ascii="Calibri" w:cs="Calibri" w:eastAsia="Calibri" w:hAnsi="Calibri"/>
+                <w:b w:val="false"/>
+                <w:bCs w:val="false"/>
+                <w:color w:val="000000"/>
+                <w:sz w:val="19"/>
+                <w:szCs w:val="19"/>
+              </w:rPr>
+              <w:t xml:space="preserve">Padrões da linha de comando: fonte, horizontes ou de/ate/passo, data_final, rb_max, produto, jobs, fallback_gfs, sem_tif, fogograma</w:t>
+            </w:r>
+          </w:p>
+        </w:tc>
+      </w:tr>
+    </w:tbl>
+    <w:p>
+      <w:pPr>
+        <w:spacing w:after="160" w:line="276"/>
+        <w:jc w:val="both"/>
+      </w:pPr>
+      <w:r>
+        <w:rPr>
+          <w:rFonts w:ascii="Calibri" w:cs="Calibri" w:eastAsia="Calibri" w:hAnsi="Calibri"/>
+          <w:b w:val="false"/>
+          <w:bCs w:val="false"/>
+          <w:i w:val="false"/>
+          <w:iCs w:val="false"/>
+          <w:color w:val="000000"/>
+          <w:sz w:val="22"/>
+          <w:szCs w:val="22"/>
+        </w:rPr>
+        <w:t xml:space="preserve"/>
+      </w:r>
+    </w:p>
+    <w:p>
+      <w:pPr>
+        <w:shd w:fill="F2F2F2" w:val="clear"/>
+        <w:spacing w:after="0"/>
+      </w:pPr>
+      <w:r>
+        <w:rPr>
+          <w:rFonts w:ascii="Consolas" w:cs="Consolas" w:eastAsia="Consolas" w:hAnsi="Consolas"/>
+          <w:sz w:val="19"/>
+          <w:szCs w:val="19"/>
+        </w:rPr>
+        <w:t xml:space="preserve">base: /home/queimadas/INPE_FireRiskModel</w:t>
+      </w:r>
+    </w:p>
+    <w:p>
+      <w:pPr>
+        <w:shd w:fill="F2F2F2" w:val="clear"/>
+        <w:spacing w:after="0"/>
+      </w:pPr>
+      <w:r>
+        <w:rPr>
+          <w:rFonts w:ascii="Consolas" w:cs="Consolas" w:eastAsia="Consolas" w:hAnsi="Consolas"/>
+          <w:sz w:val="19"/>
+          <w:szCs w:val="19"/>
+        </w:rPr>
+        <w:t xml:space="preserve">caminhos:</w:t>
+      </w:r>
+    </w:p>
+    <w:p>
+      <w:pPr>
+        <w:shd w:fill="F2F2F2" w:val="clear"/>
+        <w:spacing w:after="0"/>
+      </w:pPr>
+      <w:r>
+        <w:rPr>
+          <w:rFonts w:ascii="Consolas" w:cs="Consolas" w:eastAsia="Consolas" w:hAnsi="Consolas"/>
+          <w:sz w:val="19"/>
+          <w:szCs w:val="19"/>
+        </w:rPr>
+        <w:t xml:space="preserve">  imerg_dir: data/output/2.2/Precipitation-2_2</w:t>
+      </w:r>
+    </w:p>
+    <w:p>
+      <w:pPr>
+        <w:shd w:fill="F2F2F2" w:val="clear"/>
+        <w:spacing w:after="0"/>
+      </w:pPr>
+      <w:r>
+        <w:rPr>
+          <w:rFonts w:ascii="Consolas" w:cs="Consolas" w:eastAsia="Consolas" w:hAnsi="Consolas"/>
+          <w:sz w:val="19"/>
+          <w:szCs w:val="19"/>
+        </w:rPr>
+        <w:t xml:space="preserve">  imerg_padrao: "INPE_FireRiskModel_2.2_Precipitation_{data}.nc"</w:t>
+      </w:r>
+    </w:p>
+    <w:p>
+      <w:pPr>
+        <w:shd w:fill="F2F2F2" w:val="clear"/>
+        <w:spacing w:after="0"/>
+      </w:pPr>
+      <w:r>
+        <w:rPr>
+          <w:rFonts w:ascii="Consolas" w:cs="Consolas" w:eastAsia="Consolas" w:hAnsi="Consolas"/>
+          <w:sz w:val="19"/>
+          <w:szCs w:val="19"/>
+        </w:rPr>
+        <w:t xml:space="preserve">fontes:</w:t>
+      </w:r>
+    </w:p>
+    <w:p>
+      <w:pPr>
+        <w:shd w:fill="F2F2F2" w:val="clear"/>
+        <w:spacing w:after="0"/>
+      </w:pPr>
+      <w:r>
+        <w:rPr>
+          <w:rFonts w:ascii="Consolas" w:cs="Consolas" w:eastAsia="Consolas" w:hAnsi="Consolas"/>
+          <w:sz w:val="19"/>
+          <w:szCs w:val="19"/>
+        </w:rPr>
+        <w:t xml:space="preserve">  besm: { horizonte_max_dias: 396 }</w:t>
+      </w:r>
+    </w:p>
+    <w:p>
+      <w:pPr>
+        <w:shd w:fill="F2F2F2" w:val="clear"/>
+        <w:spacing w:after="0"/>
+      </w:pPr>
+      <w:r>
+        <w:rPr>
+          <w:rFonts w:ascii="Consolas" w:cs="Consolas" w:eastAsia="Consolas" w:hAnsi="Consolas"/>
+          <w:sz w:val="19"/>
+          <w:szCs w:val="19"/>
+        </w:rPr>
+        <w:t xml:space="preserve">execucao:</w:t>
+      </w:r>
+    </w:p>
+    <w:p>
+      <w:pPr>
+        <w:shd w:fill="F2F2F2" w:val="clear"/>
+        <w:spacing w:after="0"/>
+      </w:pPr>
+      <w:r>
+        <w:rPr>
+          <w:rFonts w:ascii="Consolas" w:cs="Consolas" w:eastAsia="Consolas" w:hAnsi="Consolas"/>
+          <w:sz w:val="19"/>
+          <w:szCs w:val="19"/>
+        </w:rPr>
+        <w:t xml:space="preserve">  fonte: besm</w:t>
+      </w:r>
+    </w:p>
+    <w:p>
+      <w:pPr>
+        <w:shd w:fill="F2F2F2" w:val="clear"/>
+        <w:spacing w:after="0"/>
+      </w:pPr>
+      <w:r>
+        <w:rPr>
+          <w:rFonts w:ascii="Consolas" w:cs="Consolas" w:eastAsia="Consolas" w:hAnsi="Consolas"/>
+          <w:sz w:val="19"/>
+          <w:szCs w:val="19"/>
+        </w:rPr>
+        <w:t xml:space="preserve">  de: 1m</w:t>
+      </w:r>
+    </w:p>
+    <w:p>
+      <w:pPr>
+        <w:shd w:fill="F2F2F2" w:val="clear"/>
+        <w:spacing w:after="0"/>
+      </w:pPr>
+      <w:r>
+        <w:rPr>
+          <w:rFonts w:ascii="Consolas" w:cs="Consolas" w:eastAsia="Consolas" w:hAnsi="Consolas"/>
+          <w:sz w:val="19"/>
+          <w:szCs w:val="19"/>
+        </w:rPr>
+        <w:t xml:space="preserve">  ate: 13m</w:t>
+      </w:r>
+    </w:p>
+    <w:p>
+      <w:pPr>
+        <w:shd w:fill="F2F2F2" w:val="clear"/>
+        <w:spacing w:after="0"/>
+      </w:pPr>
+      <w:r>
+        <w:rPr>
+          <w:rFonts w:ascii="Consolas" w:cs="Consolas" w:eastAsia="Consolas" w:hAnsi="Consolas"/>
+          <w:sz w:val="19"/>
+          <w:szCs w:val="19"/>
+        </w:rPr>
+        <w:t xml:space="preserve">  passo: 1m</w:t>
+      </w:r>
+    </w:p>
+    <w:p>
+      <w:pPr>
+        <w:shd w:fill="F2F2F2" w:val="clear"/>
+        <w:spacing w:after="160"/>
+      </w:pPr>
+      <w:r>
+        <w:rPr>
+          <w:rFonts w:ascii="Consolas" w:cs="Consolas" w:eastAsia="Consolas" w:hAnsi="Consolas"/>
+          <w:sz w:val="19"/>
+          <w:szCs w:val="19"/>
+        </w:rPr>
+        <w:t xml:space="preserve">  produto: RF_PREV_BESM</w:t>
+      </w:r>
+    </w:p>
+    <w:p>
+      <w:pPr>
+        <w:shd w:fill="F2F2F2" w:val="clear"/>
+        <w:spacing w:after="0"/>
+      </w:pPr>
+      <w:r>
+        <w:rPr>
+          <w:rFonts w:ascii="Consolas" w:cs="Consolas" w:eastAsia="Consolas" w:hAnsi="Consolas"/>
+          <w:sz w:val="19"/>
+          <w:szCs w:val="19"/>
+        </w:rPr>
+        <w:t xml:space="preserve">python3 rf_previsto.py --config config.yaml               # tudo do arquivo</w:t>
+      </w:r>
+    </w:p>
+    <w:p>
+      <w:pPr>
+        <w:shd w:fill="F2F2F2" w:val="clear"/>
+        <w:spacing w:after="160"/>
+      </w:pPr>
+      <w:r>
+        <w:rPr>
+          <w:rFonts w:ascii="Consolas" w:cs="Consolas" w:eastAsia="Consolas" w:hAnsi="Consolas"/>
+          <w:sz w:val="19"/>
+          <w:szCs w:val="19"/>
+        </w:rPr>
+        <w:t xml:space="preserve">python3 rf_previsto.py --config config.yaml --horizontes 6m   # CLI prevalece</w:t>
+      </w:r>
+    </w:p>
+    <w:p>
+      <w:pPr>
+        <w:spacing w:after="160" w:line="276"/>
+        <w:jc w:val="both"/>
+      </w:pPr>
+      <w:r>
+        <w:rPr>
+          <w:rFonts w:ascii="Calibri" w:cs="Calibri" w:eastAsia="Calibri" w:hAnsi="Calibri"/>
+          <w:b w:val="false"/>
+          <w:bCs w:val="false"/>
+          <w:i w:val="false"/>
+          <w:iCs w:val="false"/>
+          <w:color w:val="000000"/>
+          <w:sz w:val="22"/>
+          <w:szCs w:val="22"/>
+        </w:rPr>
+        <w:t xml:space="preserve">O arquivo config_exemplo.yaml traz o modelo completo comentado; as seções são validadas na leitura (chave desconhecida gera erro com a lista das válidas). Requer PyYAML (pip install pyyaml) — arquivos .json funcionam sem ele.</w:t>
+      </w:r>
+    </w:p>
+    <w:p>
+      <w:pPr>
+        <w:pStyle w:val="Heading1"/>
+        <w:spacing w:after="200" w:before="360"/>
+      </w:pPr>
+      <w:r>
+        <w:rPr>
+          <w:rFonts w:ascii="Calibri" w:cs="Calibri" w:eastAsia="Calibri" w:hAnsi="Calibri"/>
+          <w:b/>
+          <w:bCs/>
+          <w:color w:val="1F4E79"/>
+          <w:sz w:val="30"/>
+          <w:szCs w:val="30"/>
+        </w:rPr>
+        <w:t xml:space="preserve">6. Saídas</w:t>
+      </w:r>
+    </w:p>
+    <w:p>
+      <w:pPr>
+        <w:pStyle w:val="Heading2"/>
+        <w:spacing w:after="160" w:before="280"/>
+      </w:pPr>
+      <w:r>
+        <w:rPr>
+          <w:rFonts w:ascii="Calibri" w:cs="Calibri" w:eastAsia="Calibri" w:hAnsi="Calibri"/>
+          <w:b/>
+          <w:bCs/>
+          <w:color w:val="1F4E79"/>
+          <w:sz w:val="25"/>
+          <w:szCs w:val="25"/>
+        </w:rPr>
+        <w:t xml:space="preserve">6.1 Produto diário (1 a 5 dias)</w:t>
       </w:r>
     </w:p>
     <w:tbl>
@@ -2291,7 +5490,7 @@
           <w:sz w:val="25"/>
           <w:szCs w:val="25"/>
         </w:rPr>
-        <w:t xml:space="preserve">5.2 Produto semanal (1 a 2 semanas)</w:t>
+        <w:t xml:space="preserve">6.2 Produto semanal (1 a 2 semanas)</w:t>
       </w:r>
     </w:p>
     <w:tbl>
@@ -2553,7 +5752,7 @@
           <w:sz w:val="25"/>
           <w:szCs w:val="25"/>
         </w:rPr>
-        <w:t xml:space="preserve">5.3 Formato dos arquivos</w:t>
+        <w:t xml:space="preserve">6.3 Formato dos arquivos</w:t>
       </w:r>
     </w:p>
     <w:p>
@@ -2608,7 +5807,7 @@
           <w:sz w:val="30"/>
           <w:szCs w:val="30"/>
         </w:rPr>
-        <w:t xml:space="preserve">6. Logs e monitoramento</w:t>
+        <w:t xml:space="preserve">7. Logs e monitoramento</w:t>
       </w:r>
     </w:p>
     <w:tbl>
@@ -2957,7 +6156,7 @@
           <w:sz w:val="30"/>
           <w:szCs w:val="30"/>
         </w:rPr>
-        <w:t xml:space="preserve">7. Solução de problemas</w:t>
+        <w:t xml:space="preserve">8. Solução de problemas</w:t>
       </w:r>
     </w:p>
     <w:tbl>
@@ -3825,7 +7024,7 @@
           <w:sz w:val="30"/>
           <w:szCs w:val="30"/>
         </w:rPr>
-        <w:t xml:space="preserve">8. Teste de validação</w:t>
+        <w:t xml:space="preserve">9. Testes de validação</w:t>
       </w:r>
     </w:p>
     <w:p>
@@ -3850,7 +7049,7 @@
     <w:p>
       <w:pPr>
         <w:shd w:fill="F2F2F2" w:val="clear"/>
-        <w:spacing w:after="160"/>
+        <w:spacing w:after="0"/>
       </w:pPr>
       <w:r>
         <w:rPr>
@@ -3858,7 +7057,35 @@
           <w:sz w:val="19"/>
           <w:szCs w:val="19"/>
         </w:rPr>
-        <w:t xml:space="preserve">python3 teste_rf.py</w:t>
+        <w:t xml:space="preserve">python3 teste_rf.py            # valida o núcleo do cálculo (rf_core)</w:t>
+      </w:r>
+    </w:p>
+    <w:p>
+      <w:pPr>
+        <w:shd w:fill="F2F2F2" w:val="clear"/>
+        <w:spacing w:after="0"/>
+      </w:pPr>
+      <w:r>
+        <w:rPr>
+          <w:rFonts w:ascii="Consolas" w:cs="Consolas" w:eastAsia="Consolas" w:hAnsi="Consolas"/>
+          <w:sz w:val="19"/>
+          <w:szCs w:val="19"/>
+        </w:rPr>
+        <w:t xml:space="preserve">python3 teste_rf_previsto.py   # valida o script genérico de ponta a ponta</w:t>
+      </w:r>
+    </w:p>
+    <w:p>
+      <w:pPr>
+        <w:shd w:fill="F2F2F2" w:val="clear"/>
+        <w:spacing w:after="160"/>
+      </w:pPr>
+      <w:r>
+        <w:rPr>
+          <w:rFonts w:ascii="Consolas" w:cs="Consolas" w:eastAsia="Consolas" w:hAnsi="Consolas"/>
+          <w:sz w:val="19"/>
+          <w:szCs w:val="19"/>
+        </w:rPr>
+        <w:t xml:space="preserve">python3 teste_rf_multifonte.py # valida o modo multifonte (Eta 13m, BESM 12h, JSON)</w:t>
       </w:r>
     </w:p>
     <w:p>
@@ -3877,7 +7104,7 @@
           <w:sz w:val="22"/>
           <w:szCs w:val="22"/>
         </w:rPr>
-        <w:t xml:space="preserve">O teste cria dados sintéticos em /tmp/teste_rf, executa o cálculo completo e compara com uma implementação de referência fiel ao NCL. A saída esperada termina com "TODOS OS TESTES PASSARAM".</w:t>
+        <w:t xml:space="preserve">O primeiro teste cria dados sintéticos em /tmp/teste_rf, executa o cálculo completo e compara com uma implementação de referência fiel ao NCL; a saída esperada termina com "TODOS OS TESTES PASSARAM". O segundo monta uma árvore com a estrutura de diretórios da produção em /tmp/teste_generico e executa o rf_previsto.py real em cinco cenários (lista, intervalo, fallback do GFS, horizonte absoluto e falha controlada).</w:t>
       </w:r>
     </w:p>
     <w:p>
@@ -3894,7 +7121,7 @@
           <w:sz w:val="30"/>
           <w:szCs w:val="30"/>
         </w:rPr>
-        <w:t xml:space="preserve">9. Segurança</w:t>
+        <w:t xml:space="preserve">10. Segurança</w:t>
       </w:r>
     </w:p>
     <w:p>
@@ -3930,7 +7157,7 @@
           <w:sz w:val="30"/>
           <w:szCs w:val="30"/>
         </w:rPr>
-        <w:t xml:space="preserve">10. Suporte</w:t>
+        <w:t xml:space="preserve">11. Suporte</w:t>
       </w:r>
     </w:p>
     <w:p>

</xml_diff>

<commit_message>
Atualiza para v1.3: generico, multifonte, config YAML e prepara_gfs
- rf_previsto.py: qualquer horizonte (h/d/meses) e fonte (--fonte gfs|eta|besm)
- rf_fontes.py: camada de fontes, layouts por_tempo/serie, BESM T062 real
- rf_config.py + config_exemplo.yaml: entradas configuraveis via YAML (--config)
- prepara_gfs.py: download do GFS pos-SCN 25-81 (fast download .idx na AWS/
  NOMADS ou grib filter); pygrib no requirements
- rf_core.py: calcula_risco_fogo_dados (arrays) para o modo multifonte
- 4 suites de teste novas; manual v1.4 e instrucoes de git atualizadas
</commit_message>
<xml_diff>
--- a/docs/manual_usuario.docx
+++ b/docs/manual_usuario.docx
@@ -46,7 +46,7 @@
           <w:sz w:val="22"/>
           <w:szCs w:val="22"/>
         </w:rPr>
-        <w:t xml:space="preserve">Versão 1.3 · 4 de agosto de 2026</w:t>
+        <w:t xml:space="preserve">Versão 1.4 · 5 de agosto de 2026</w:t>
       </w:r>
     </w:p>
     <w:p>
@@ -1133,7 +1133,7 @@
           <w:sz w:val="19"/>
           <w:szCs w:val="19"/>
         </w:rPr>
-        <w:t xml:space="preserve">teste_rf.py</w:t>
+        <w:t xml:space="preserve">prepara_gfs.py</w:t>
       </w:r>
     </w:p>
     <w:p>
@@ -1147,13 +1147,13 @@
           <w:sz w:val="19"/>
           <w:szCs w:val="19"/>
         </w:rPr>
-        <w:t xml:space="preserve">teste_rf_previsto.py</w:t>
+        <w:t xml:space="preserve">teste_rf.py</w:t>
       </w:r>
     </w:p>
     <w:p>
       <w:pPr>
         <w:shd w:fill="F2F2F2" w:val="clear"/>
-        <w:spacing w:after="160"/>
+        <w:spacing w:after="0"/>
       </w:pPr>
       <w:r>
         <w:rPr>
@@ -1161,7 +1161,35 @@
           <w:sz w:val="19"/>
           <w:szCs w:val="19"/>
         </w:rPr>
+        <w:t xml:space="preserve">teste_rf_previsto.py</w:t>
+      </w:r>
+    </w:p>
+    <w:p>
+      <w:pPr>
+        <w:shd w:fill="F2F2F2" w:val="clear"/>
+        <w:spacing w:after="0"/>
+      </w:pPr>
+      <w:r>
+        <w:rPr>
+          <w:rFonts w:ascii="Consolas" w:cs="Consolas" w:eastAsia="Consolas" w:hAnsi="Consolas"/>
+          <w:sz w:val="19"/>
+          <w:szCs w:val="19"/>
+        </w:rPr>
         <w:t xml:space="preserve">teste_rf_multifonte.py</w:t>
+      </w:r>
+    </w:p>
+    <w:p>
+      <w:pPr>
+        <w:shd w:fill="F2F2F2" w:val="clear"/>
+        <w:spacing w:after="160"/>
+      </w:pPr>
+      <w:r>
+        <w:rPr>
+          <w:rFonts w:ascii="Consolas" w:cs="Consolas" w:eastAsia="Consolas" w:hAnsi="Consolas"/>
+          <w:sz w:val="19"/>
+          <w:szCs w:val="19"/>
+        </w:rPr>
+        <w:t xml:space="preserve">teste_prepara_gfs.py</w:t>
       </w:r>
     </w:p>
     <w:p>
@@ -5007,7 +5035,510 @@
           <w:sz w:val="30"/>
           <w:szCs w:val="30"/>
         </w:rPr>
-        <w:t xml:space="preserve">6. Saídas</w:t>
+        <w:t xml:space="preserve">6. Preparo dos dados de entrada do GFS (prepara_gfs.py)</w:t>
+      </w:r>
+    </w:p>
+    <w:p>
+      <w:pPr>
+        <w:spacing w:after="160" w:line="276"/>
+        <w:jc w:val="both"/>
+      </w:pPr>
+      <w:r>
+        <w:rPr>
+          <w:rFonts w:ascii="Calibri" w:cs="Calibri" w:eastAsia="Calibri" w:hAnsi="Calibri"/>
+          <w:b w:val="false"/>
+          <w:bCs w:val="false"/>
+          <w:i w:val="false"/>
+          <w:iCs w:val="false"/>
+          <w:color w:val="000000"/>
+          <w:sz w:val="22"/>
+          <w:szCs w:val="22"/>
+        </w:rPr>
+        <w:t xml:space="preserve">O prepara_gfs.py baixa a previsão do GFS 0,25° da NOAA e grava os arquivos GFS.PREV.PREC.* (prec em mm/dia) e GFS.PREV.TEMP2m.RH2m.* (T2m em K, UR2m em %) na convenção da seção 2.2, prontos para o rf_previsto.py. Requer o pygrib (python3 -m pip install pygrib).</w:t>
+      </w:r>
+    </w:p>
+    <w:p>
+      <w:pPr>
+        <w:spacing w:after="160" w:line="276"/>
+        <w:jc w:val="both"/>
+      </w:pPr>
+      <w:r>
+        <w:rPr>
+          <w:rFonts w:ascii="Calibri" w:cs="Calibri" w:eastAsia="Calibri" w:hAnsi="Calibri"/>
+          <w:b/>
+          <w:bCs/>
+          <w:i w:val="false"/>
+          <w:iCs w:val="false"/>
+          <w:color w:val="000000"/>
+          <w:sz w:val="22"/>
+          <w:szCs w:val="22"/>
+        </w:rPr>
+        <w:t xml:space="preserve">Importante: </w:t>
+      </w:r>
+      <w:r>
+        <w:rPr>
+          <w:rFonts w:ascii="Calibri" w:cs="Calibri" w:eastAsia="Calibri" w:hAnsi="Calibri"/>
+          <w:b w:val="false"/>
+          <w:bCs w:val="false"/>
+          <w:i w:val="false"/>
+          <w:iCs w:val="false"/>
+          <w:color w:val="000000"/>
+          <w:sz w:val="22"/>
+          <w:szCs w:val="22"/>
+        </w:rPr>
+        <w:t xml:space="preserve">o serviço OpenDAP do NOMADS foi aposentado pela NOAA (Service Change Notice 25-81, efetivo em 23/02/2026). O script usa os serviços vigentes indicados no próprio aviso:</w:t>
+      </w:r>
+    </w:p>
+    <w:tbl>
+      <w:tblPr>
+        <w:tblW w:type="dxa" w:w="9026"/>
+        <w:tblBorders>
+          <w:top w:val="single" w:color="auto" w:sz="4"/>
+          <w:left w:val="single" w:color="auto" w:sz="4"/>
+          <w:bottom w:val="single" w:color="auto" w:sz="4"/>
+          <w:right w:val="single" w:color="auto" w:sz="4"/>
+          <w:insideH w:val="single" w:color="auto" w:sz="4"/>
+          <w:insideV w:val="single" w:color="auto" w:sz="4"/>
+        </w:tblBorders>
+      </w:tblPr>
+      <w:tblGrid>
+        <w:gridCol w:w="1986"/>
+        <w:gridCol w:w="7040"/>
+      </w:tblGrid>
+      <w:tr>
+        <w:trPr>
+          <w:tblHeader/>
+        </w:trPr>
+        <w:tc>
+          <w:tcPr>
+            <w:tcW w:type="dxa" w:w="1986"/>
+            <w:tcBorders>
+              <w:top w:val="single" w:color="BFBFBF" w:sz="4"/>
+              <w:left w:val="single" w:color="BFBFBF" w:sz="4"/>
+              <w:bottom w:val="single" w:color="BFBFBF" w:sz="4"/>
+              <w:right w:val="single" w:color="BFBFBF" w:sz="4"/>
+            </w:tcBorders>
+            <w:shd w:fill="1F4E79" w:val="clear"/>
+            <w:tcMar>
+              <w:top w:type="dxa" w:w="60"/>
+              <w:left w:type="dxa" w:w="100"/>
+              <w:bottom w:type="dxa" w:w="60"/>
+              <w:right w:type="dxa" w:w="100"/>
+            </w:tcMar>
+          </w:tcPr>
+          <w:p>
+            <w:pPr>
+              <w:spacing w:after="0"/>
+            </w:pPr>
+            <w:r>
+              <w:rPr>
+                <w:rFonts w:ascii="Calibri" w:cs="Calibri" w:eastAsia="Calibri" w:hAnsi="Calibri"/>
+                <w:b/>
+                <w:bCs/>
+                <w:color w:val="FFFFFF"/>
+                <w:sz w:val="19"/>
+                <w:szCs w:val="19"/>
+              </w:rPr>
+              <w:t xml:space="preserve">Método</w:t>
+            </w:r>
+          </w:p>
+        </w:tc>
+        <w:tc>
+          <w:tcPr>
+            <w:tcW w:type="dxa" w:w="7040"/>
+            <w:tcBorders>
+              <w:top w:val="single" w:color="BFBFBF" w:sz="4"/>
+              <w:left w:val="single" w:color="BFBFBF" w:sz="4"/>
+              <w:bottom w:val="single" w:color="BFBFBF" w:sz="4"/>
+              <w:right w:val="single" w:color="BFBFBF" w:sz="4"/>
+            </w:tcBorders>
+            <w:shd w:fill="1F4E79" w:val="clear"/>
+            <w:tcMar>
+              <w:top w:type="dxa" w:w="60"/>
+              <w:left w:type="dxa" w:w="100"/>
+              <w:bottom w:type="dxa" w:w="60"/>
+              <w:right w:type="dxa" w:w="100"/>
+            </w:tcMar>
+          </w:tcPr>
+          <w:p>
+            <w:pPr>
+              <w:spacing w:after="0"/>
+            </w:pPr>
+            <w:r>
+              <w:rPr>
+                <w:rFonts w:ascii="Calibri" w:cs="Calibri" w:eastAsia="Calibri" w:hAnsi="Calibri"/>
+                <w:b/>
+                <w:bCs/>
+                <w:color w:val="FFFFFF"/>
+                <w:sz w:val="19"/>
+                <w:szCs w:val="19"/>
+              </w:rPr>
+              <w:t xml:space="preserve">Descrição</w:t>
+            </w:r>
+          </w:p>
+        </w:tc>
+      </w:tr>
+      <w:tr>
+        <w:tc>
+          <w:tcPr>
+            <w:tcW w:type="dxa" w:w="1986"/>
+            <w:tcBorders>
+              <w:top w:val="single" w:color="BFBFBF" w:sz="4"/>
+              <w:left w:val="single" w:color="BFBFBF" w:sz="4"/>
+              <w:bottom w:val="single" w:color="BFBFBF" w:sz="4"/>
+              <w:right w:val="single" w:color="BFBFBF" w:sz="4"/>
+            </w:tcBorders>
+            <w:tcMar>
+              <w:top w:type="dxa" w:w="60"/>
+              <w:left w:type="dxa" w:w="100"/>
+              <w:bottom w:type="dxa" w:w="60"/>
+              <w:right w:type="dxa" w:w="100"/>
+            </w:tcMar>
+          </w:tcPr>
+          <w:p>
+            <w:pPr>
+              <w:spacing w:after="0"/>
+            </w:pPr>
+            <w:r>
+              <w:rPr>
+                <w:rFonts w:ascii="Calibri" w:cs="Calibri" w:eastAsia="Calibri" w:hAnsi="Calibri"/>
+                <w:b w:val="false"/>
+                <w:bCs w:val="false"/>
+                <w:color w:val="000000"/>
+                <w:sz w:val="19"/>
+                <w:szCs w:val="19"/>
+              </w:rPr>
+              <w:t xml:space="preserve">s3 (padrão)</w:t>
+            </w:r>
+          </w:p>
+        </w:tc>
+        <w:tc>
+          <w:tcPr>
+            <w:tcW w:type="dxa" w:w="7040"/>
+            <w:tcBorders>
+              <w:top w:val="single" w:color="BFBFBF" w:sz="4"/>
+              <w:left w:val="single" w:color="BFBFBF" w:sz="4"/>
+              <w:bottom w:val="single" w:color="BFBFBF" w:sz="4"/>
+              <w:right w:val="single" w:color="BFBFBF" w:sz="4"/>
+            </w:tcBorders>
+            <w:tcMar>
+              <w:top w:type="dxa" w:w="60"/>
+              <w:left w:type="dxa" w:w="100"/>
+              <w:bottom w:type="dxa" w:w="60"/>
+              <w:right w:type="dxa" w:w="100"/>
+            </w:tcMar>
+          </w:tcPr>
+          <w:p>
+            <w:pPr>
+              <w:spacing w:after="0"/>
+            </w:pPr>
+            <w:r>
+              <w:rPr>
+                <w:rFonts w:ascii="Calibri" w:cs="Calibri" w:eastAsia="Calibri" w:hAnsi="Calibri"/>
+                <w:b w:val="false"/>
+                <w:bCs w:val="false"/>
+                <w:color w:val="000000"/>
+                <w:sz w:val="19"/>
+                <w:szCs w:val="19"/>
+              </w:rPr>
+              <w:t xml:space="preserve">"Fast download method": lê o índice .idx de cada horário e baixa por byte-range só as 3 mensagens GRIB necessárias, no espelho oficial da AWS (noaa-gfs-bdp-pds), ~2 MB por horário</w:t>
+            </w:r>
+          </w:p>
+        </w:tc>
+      </w:tr>
+      <w:tr>
+        <w:tc>
+          <w:tcPr>
+            <w:tcW w:type="dxa" w:w="1986"/>
+            <w:tcBorders>
+              <w:top w:val="single" w:color="BFBFBF" w:sz="4"/>
+              <w:left w:val="single" w:color="BFBFBF" w:sz="4"/>
+              <w:bottom w:val="single" w:color="BFBFBF" w:sz="4"/>
+              <w:right w:val="single" w:color="BFBFBF" w:sz="4"/>
+            </w:tcBorders>
+            <w:tcMar>
+              <w:top w:type="dxa" w:w="60"/>
+              <w:left w:type="dxa" w:w="100"/>
+              <w:bottom w:type="dxa" w:w="60"/>
+              <w:right w:type="dxa" w:w="100"/>
+            </w:tcMar>
+          </w:tcPr>
+          <w:p>
+            <w:pPr>
+              <w:spacing w:after="0"/>
+            </w:pPr>
+            <w:r>
+              <w:rPr>
+                <w:rFonts w:ascii="Calibri" w:cs="Calibri" w:eastAsia="Calibri" w:hAnsi="Calibri"/>
+                <w:b w:val="false"/>
+                <w:bCs w:val="false"/>
+                <w:color w:val="000000"/>
+                <w:sz w:val="19"/>
+                <w:szCs w:val="19"/>
+              </w:rPr>
+              <w:t xml:space="preserve">nomads</w:t>
+            </w:r>
+          </w:p>
+        </w:tc>
+        <w:tc>
+          <w:tcPr>
+            <w:tcW w:type="dxa" w:w="7040"/>
+            <w:tcBorders>
+              <w:top w:val="single" w:color="BFBFBF" w:sz="4"/>
+              <w:left w:val="single" w:color="BFBFBF" w:sz="4"/>
+              <w:bottom w:val="single" w:color="BFBFBF" w:sz="4"/>
+              <w:right w:val="single" w:color="BFBFBF" w:sz="4"/>
+            </w:tcBorders>
+            <w:tcMar>
+              <w:top w:type="dxa" w:w="60"/>
+              <w:left w:type="dxa" w:w="100"/>
+              <w:bottom w:type="dxa" w:w="60"/>
+              <w:right w:type="dxa" w:w="100"/>
+            </w:tcMar>
+          </w:tcPr>
+          <w:p>
+            <w:pPr>
+              <w:spacing w:after="0"/>
+            </w:pPr>
+            <w:r>
+              <w:rPr>
+                <w:rFonts w:ascii="Calibri" w:cs="Calibri" w:eastAsia="Calibri" w:hAnsi="Calibri"/>
+                <w:b w:val="false"/>
+                <w:bCs w:val="false"/>
+                <w:color w:val="000000"/>
+                <w:sz w:val="19"/>
+                <w:szCs w:val="19"/>
+              </w:rPr>
+              <w:t xml:space="preserve">O mesmo fast download, direto no HTTPS do NOMADS (/pub/data/nccf/com/gfs/prod/...)</w:t>
+            </w:r>
+          </w:p>
+        </w:tc>
+      </w:tr>
+      <w:tr>
+        <w:tc>
+          <w:tcPr>
+            <w:tcW w:type="dxa" w:w="1986"/>
+            <w:tcBorders>
+              <w:top w:val="single" w:color="BFBFBF" w:sz="4"/>
+              <w:left w:val="single" w:color="BFBFBF" w:sz="4"/>
+              <w:bottom w:val="single" w:color="BFBFBF" w:sz="4"/>
+              <w:right w:val="single" w:color="BFBFBF" w:sz="4"/>
+            </w:tcBorders>
+            <w:tcMar>
+              <w:top w:type="dxa" w:w="60"/>
+              <w:left w:type="dxa" w:w="100"/>
+              <w:bottom w:type="dxa" w:w="60"/>
+              <w:right w:type="dxa" w:w="100"/>
+            </w:tcMar>
+          </w:tcPr>
+          <w:p>
+            <w:pPr>
+              <w:spacing w:after="0"/>
+            </w:pPr>
+            <w:r>
+              <w:rPr>
+                <w:rFonts w:ascii="Calibri" w:cs="Calibri" w:eastAsia="Calibri" w:hAnsi="Calibri"/>
+                <w:b w:val="false"/>
+                <w:bCs w:val="false"/>
+                <w:color w:val="000000"/>
+                <w:sz w:val="19"/>
+                <w:szCs w:val="19"/>
+              </w:rPr>
+              <w:t xml:space="preserve">filtro</w:t>
+            </w:r>
+          </w:p>
+        </w:tc>
+        <w:tc>
+          <w:tcPr>
+            <w:tcW w:type="dxa" w:w="7040"/>
+            <w:tcBorders>
+              <w:top w:val="single" w:color="BFBFBF" w:sz="4"/>
+              <w:left w:val="single" w:color="BFBFBF" w:sz="4"/>
+              <w:bottom w:val="single" w:color="BFBFBF" w:sz="4"/>
+              <w:right w:val="single" w:color="BFBFBF" w:sz="4"/>
+            </w:tcBorders>
+            <w:tcMar>
+              <w:top w:type="dxa" w:w="60"/>
+              <w:left w:type="dxa" w:w="100"/>
+              <w:bottom w:type="dxa" w:w="60"/>
+              <w:right w:type="dxa" w:w="100"/>
+            </w:tcMar>
+          </w:tcPr>
+          <w:p>
+            <w:pPr>
+              <w:spacing w:after="0"/>
+            </w:pPr>
+            <w:r>
+              <w:rPr>
+                <w:rFonts w:ascii="Calibri" w:cs="Calibri" w:eastAsia="Calibri" w:hAnsi="Calibri"/>
+                <w:b w:val="false"/>
+                <w:bCs w:val="false"/>
+                <w:color w:val="000000"/>
+                <w:sz w:val="19"/>
+                <w:szCs w:val="19"/>
+              </w:rPr>
+              <w:t xml:space="preserve">Grib filter do NOMADS (recorte de variáveis/região no servidor; URL ajustável via --url-filtro)</w:t>
+            </w:r>
+          </w:p>
+        </w:tc>
+      </w:tr>
+    </w:tbl>
+    <w:p>
+      <w:pPr>
+        <w:spacing w:after="160" w:line="276"/>
+        <w:jc w:val="both"/>
+      </w:pPr>
+      <w:r>
+        <w:rPr>
+          <w:rFonts w:ascii="Calibri" w:cs="Calibri" w:eastAsia="Calibri" w:hAnsi="Calibri"/>
+          <w:b w:val="false"/>
+          <w:bCs w:val="false"/>
+          <w:i w:val="false"/>
+          <w:iCs w:val="false"/>
+          <w:color w:val="000000"/>
+          <w:sz w:val="22"/>
+          <w:szCs w:val="22"/>
+        </w:rPr>
+        <w:t xml:space="preserve"/>
+      </w:r>
+    </w:p>
+    <w:p>
+      <w:pPr>
+        <w:shd w:fill="F2F2F2" w:val="clear"/>
+        <w:spacing w:after="0"/>
+      </w:pPr>
+      <w:r>
+        <w:rPr>
+          <w:rFonts w:ascii="Consolas" w:cs="Consolas" w:eastAsia="Consolas" w:hAnsi="Consolas"/>
+          <w:sz w:val="19"/>
+          <w:szCs w:val="19"/>
+        </w:rPr>
+        <w:t xml:space="preserve">python3 prepara_gfs.py                          # rodada de hoje 00 UTC, 16 dias</w:t>
+      </w:r>
+    </w:p>
+    <w:p>
+      <w:pPr>
+        <w:shd w:fill="F2F2F2" w:val="clear"/>
+        <w:spacing w:after="0"/>
+      </w:pPr>
+      <w:r>
+        <w:rPr>
+          <w:rFonts w:ascii="Consolas" w:cs="Consolas" w:eastAsia="Consolas" w:hAnsi="Consolas"/>
+          <w:sz w:val="19"/>
+          <w:szCs w:val="19"/>
+        </w:rPr>
+        <w:t xml:space="preserve">python3 prepara_gfs.py --data 20260805 --config config.yaml</w:t>
+      </w:r>
+    </w:p>
+    <w:p>
+      <w:pPr>
+        <w:shd w:fill="F2F2F2" w:val="clear"/>
+        <w:spacing w:after="0"/>
+      </w:pPr>
+      <w:r>
+        <w:rPr>
+          <w:rFonts w:ascii="Consolas" w:cs="Consolas" w:eastAsia="Consolas" w:hAnsi="Consolas"/>
+          <w:sz w:val="19"/>
+          <w:szCs w:val="19"/>
+        </w:rPr>
+        <w:t xml:space="preserve">python3 prepara_gfs.py --simular                # só mostra o plano e a URL</w:t>
+      </w:r>
+    </w:p>
+    <w:p>
+      <w:pPr>
+        <w:shd w:fill="F2F2F2" w:val="clear"/>
+        <w:spacing w:after="160"/>
+      </w:pPr>
+      <w:r>
+        <w:rPr>
+          <w:rFonts w:ascii="Consolas" w:cs="Consolas" w:eastAsia="Consolas" w:hAnsi="Consolas"/>
+          <w:sz w:val="19"/>
+          <w:szCs w:val="19"/>
+        </w:rPr>
+        <w:t xml:space="preserve">python3 prepara_gfs.py --metodo nomads          # se a AWS estiver bloqueada</w:t>
+      </w:r>
+    </w:p>
+    <w:p>
+      <w:pPr>
+        <w:spacing w:after="160" w:line="276"/>
+        <w:jc w:val="both"/>
+      </w:pPr>
+      <w:r>
+        <w:rPr>
+          <w:rFonts w:ascii="Calibri" w:cs="Calibri" w:eastAsia="Calibri" w:hAnsi="Calibri"/>
+          <w:b w:val="false"/>
+          <w:bCs w:val="false"/>
+          <w:i w:val="false"/>
+          <w:iCs w:val="false"/>
+          <w:color w:val="000000"/>
+          <w:sz w:val="22"/>
+          <w:szCs w:val="22"/>
+        </w:rPr>
+        <w:t xml:space="preserve">Opções principais: --data/--rodada (rodada), --dias (alcance, padrão 16), --passo (validades, padrão 6 h), --dominio latS,latN,lonW,lonE, --acumulo 24h|dia, --jobs (downloads simultâneos), --base/--config (destino), --sobrescrever e --simular.</w:t>
+      </w:r>
+    </w:p>
+    <w:p>
+      <w:pPr>
+        <w:spacing w:after="160" w:line="276"/>
+        <w:jc w:val="both"/>
+      </w:pPr>
+      <w:r>
+        <w:rPr>
+          <w:rFonts w:ascii="Calibri" w:cs="Calibri" w:eastAsia="Calibri" w:hAnsi="Calibri"/>
+          <w:b w:val="false"/>
+          <w:bCs w:val="false"/>
+          <w:i w:val="false"/>
+          <w:iCs w:val="false"/>
+          <w:color w:val="000000"/>
+          <w:sz w:val="22"/>
+          <w:szCs w:val="22"/>
+        </w:rPr>
+        <w:t xml:space="preserve">Sobre a precipitação: o APCP do GFS vem em "baldes" (6 h até +240 h; 12 h de +240 h a +384 h). O acumulado diário de cada validade soma os baldes que cobrem as 24 h anteriores, com o intervalo lido do próprio GRIB — a transição 6 h/12 h é automática, e validades sem arquivo além de +240 h (fora do passo de 12 h) são puladas com aviso. Fluxo típico de uma rodada:</w:t>
+      </w:r>
+    </w:p>
+    <w:p>
+      <w:pPr>
+        <w:shd w:fill="F2F2F2" w:val="clear"/>
+        <w:spacing w:after="0"/>
+      </w:pPr>
+      <w:r>
+        <w:rPr>
+          <w:rFonts w:ascii="Consolas" w:cs="Consolas" w:eastAsia="Consolas" w:hAnsi="Consolas"/>
+          <w:sz w:val="19"/>
+          <w:szCs w:val="19"/>
+        </w:rPr>
+        <w:t xml:space="preserve">python3 prepara_gfs.py --config config.yaml           # 1. baixa e prepara o GFS</w:t>
+      </w:r>
+    </w:p>
+    <w:p>
+      <w:pPr>
+        <w:shd w:fill="F2F2F2" w:val="clear"/>
+        <w:spacing w:after="160"/>
+      </w:pPr>
+      <w:r>
+        <w:rPr>
+          <w:rFonts w:ascii="Consolas" w:cs="Consolas" w:eastAsia="Consolas" w:hAnsi="Consolas"/>
+          <w:sz w:val="19"/>
+          <w:szCs w:val="19"/>
+        </w:rPr>
+        <w:t xml:space="preserve">python3 rf_previsto.py --de 6h --ate 4d18h --passo 6h # 2. calcula o RF</w:t>
+      </w:r>
+    </w:p>
+    <w:p>
+      <w:pPr>
+        <w:pStyle w:val="Heading1"/>
+        <w:spacing w:after="200" w:before="360"/>
+      </w:pPr>
+      <w:r>
+        <w:rPr>
+          <w:rFonts w:ascii="Calibri" w:cs="Calibri" w:eastAsia="Calibri" w:hAnsi="Calibri"/>
+          <w:b/>
+          <w:bCs/>
+          <w:color w:val="1F4E79"/>
+          <w:sz w:val="30"/>
+          <w:szCs w:val="30"/>
+        </w:rPr>
+        <w:t xml:space="preserve">7. Saídas</w:t>
       </w:r>
     </w:p>
     <w:p>
@@ -5024,7 +5555,7 @@
           <w:sz w:val="25"/>
           <w:szCs w:val="25"/>
         </w:rPr>
-        <w:t xml:space="preserve">6.1 Produto diário (1 a 5 dias)</w:t>
+        <w:t xml:space="preserve">7.1 Produto diário (1 a 5 dias)</w:t>
       </w:r>
     </w:p>
     <w:tbl>
@@ -5490,7 +6021,7 @@
           <w:sz w:val="25"/>
           <w:szCs w:val="25"/>
         </w:rPr>
-        <w:t xml:space="preserve">6.2 Produto semanal (1 a 2 semanas)</w:t>
+        <w:t xml:space="preserve">7.2 Produto semanal (1 a 2 semanas)</w:t>
       </w:r>
     </w:p>
     <w:tbl>
@@ -5752,7 +6283,7 @@
           <w:sz w:val="25"/>
           <w:szCs w:val="25"/>
         </w:rPr>
-        <w:t xml:space="preserve">6.3 Formato dos arquivos</w:t>
+        <w:t xml:space="preserve">7.3 Formato dos arquivos</w:t>
       </w:r>
     </w:p>
     <w:p>
@@ -5807,7 +6338,7 @@
           <w:sz w:val="30"/>
           <w:szCs w:val="30"/>
         </w:rPr>
-        <w:t xml:space="preserve">7. Logs e monitoramento</w:t>
+        <w:t xml:space="preserve">8. Logs e monitoramento</w:t>
       </w:r>
     </w:p>
     <w:tbl>
@@ -6156,7 +6687,7 @@
           <w:sz w:val="30"/>
           <w:szCs w:val="30"/>
         </w:rPr>
-        <w:t xml:space="preserve">8. Solução de problemas</w:t>
+        <w:t xml:space="preserve">9. Solução de problemas</w:t>
       </w:r>
     </w:p>
     <w:tbl>
@@ -7024,7 +7555,7 @@
           <w:sz w:val="30"/>
           <w:szCs w:val="30"/>
         </w:rPr>
-        <w:t xml:space="preserve">9. Testes de validação</w:t>
+        <w:t xml:space="preserve">10. Testes de validação</w:t>
       </w:r>
     </w:p>
     <w:p>
@@ -7077,7 +7608,7 @@
     <w:p>
       <w:pPr>
         <w:shd w:fill="F2F2F2" w:val="clear"/>
-        <w:spacing w:after="160"/>
+        <w:spacing w:after="0"/>
       </w:pPr>
       <w:r>
         <w:rPr>
@@ -7086,6 +7617,20 @@
           <w:szCs w:val="19"/>
         </w:rPr>
         <w:t xml:space="preserve">python3 teste_rf_multifonte.py # valida o modo multifonte (Eta 13m, BESM 12h, JSON)</w:t>
+      </w:r>
+    </w:p>
+    <w:p>
+      <w:pPr>
+        <w:shd w:fill="F2F2F2" w:val="clear"/>
+        <w:spacing w:after="160"/>
+      </w:pPr>
+      <w:r>
+        <w:rPr>
+          <w:rFonts w:ascii="Consolas" w:cs="Consolas" w:eastAsia="Consolas" w:hAnsi="Consolas"/>
+          <w:sz w:val="19"/>
+          <w:szCs w:val="19"/>
+        </w:rPr>
+        <w:t xml:space="preserve">python3 teste_prepara_gfs.py   # valida o preparo do GFS (idx, baldes, NetCDF)</w:t>
       </w:r>
     </w:p>
     <w:p>
@@ -7121,7 +7666,7 @@
           <w:sz w:val="30"/>
           <w:szCs w:val="30"/>
         </w:rPr>
-        <w:t xml:space="preserve">10. Segurança</w:t>
+        <w:t xml:space="preserve">11. Segurança</w:t>
       </w:r>
     </w:p>
     <w:p>
@@ -7157,7 +7702,7 @@
           <w:sz w:val="30"/>
           <w:szCs w:val="30"/>
         </w:rPr>
-        <w:t xml:space="preserve">11. Suporte</w:t>
+        <w:t xml:space="preserve">12. Suporte</w:t>
       </w:r>
     </w:p>
     <w:p>

</xml_diff>

<commit_message>
Adiciona prepara_imerg.py: banco de dados IMERG via GES DISC
- Baixa o GPM_3IMERGDE V07 (Early Daily) com autenticacao Earthdata (~/.netrc)
- Modos: data corrente (119 dias ate ontem), --data-final (janela da rodada)
  e --inicio/--fim (periodo); produtos early/late/final
- Converte para o padrao do pipeline (prec mm/dia, lat S->N, dominio recortado,
  destino via config.yaml); pula existentes, tenta versoes V07D->V07A
- teste_prepara_imerg.py: conversao, variantes de formato e caminhos
- Manual v1.5 (secao 6 com GFS + IMERG), README e instrucoes atualizados
</commit_message>
<xml_diff>
--- a/docs/manual_usuario.docx
+++ b/docs/manual_usuario.docx
@@ -46,7 +46,7 @@
           <w:sz w:val="22"/>
           <w:szCs w:val="22"/>
         </w:rPr>
-        <w:t xml:space="preserve">Versão 1.4 · 5 de agosto de 2026</w:t>
+        <w:t xml:space="preserve">Versão 1.5 · 5 de agosto de 2026</w:t>
       </w:r>
     </w:p>
     <w:p>
@@ -1147,6 +1147,20 @@
           <w:sz w:val="19"/>
           <w:szCs w:val="19"/>
         </w:rPr>
+        <w:t xml:space="preserve">prepara_imerg.py</w:t>
+      </w:r>
+    </w:p>
+    <w:p>
+      <w:pPr>
+        <w:shd w:fill="F2F2F2" w:val="clear"/>
+        <w:spacing w:after="0"/>
+      </w:pPr>
+      <w:r>
+        <w:rPr>
+          <w:rFonts w:ascii="Consolas" w:cs="Consolas" w:eastAsia="Consolas" w:hAnsi="Consolas"/>
+          <w:sz w:val="19"/>
+          <w:szCs w:val="19"/>
+        </w:rPr>
         <w:t xml:space="preserve">teste_rf.py</w:t>
       </w:r>
     </w:p>
@@ -1181,6 +1195,20 @@
     <w:p>
       <w:pPr>
         <w:shd w:fill="F2F2F2" w:val="clear"/>
+        <w:spacing w:after="0"/>
+      </w:pPr>
+      <w:r>
+        <w:rPr>
+          <w:rFonts w:ascii="Consolas" w:cs="Consolas" w:eastAsia="Consolas" w:hAnsi="Consolas"/>
+          <w:sz w:val="19"/>
+          <w:szCs w:val="19"/>
+        </w:rPr>
+        <w:t xml:space="preserve">teste_prepara_gfs.py</w:t>
+      </w:r>
+    </w:p>
+    <w:p>
+      <w:pPr>
+        <w:shd w:fill="F2F2F2" w:val="clear"/>
         <w:spacing w:after="160"/>
       </w:pPr>
       <w:r>
@@ -1189,7 +1217,7 @@
           <w:sz w:val="19"/>
           <w:szCs w:val="19"/>
         </w:rPr>
-        <w:t xml:space="preserve">teste_prepara_gfs.py</w:t>
+        <w:t xml:space="preserve">teste_prepara_imerg.py</w:t>
       </w:r>
     </w:p>
     <w:p>
@@ -5035,7 +5063,85 @@
           <w:sz w:val="30"/>
           <w:szCs w:val="30"/>
         </w:rPr>
-        <w:t xml:space="preserve">6. Preparo dos dados de entrada do GFS (prepara_gfs.py)</w:t>
+        <w:t xml:space="preserve">6. Preparo dos dados de entrada (prepara_gfs.py e prepara_imerg.py)</w:t>
+      </w:r>
+    </w:p>
+    <w:p>
+      <w:pPr>
+        <w:spacing w:after="160" w:line="276"/>
+        <w:jc w:val="both"/>
+      </w:pPr>
+      <w:r>
+        <w:rPr>
+          <w:rFonts w:ascii="Calibri" w:cs="Calibri" w:eastAsia="Calibri" w:hAnsi="Calibri"/>
+          <w:b w:val="false"/>
+          <w:bCs w:val="false"/>
+          <w:i w:val="false"/>
+          <w:iCs w:val="false"/>
+          <w:color w:val="000000"/>
+          <w:sz w:val="22"/>
+          <w:szCs w:val="22"/>
+        </w:rPr>
+        <w:t xml:space="preserve">Dois scripts geram o banco de dados de entrada do RF sem depender da área de produção do Programa Queimadas: o prepara_gfs.py (previsões) e o prepara_imerg.py (precipitação observada). Fluxo completo de uma rodada:</w:t>
+      </w:r>
+    </w:p>
+    <w:p>
+      <w:pPr>
+        <w:shd w:fill="F2F2F2" w:val="clear"/>
+        <w:spacing w:after="0"/>
+      </w:pPr>
+      <w:r>
+        <w:rPr>
+          <w:rFonts w:ascii="Consolas" w:cs="Consolas" w:eastAsia="Consolas" w:hAnsi="Consolas"/>
+          <w:sz w:val="19"/>
+          <w:szCs w:val="19"/>
+        </w:rPr>
+        <w:t xml:space="preserve">python3 prepara_imerg.py --config config.yaml         # 1. IMERG observado (119 dias)</w:t>
+      </w:r>
+    </w:p>
+    <w:p>
+      <w:pPr>
+        <w:shd w:fill="F2F2F2" w:val="clear"/>
+        <w:spacing w:after="0"/>
+      </w:pPr>
+      <w:r>
+        <w:rPr>
+          <w:rFonts w:ascii="Consolas" w:cs="Consolas" w:eastAsia="Consolas" w:hAnsi="Consolas"/>
+          <w:sz w:val="19"/>
+          <w:szCs w:val="19"/>
+        </w:rPr>
+        <w:t xml:space="preserve">python3 prepara_gfs.py   --config config.yaml         # 2. previsões do GFS</w:t>
+      </w:r>
+    </w:p>
+    <w:p>
+      <w:pPr>
+        <w:shd w:fill="F2F2F2" w:val="clear"/>
+        <w:spacing w:after="160"/>
+      </w:pPr>
+      <w:r>
+        <w:rPr>
+          <w:rFonts w:ascii="Consolas" w:cs="Consolas" w:eastAsia="Consolas" w:hAnsi="Consolas"/>
+          <w:sz w:val="19"/>
+          <w:szCs w:val="19"/>
+        </w:rPr>
+        <w:t xml:space="preserve">python3 rf_previsto.py   --de 6h --ate 4d18h --passo 6h   # 3. RF</w:t>
+      </w:r>
+    </w:p>
+    <w:p>
+      <w:pPr>
+        <w:pStyle w:val="Heading2"/>
+        <w:spacing w:after="160" w:before="280"/>
+      </w:pPr>
+      <w:r>
+        <w:rPr>
+          <w:rFonts w:ascii="Calibri" w:cs="Calibri" w:eastAsia="Calibri" w:hAnsi="Calibri"/>
+          <w:b/>
+          <w:bCs/>
+          <w:color w:val="1F4E79"/>
+          <w:sz w:val="25"/>
+          <w:szCs w:val="25"/>
+        </w:rPr>
+        <w:t xml:space="preserve">6.1 GFS (prepara_gfs.py)</w:t>
       </w:r>
     </w:p>
     <w:p>
@@ -5493,7 +5599,108 @@
           <w:sz w:val="22"/>
           <w:szCs w:val="22"/>
         </w:rPr>
-        <w:t xml:space="preserve">Sobre a precipitação: o APCP do GFS vem em "baldes" (6 h até +240 h; 12 h de +240 h a +384 h). O acumulado diário de cada validade soma os baldes que cobrem as 24 h anteriores, com o intervalo lido do próprio GRIB — a transição 6 h/12 h é automática, e validades sem arquivo além de +240 h (fora do passo de 12 h) são puladas com aviso. Fluxo típico de uma rodada:</w:t>
+        <w:t xml:space="preserve">Sobre a precipitação: o APCP do GFS vem em "baldes" (6 h até +240 h; 12 h de +240 h a +384 h). O acumulado diário de cada validade soma os baldes que cobrem as 24 h anteriores, com o intervalo lido do próprio GRIB — a transição 6 h/12 h é automática, e validades sem arquivo além de +240 h (fora do passo de 12 h) são puladas com aviso.</w:t>
+      </w:r>
+    </w:p>
+    <w:p>
+      <w:pPr>
+        <w:pStyle w:val="Heading2"/>
+        <w:spacing w:after="160" w:before="280"/>
+      </w:pPr>
+      <w:r>
+        <w:rPr>
+          <w:rFonts w:ascii="Calibri" w:cs="Calibri" w:eastAsia="Calibri" w:hAnsi="Calibri"/>
+          <w:b/>
+          <w:bCs/>
+          <w:color w:val="1F4E79"/>
+          <w:sz w:val="25"/>
+          <w:szCs w:val="25"/>
+        </w:rPr>
+        <w:t xml:space="preserve">6.2 IMERG (prepara_imerg.py)</w:t>
+      </w:r>
+    </w:p>
+    <w:p>
+      <w:pPr>
+        <w:spacing w:after="160" w:line="276"/>
+        <w:jc w:val="both"/>
+      </w:pPr>
+      <w:r>
+        <w:rPr>
+          <w:rFonts w:ascii="Calibri" w:cs="Calibri" w:eastAsia="Calibri" w:hAnsi="Calibri"/>
+          <w:b w:val="false"/>
+          <w:bCs w:val="false"/>
+          <w:i w:val="false"/>
+          <w:iCs w:val="false"/>
+          <w:color w:val="000000"/>
+          <w:sz w:val="22"/>
+          <w:szCs w:val="22"/>
+        </w:rPr>
+        <w:t xml:space="preserve">O prepara_imerg.py baixa a precipitação diária observada do IMERG — produto GPM_3IMERGDE V07 (Early Daily, ~4 h de latência, o mesmo da operação) — do GES DISC/NASA e converte para o padrão de leitura do pipeline (INPE_FireRiskModel_2.2_Precipitation_AAAAMMDD.nc, variável prec em mm/dia, lat sul→norte, domínio recortado), no destino definido pela seção caminhos do config.yaml.</w:t>
+      </w:r>
+    </w:p>
+    <w:p>
+      <w:pPr>
+        <w:spacing w:after="160" w:line="276"/>
+        <w:jc w:val="both"/>
+      </w:pPr>
+      <w:r>
+        <w:rPr>
+          <w:rFonts w:ascii="Calibri" w:cs="Calibri" w:eastAsia="Calibri" w:hAnsi="Calibri"/>
+          <w:b/>
+          <w:bCs/>
+          <w:i w:val="false"/>
+          <w:iCs w:val="false"/>
+          <w:color w:val="000000"/>
+          <w:sz w:val="22"/>
+          <w:szCs w:val="22"/>
+        </w:rPr>
+        <w:t xml:space="preserve">Pré-requisito (uma única vez): </w:t>
+      </w:r>
+      <w:r>
+        <w:rPr>
+          <w:rFonts w:ascii="Calibri" w:cs="Calibri" w:eastAsia="Calibri" w:hAnsi="Calibri"/>
+          <w:b w:val="false"/>
+          <w:bCs w:val="false"/>
+          <w:i w:val="false"/>
+          <w:iCs w:val="false"/>
+          <w:color w:val="000000"/>
+          <w:sz w:val="22"/>
+          <w:szCs w:val="22"/>
+        </w:rPr>
+        <w:t xml:space="preserve">conta gratuita no Earthdata (urs.earthdata.nasa.gov), autorizar o app "NASA GESDISC DATA ARCHIVE" em Applications → Authorized Apps e criar o ~/.netrc (chmod 600):</w:t>
+      </w:r>
+    </w:p>
+    <w:p>
+      <w:pPr>
+        <w:shd w:fill="F2F2F2" w:val="clear"/>
+        <w:spacing w:after="160"/>
+      </w:pPr>
+      <w:r>
+        <w:rPr>
+          <w:rFonts w:ascii="Consolas" w:cs="Consolas" w:eastAsia="Consolas" w:hAnsi="Consolas"/>
+          <w:sz w:val="19"/>
+          <w:szCs w:val="19"/>
+        </w:rPr>
+        <w:t xml:space="preserve">machine urs.earthdata.nasa.gov login SEU_USUARIO password SUA_SENHA</w:t>
+      </w:r>
+    </w:p>
+    <w:p>
+      <w:pPr>
+        <w:spacing w:after="160" w:line="276"/>
+        <w:jc w:val="both"/>
+      </w:pPr>
+      <w:r>
+        <w:rPr>
+          <w:rFonts w:ascii="Calibri" w:cs="Calibri" w:eastAsia="Calibri" w:hAnsi="Calibri"/>
+          <w:b w:val="false"/>
+          <w:bCs w:val="false"/>
+          <w:i w:val="false"/>
+          <w:iCs w:val="false"/>
+          <w:color w:val="000000"/>
+          <w:sz w:val="22"/>
+          <w:szCs w:val="22"/>
+        </w:rPr>
+        <w:t xml:space="preserve">Modos de uso:</w:t>
       </w:r>
     </w:p>
     <w:p>
@@ -5507,7 +5714,49 @@
           <w:sz w:val="19"/>
           <w:szCs w:val="19"/>
         </w:rPr>
-        <w:t xml:space="preserve">python3 prepara_gfs.py --config config.yaml           # 1. baixa e prepara o GFS</w:t>
+        <w:t xml:space="preserve">python3 prepara_imerg.py                           # data corrente: 119 dias até ontem</w:t>
+      </w:r>
+    </w:p>
+    <w:p>
+      <w:pPr>
+        <w:shd w:fill="F2F2F2" w:val="clear"/>
+        <w:spacing w:after="0"/>
+      </w:pPr>
+      <w:r>
+        <w:rPr>
+          <w:rFonts w:ascii="Consolas" w:cs="Consolas" w:eastAsia="Consolas" w:hAnsi="Consolas"/>
+          <w:sz w:val="19"/>
+          <w:szCs w:val="19"/>
+        </w:rPr>
+        <w:t xml:space="preserve">python3 prepara_imerg.py --data-final 20260804     # janela da rodada (reprocessamento)</w:t>
+      </w:r>
+    </w:p>
+    <w:p>
+      <w:pPr>
+        <w:shd w:fill="F2F2F2" w:val="clear"/>
+        <w:spacing w:after="0"/>
+      </w:pPr>
+      <w:r>
+        <w:rPr>
+          <w:rFonts w:ascii="Consolas" w:cs="Consolas" w:eastAsia="Consolas" w:hAnsi="Consolas"/>
+          <w:sz w:val="19"/>
+          <w:szCs w:val="19"/>
+        </w:rPr>
+        <w:t xml:space="preserve">python3 prepara_imerg.py --inicio 20250101 --fim 20251231   # período explícito</w:t>
+      </w:r>
+    </w:p>
+    <w:p>
+      <w:pPr>
+        <w:shd w:fill="F2F2F2" w:val="clear"/>
+        <w:spacing w:after="0"/>
+      </w:pPr>
+      <w:r>
+        <w:rPr>
+          <w:rFonts w:ascii="Consolas" w:cs="Consolas" w:eastAsia="Consolas" w:hAnsi="Consolas"/>
+          <w:sz w:val="19"/>
+          <w:szCs w:val="19"/>
+        </w:rPr>
+        <w:t xml:space="preserve">python3 prepara_imerg.py --produto final ...       # histórico consolidado da NASA</w:t>
       </w:r>
     </w:p>
     <w:p>
@@ -5521,7 +5770,26 @@
           <w:sz w:val="19"/>
           <w:szCs w:val="19"/>
         </w:rPr>
-        <w:t xml:space="preserve">python3 rf_previsto.py --de 6h --ate 4d18h --passo 6h # 2. calcula o RF</w:t>
+        <w:t xml:space="preserve">python3 prepara_imerg.py --simular                 # confere período e URLs</w:t>
+      </w:r>
+    </w:p>
+    <w:p>
+      <w:pPr>
+        <w:spacing w:after="160" w:line="276"/>
+        <w:jc w:val="both"/>
+      </w:pPr>
+      <w:r>
+        <w:rPr>
+          <w:rFonts w:ascii="Calibri" w:cs="Calibri" w:eastAsia="Calibri" w:hAnsi="Calibri"/>
+          <w:b w:val="false"/>
+          <w:bCs w:val="false"/>
+          <w:i w:val="false"/>
+          <w:iCs w:val="false"/>
+          <w:color w:val="000000"/>
+          <w:sz w:val="22"/>
+          <w:szCs w:val="22"/>
+        </w:rPr>
+        <w:t xml:space="preserve">O script pula dias já existentes (rodar de novo completa o que faltou; --sobrescrever regrava), tenta as letras de versão da NASA automaticamente (V07D→V07A), baixa em paralelo (--jobs) e trata a transposição lon/lat e os valores inválidos do formato IMERG. Cada dia baixa ~25 MB do arquivo global e grava ~2–3 MB recortados. Produtos: early (padrão), late (~14 h) e final (pesquisa, meses de latência — ideal para períodos históricos).</w:t>
       </w:r>
     </w:p>
     <w:p>
@@ -7622,6 +7890,20 @@
     <w:p>
       <w:pPr>
         <w:shd w:fill="F2F2F2" w:val="clear"/>
+        <w:spacing w:after="0"/>
+      </w:pPr>
+      <w:r>
+        <w:rPr>
+          <w:rFonts w:ascii="Consolas" w:cs="Consolas" w:eastAsia="Consolas" w:hAnsi="Consolas"/>
+          <w:sz w:val="19"/>
+          <w:szCs w:val="19"/>
+        </w:rPr>
+        <w:t xml:space="preserve">python3 teste_prepara_gfs.py   # valida o preparo do GFS (idx, baldes, NetCDF)</w:t>
+      </w:r>
+    </w:p>
+    <w:p>
+      <w:pPr>
+        <w:shd w:fill="F2F2F2" w:val="clear"/>
         <w:spacing w:after="160"/>
       </w:pPr>
       <w:r>
@@ -7630,7 +7912,7 @@
           <w:sz w:val="19"/>
           <w:szCs w:val="19"/>
         </w:rPr>
-        <w:t xml:space="preserve">python3 teste_prepara_gfs.py   # valida o preparo do GFS (idx, baldes, NetCDF)</w:t>
+        <w:t xml:space="preserve">python3 teste_prepara_imerg.py # valida o preparo do IMERG (conversão, caminhos)</w:t>
       </w:r>
     </w:p>
     <w:p>

</xml_diff>

<commit_message>
Corrige autenticacao/threads dos preparos e adiciona ativa_riscofogo.sh
- prepara_imerg: token Earthdata (Bearer, ~/.edl_token) como modo recomendado
  e diagnostico claro da falha de login (HTML/401)
- prepara_imerg e prepara_gfs: conversao NetCDF/GRIB serializada por lock
  (HDF5/eccodes nao sao thread-safe) — corrige Segmentation fault em lote
- ativa_riscofogo.sh: module load + conda env por nome/caminho, deteccao de
  env sem Python com fallback para o venv e sanidade das bibliotecas
- Manual v1.6: secao 3.1 (ambiente no cluster), 6.2 (token) e novos itens
  de solucao de problemas
</commit_message>
<xml_diff>
--- a/docs/manual_usuario.docx
+++ b/docs/manual_usuario.docx
@@ -46,7 +46,7 @@
           <w:sz w:val="22"/>
           <w:szCs w:val="22"/>
         </w:rPr>
-        <w:t xml:space="preserve">Versão 1.5 · 5 de agosto de 2026</w:t>
+        <w:t xml:space="preserve">Versão 1.6 · 5 de agosto de 2026</w:t>
       </w:r>
     </w:p>
     <w:p>
@@ -1091,6 +1091,20 @@
           <w:sz w:val="19"/>
           <w:szCs w:val="19"/>
         </w:rPr>
+        <w:t xml:space="preserve">ativa_riscofogo.sh</w:t>
+      </w:r>
+    </w:p>
+    <w:p>
+      <w:pPr>
+        <w:shd w:fill="F2F2F2" w:val="clear"/>
+        <w:spacing w:after="0"/>
+      </w:pPr>
+      <w:r>
+        <w:rPr>
+          <w:rFonts w:ascii="Consolas" w:cs="Consolas" w:eastAsia="Consolas" w:hAnsi="Consolas"/>
+          <w:sz w:val="19"/>
+          <w:szCs w:val="19"/>
+        </w:rPr>
         <w:t xml:space="preserve">rf_previsto_1_5dias.py</w:t>
       </w:r>
     </w:p>
@@ -1251,6 +1265,75 @@
           <w:szCs w:val="19"/>
         </w:rPr>
         <w:t xml:space="preserve">chmod +x rf_previsto_1_5dias.py rf_previsto_1_2_semanas.py</w:t>
+      </w:r>
+    </w:p>
+    <w:p>
+      <w:pPr>
+        <w:pStyle w:val="Heading2"/>
+        <w:spacing w:after="160" w:before="280"/>
+      </w:pPr>
+      <w:r>
+        <w:rPr>
+          <w:rFonts w:ascii="Calibri" w:cs="Calibri" w:eastAsia="Calibri" w:hAnsi="Calibri"/>
+          <w:b/>
+          <w:bCs/>
+          <w:color w:val="1F4E79"/>
+          <w:sz w:val="25"/>
+          <w:szCs w:val="25"/>
+        </w:rPr>
+        <w:t xml:space="preserve">3.1 Ambiente Python no cluster (ativa_riscofogo.sh)</w:t>
+      </w:r>
+    </w:p>
+    <w:p>
+      <w:pPr>
+        <w:spacing w:after="160" w:line="276"/>
+        <w:jc w:val="both"/>
+      </w:pPr>
+      <w:r>
+        <w:rPr>
+          <w:rFonts w:ascii="Calibri" w:cs="Calibri" w:eastAsia="Calibri" w:hAnsi="Calibri"/>
+          <w:b w:val="false"/>
+          <w:bCs w:val="false"/>
+          <w:i w:val="false"/>
+          <w:iCs w:val="false"/>
+          <w:color w:val="000000"/>
+          <w:sz w:val="22"/>
+          <w:szCs w:val="22"/>
+        </w:rPr>
+        <w:t xml:space="preserve">Em clusters, o erro mais comum é instalar/rodar com interpretadores diferentes (o pip do sistema instala num lugar, o python3 do ambiente lê de outro). O ativa_riscofogo.sh resolve isso — use SEMPRE com source, a cada login (ou adicione ao ~/.bashrc):</w:t>
+      </w:r>
+    </w:p>
+    <w:p>
+      <w:pPr>
+        <w:shd w:fill="F2F2F2" w:val="clear"/>
+        <w:spacing w:after="160"/>
+      </w:pPr>
+      <w:r>
+        <w:rPr>
+          <w:rFonts w:ascii="Consolas" w:cs="Consolas" w:eastAsia="Consolas" w:hAnsi="Consolas"/>
+          <w:sz w:val="19"/>
+          <w:szCs w:val="19"/>
+        </w:rPr>
+        <w:t xml:space="preserve">source ativa_riscofogo.sh</w:t>
+      </w:r>
+    </w:p>
+    <w:p>
+      <w:pPr>
+        <w:spacing w:after="160" w:line="276"/>
+        <w:jc w:val="both"/>
+      </w:pPr>
+      <w:r>
+        <w:rPr>
+          <w:rFonts w:ascii="Calibri" w:cs="Calibri" w:eastAsia="Calibri" w:hAnsi="Calibri"/>
+          <w:b w:val="false"/>
+          <w:bCs w:val="false"/>
+          <w:i w:val="false"/>
+          <w:iCs w:val="false"/>
+          <w:color w:val="000000"/>
+          <w:sz w:val="22"/>
+          <w:szCs w:val="22"/>
+        </w:rPr>
+        <w:t xml:space="preserve">Ele carrega o módulo Anaconda do sistema (se existir; nome ajustável em MODULO_ANACONDA), ativa o env conda riscofogo — localizado por nome ou por caminho (envs fora do diretório padrão aparecem sem nome no conda env list) —, detecta env conda sem Python próprio (caindo para o venv ~/envs/riscofogo e imprimindo o conda install -p ... para populá-lo) e confere versão e bibliotecas ao final. Regra de ouro: dentro de qualquer ambiente, instale com python3 -m pip install ..., nunca com pip solto.</w:t>
       </w:r>
     </w:p>
     <w:p>
@@ -5667,7 +5750,69 @@
           <w:sz w:val="22"/>
           <w:szCs w:val="22"/>
         </w:rPr>
-        <w:t xml:space="preserve">conta gratuita no Earthdata (urs.earthdata.nasa.gov), autorizar o app "NASA GESDISC DATA ARCHIVE" em Applications → Authorized Apps e criar o ~/.netrc (chmod 600):</w:t>
+        <w:t xml:space="preserve">conta gratuita no Earthdata (urs.earthdata.nasa.gov) e um dos dois modos de autenticação:</w:t>
+      </w:r>
+    </w:p>
+    <w:p>
+      <w:pPr>
+        <w:pStyle w:val="ListParagraph"/>
+        <w:numPr>
+          <w:ilvl w:val="0"/>
+          <w:numId w:val="2"/>
+        </w:numPr>
+        <w:spacing w:after="100" w:line="276"/>
+        <w:jc w:val="both"/>
+      </w:pPr>
+      <w:r>
+        <w:rPr>
+          <w:rFonts w:ascii="Calibri" w:cs="Calibri" w:eastAsia="Calibri" w:hAnsi="Calibri"/>
+          <w:b/>
+          <w:bCs/>
+          <w:sz w:val="22"/>
+          <w:szCs w:val="22"/>
+        </w:rPr>
+        <w:t xml:space="preserve">Modo A — token (recomendado): </w:t>
+      </w:r>
+      <w:r>
+        <w:rPr>
+          <w:rFonts w:ascii="Calibri" w:cs="Calibri" w:eastAsia="Calibri" w:hAnsi="Calibri"/>
+          <w:b w:val="false"/>
+          <w:bCs w:val="false"/>
+          <w:sz w:val="22"/>
+          <w:szCs w:val="22"/>
+        </w:rPr>
+        <w:t xml:space="preserve">no perfil do Earthdata, aba Generate Token, copie o token e salve no servidor: echo 'SEU_TOKEN' &gt; ~/.edl_token &amp;&amp; chmod 600 ~/.edl_token (ou exporte EARTHDATA_TOKEN). Dispensa autorização de app e senha no disco.</w:t>
+      </w:r>
+    </w:p>
+    <w:p>
+      <w:pPr>
+        <w:pStyle w:val="ListParagraph"/>
+        <w:numPr>
+          <w:ilvl w:val="0"/>
+          <w:numId w:val="2"/>
+        </w:numPr>
+        <w:spacing w:after="100" w:line="276"/>
+        <w:jc w:val="both"/>
+      </w:pPr>
+      <w:r>
+        <w:rPr>
+          <w:rFonts w:ascii="Calibri" w:cs="Calibri" w:eastAsia="Calibri" w:hAnsi="Calibri"/>
+          <w:b/>
+          <w:bCs/>
+          <w:sz w:val="22"/>
+          <w:szCs w:val="22"/>
+        </w:rPr>
+        <w:t xml:space="preserve">Modo B — usuário/senha: </w:t>
+      </w:r>
+      <w:r>
+        <w:rPr>
+          <w:rFonts w:ascii="Calibri" w:cs="Calibri" w:eastAsia="Calibri" w:hAnsi="Calibri"/>
+          <w:b w:val="false"/>
+          <w:bCs w:val="false"/>
+          <w:sz w:val="22"/>
+          <w:szCs w:val="22"/>
+        </w:rPr>
+        <w:t xml:space="preserve">autorize o app "NASA GESDISC DATA ARCHIVE" em Applications → Authorized Apps (obrigatório) e crie o ~/.netrc (chmod 600; o login é o nome de usuário, não o e-mail):</w:t>
       </w:r>
     </w:p>
     <w:p>
@@ -5682,6 +5827,25 @@
           <w:szCs w:val="19"/>
         </w:rPr>
         <w:t xml:space="preserve">machine urs.earthdata.nasa.gov login SEU_USUARIO password SUA_SENHA</w:t>
+      </w:r>
+    </w:p>
+    <w:p>
+      <w:pPr>
+        <w:spacing w:after="160" w:line="276"/>
+        <w:jc w:val="both"/>
+      </w:pPr>
+      <w:r>
+        <w:rPr>
+          <w:rFonts w:ascii="Calibri" w:cs="Calibri" w:eastAsia="Calibri" w:hAnsi="Calibri"/>
+          <w:b w:val="false"/>
+          <w:bCs w:val="false"/>
+          <w:i w:val="false"/>
+          <w:iCs w:val="false"/>
+          <w:color w:val="000000"/>
+          <w:sz w:val="22"/>
+          <w:szCs w:val="22"/>
+        </w:rPr>
+        <w:t xml:space="preserve">Se a autenticação falhar, o script diz o motivo (página de LOGIN = usuário/senha errados; pedido de AUTORIZAÇÃO = app não aprovado; 401 = token inválido/expirado).</w:t>
       </w:r>
     </w:p>
     <w:p>
@@ -7784,7 +7948,310 @@
                 <w:sz w:val="19"/>
                 <w:szCs w:val="19"/>
               </w:rPr>
-              <w:t xml:space="preserve">pip install numpy xarray netCDF4 rasterio</w:t>
+              <w:t xml:space="preserve">source ativa_riscofogo.sh e instale com python3 -m pip install ... (nunca pip solto)</w:t>
+            </w:r>
+          </w:p>
+        </w:tc>
+      </w:tr>
+      <w:tr>
+        <w:tc>
+          <w:tcPr>
+            <w:tcW w:type="dxa" w:w="3249"/>
+            <w:tcBorders>
+              <w:top w:val="single" w:color="BFBFBF" w:sz="4"/>
+              <w:left w:val="single" w:color="BFBFBF" w:sz="4"/>
+              <w:bottom w:val="single" w:color="BFBFBF" w:sz="4"/>
+              <w:right w:val="single" w:color="BFBFBF" w:sz="4"/>
+            </w:tcBorders>
+            <w:tcMar>
+              <w:top w:type="dxa" w:w="60"/>
+              <w:left w:type="dxa" w:w="100"/>
+              <w:bottom w:type="dxa" w:w="60"/>
+              <w:right w:type="dxa" w:w="100"/>
+            </w:tcMar>
+          </w:tcPr>
+          <w:p>
+            <w:pPr>
+              <w:spacing w:after="0"/>
+            </w:pPr>
+            <w:r>
+              <w:rPr>
+                <w:rFonts w:ascii="Calibri" w:cs="Calibri" w:eastAsia="Calibri" w:hAnsi="Calibri"/>
+                <w:b w:val="false"/>
+                <w:bCs w:val="false"/>
+                <w:color w:val="000000"/>
+                <w:sz w:val="19"/>
+                <w:szCs w:val="19"/>
+              </w:rPr>
+              <w:t xml:space="preserve">prepara_imerg: erro "resposta HTML" do Earthdata</w:t>
+            </w:r>
+          </w:p>
+        </w:tc>
+        <w:tc>
+          <w:tcPr>
+            <w:tcW w:type="dxa" w:w="2888"/>
+            <w:tcBorders>
+              <w:top w:val="single" w:color="BFBFBF" w:sz="4"/>
+              <w:left w:val="single" w:color="BFBFBF" w:sz="4"/>
+              <w:bottom w:val="single" w:color="BFBFBF" w:sz="4"/>
+              <w:right w:val="single" w:color="BFBFBF" w:sz="4"/>
+            </w:tcBorders>
+            <w:tcMar>
+              <w:top w:type="dxa" w:w="60"/>
+              <w:left w:type="dxa" w:w="100"/>
+              <w:bottom w:type="dxa" w:w="60"/>
+              <w:right w:type="dxa" w:w="100"/>
+            </w:tcMar>
+          </w:tcPr>
+          <w:p>
+            <w:pPr>
+              <w:spacing w:after="0"/>
+            </w:pPr>
+            <w:r>
+              <w:rPr>
+                <w:rFonts w:ascii="Calibri" w:cs="Calibri" w:eastAsia="Calibri" w:hAnsi="Calibri"/>
+                <w:b w:val="false"/>
+                <w:bCs w:val="false"/>
+                <w:color w:val="000000"/>
+                <w:sz w:val="19"/>
+                <w:szCs w:val="19"/>
+              </w:rPr>
+              <w:t xml:space="preserve">Autenticação incompleta (app não autorizado, login=e-mail ou token expirado)</w:t>
+            </w:r>
+          </w:p>
+        </w:tc>
+        <w:tc>
+          <w:tcPr>
+            <w:tcW w:type="dxa" w:w="2888"/>
+            <w:tcBorders>
+              <w:top w:val="single" w:color="BFBFBF" w:sz="4"/>
+              <w:left w:val="single" w:color="BFBFBF" w:sz="4"/>
+              <w:bottom w:val="single" w:color="BFBFBF" w:sz="4"/>
+              <w:right w:val="single" w:color="BFBFBF" w:sz="4"/>
+            </w:tcBorders>
+            <w:tcMar>
+              <w:top w:type="dxa" w:w="60"/>
+              <w:left w:type="dxa" w:w="100"/>
+              <w:bottom w:type="dxa" w:w="60"/>
+              <w:right w:type="dxa" w:w="100"/>
+            </w:tcMar>
+          </w:tcPr>
+          <w:p>
+            <w:pPr>
+              <w:spacing w:after="0"/>
+            </w:pPr>
+            <w:r>
+              <w:rPr>
+                <w:rFonts w:ascii="Calibri" w:cs="Calibri" w:eastAsia="Calibri" w:hAnsi="Calibri"/>
+                <w:b w:val="false"/>
+                <w:bCs w:val="false"/>
+                <w:color w:val="000000"/>
+                <w:sz w:val="19"/>
+                <w:szCs w:val="19"/>
+              </w:rPr>
+              <w:t xml:space="preserve">A mensagem indica o caso; prefira o token (~/.edl_token) — seção 6.2</w:t>
+            </w:r>
+          </w:p>
+        </w:tc>
+      </w:tr>
+      <w:tr>
+        <w:tc>
+          <w:tcPr>
+            <w:tcW w:type="dxa" w:w="3249"/>
+            <w:tcBorders>
+              <w:top w:val="single" w:color="BFBFBF" w:sz="4"/>
+              <w:left w:val="single" w:color="BFBFBF" w:sz="4"/>
+              <w:bottom w:val="single" w:color="BFBFBF" w:sz="4"/>
+              <w:right w:val="single" w:color="BFBFBF" w:sz="4"/>
+            </w:tcBorders>
+            <w:tcMar>
+              <w:top w:type="dxa" w:w="60"/>
+              <w:left w:type="dxa" w:w="100"/>
+              <w:bottom w:type="dxa" w:w="60"/>
+              <w:right w:type="dxa" w:w="100"/>
+            </w:tcMar>
+          </w:tcPr>
+          <w:p>
+            <w:pPr>
+              <w:spacing w:after="0"/>
+            </w:pPr>
+            <w:r>
+              <w:rPr>
+                <w:rFonts w:ascii="Calibri" w:cs="Calibri" w:eastAsia="Calibri" w:hAnsi="Calibri"/>
+                <w:b w:val="false"/>
+                <w:bCs w:val="false"/>
+                <w:color w:val="000000"/>
+                <w:sz w:val="19"/>
+                <w:szCs w:val="19"/>
+              </w:rPr>
+              <w:t xml:space="preserve">Segmentation fault em prepara_imerg/prepara_gfs</w:t>
+            </w:r>
+          </w:p>
+        </w:tc>
+        <w:tc>
+          <w:tcPr>
+            <w:tcW w:type="dxa" w:w="2888"/>
+            <w:tcBorders>
+              <w:top w:val="single" w:color="BFBFBF" w:sz="4"/>
+              <w:left w:val="single" w:color="BFBFBF" w:sz="4"/>
+              <w:bottom w:val="single" w:color="BFBFBF" w:sz="4"/>
+              <w:right w:val="single" w:color="BFBFBF" w:sz="4"/>
+            </w:tcBorders>
+            <w:tcMar>
+              <w:top w:type="dxa" w:w="60"/>
+              <w:left w:type="dxa" w:w="100"/>
+              <w:bottom w:type="dxa" w:w="60"/>
+              <w:right w:type="dxa" w:w="100"/>
+            </w:tcMar>
+          </w:tcPr>
+          <w:p>
+            <w:pPr>
+              <w:spacing w:after="0"/>
+            </w:pPr>
+            <w:r>
+              <w:rPr>
+                <w:rFonts w:ascii="Calibri" w:cs="Calibri" w:eastAsia="Calibri" w:hAnsi="Calibri"/>
+                <w:b w:val="false"/>
+                <w:bCs w:val="false"/>
+                <w:color w:val="000000"/>
+                <w:sz w:val="19"/>
+                <w:szCs w:val="19"/>
+              </w:rPr>
+              <w:t xml:space="preserve">Versão antiga dos scripts (conversão HDF5/GRIB em threads simultâneas)</w:t>
+            </w:r>
+          </w:p>
+        </w:tc>
+        <w:tc>
+          <w:tcPr>
+            <w:tcW w:type="dxa" w:w="2888"/>
+            <w:tcBorders>
+              <w:top w:val="single" w:color="BFBFBF" w:sz="4"/>
+              <w:left w:val="single" w:color="BFBFBF" w:sz="4"/>
+              <w:bottom w:val="single" w:color="BFBFBF" w:sz="4"/>
+              <w:right w:val="single" w:color="BFBFBF" w:sz="4"/>
+            </w:tcBorders>
+            <w:tcMar>
+              <w:top w:type="dxa" w:w="60"/>
+              <w:left w:type="dxa" w:w="100"/>
+              <w:bottom w:type="dxa" w:w="60"/>
+              <w:right w:type="dxa" w:w="100"/>
+            </w:tcMar>
+          </w:tcPr>
+          <w:p>
+            <w:pPr>
+              <w:spacing w:after="0"/>
+            </w:pPr>
+            <w:r>
+              <w:rPr>
+                <w:rFonts w:ascii="Calibri" w:cs="Calibri" w:eastAsia="Calibri" w:hAnsi="Calibri"/>
+                <w:b w:val="false"/>
+                <w:bCs w:val="false"/>
+                <w:color w:val="000000"/>
+                <w:sz w:val="19"/>
+                <w:szCs w:val="19"/>
+              </w:rPr>
+              <w:t xml:space="preserve">Atualize: as versões atuais serializam a conversão com lock</w:t>
+            </w:r>
+          </w:p>
+        </w:tc>
+      </w:tr>
+      <w:tr>
+        <w:tc>
+          <w:tcPr>
+            <w:tcW w:type="dxa" w:w="3249"/>
+            <w:tcBorders>
+              <w:top w:val="single" w:color="BFBFBF" w:sz="4"/>
+              <w:left w:val="single" w:color="BFBFBF" w:sz="4"/>
+              <w:bottom w:val="single" w:color="BFBFBF" w:sz="4"/>
+              <w:right w:val="single" w:color="BFBFBF" w:sz="4"/>
+            </w:tcBorders>
+            <w:tcMar>
+              <w:top w:type="dxa" w:w="60"/>
+              <w:left w:type="dxa" w:w="100"/>
+              <w:bottom w:type="dxa" w:w="60"/>
+              <w:right w:type="dxa" w:w="100"/>
+            </w:tcMar>
+          </w:tcPr>
+          <w:p>
+            <w:pPr>
+              <w:spacing w:after="0"/>
+            </w:pPr>
+            <w:r>
+              <w:rPr>
+                <w:rFonts w:ascii="Calibri" w:cs="Calibri" w:eastAsia="Calibri" w:hAnsi="Calibri"/>
+                <w:b w:val="false"/>
+                <w:bCs w:val="false"/>
+                <w:color w:val="000000"/>
+                <w:sz w:val="19"/>
+                <w:szCs w:val="19"/>
+              </w:rPr>
+              <w:t xml:space="preserve">python3 continua sendo o 3.6 do sistema após ativar o conda</w:t>
+            </w:r>
+          </w:p>
+        </w:tc>
+        <w:tc>
+          <w:tcPr>
+            <w:tcW w:type="dxa" w:w="2888"/>
+            <w:tcBorders>
+              <w:top w:val="single" w:color="BFBFBF" w:sz="4"/>
+              <w:left w:val="single" w:color="BFBFBF" w:sz="4"/>
+              <w:bottom w:val="single" w:color="BFBFBF" w:sz="4"/>
+              <w:right w:val="single" w:color="BFBFBF" w:sz="4"/>
+            </w:tcBorders>
+            <w:tcMar>
+              <w:top w:type="dxa" w:w="60"/>
+              <w:left w:type="dxa" w:w="100"/>
+              <w:bottom w:type="dxa" w:w="60"/>
+              <w:right w:type="dxa" w:w="100"/>
+            </w:tcMar>
+          </w:tcPr>
+          <w:p>
+            <w:pPr>
+              <w:spacing w:after="0"/>
+            </w:pPr>
+            <w:r>
+              <w:rPr>
+                <w:rFonts w:ascii="Calibri" w:cs="Calibri" w:eastAsia="Calibri" w:hAnsi="Calibri"/>
+                <w:b w:val="false"/>
+                <w:bCs w:val="false"/>
+                <w:color w:val="000000"/>
+                <w:sz w:val="19"/>
+                <w:szCs w:val="19"/>
+              </w:rPr>
+              <w:t xml:space="preserve">Env conda sem Python próprio (env "vazio")</w:t>
+            </w:r>
+          </w:p>
+        </w:tc>
+        <w:tc>
+          <w:tcPr>
+            <w:tcW w:type="dxa" w:w="2888"/>
+            <w:tcBorders>
+              <w:top w:val="single" w:color="BFBFBF" w:sz="4"/>
+              <w:left w:val="single" w:color="BFBFBF" w:sz="4"/>
+              <w:bottom w:val="single" w:color="BFBFBF" w:sz="4"/>
+              <w:right w:val="single" w:color="BFBFBF" w:sz="4"/>
+            </w:tcBorders>
+            <w:tcMar>
+              <w:top w:type="dxa" w:w="60"/>
+              <w:left w:type="dxa" w:w="100"/>
+              <w:bottom w:type="dxa" w:w="60"/>
+              <w:right w:type="dxa" w:w="100"/>
+            </w:tcMar>
+          </w:tcPr>
+          <w:p>
+            <w:pPr>
+              <w:spacing w:after="0"/>
+            </w:pPr>
+            <w:r>
+              <w:rPr>
+                <w:rFonts w:ascii="Calibri" w:cs="Calibri" w:eastAsia="Calibri" w:hAnsi="Calibri"/>
+                <w:b w:val="false"/>
+                <w:bCs w:val="false"/>
+                <w:color w:val="000000"/>
+                <w:sz w:val="19"/>
+                <w:szCs w:val="19"/>
+              </w:rPr>
+              <w:t xml:space="preserve">conda install -p &lt;caminho_do_env&gt; -c conda-forge python=3.12 ... ou use o venv</w:t>
             </w:r>
           </w:p>
         </w:tc>

</xml_diff>

<commit_message>
Adiciona analise de sensibilidade e regrade automatico de grades mistas
- rf_core/rf_previsto: --sem-vegetacao (classe uniforme, agua preservada) e
  --sem-topografia (FTOP=1, arquivo dispensado), independentes e combinaveis;
  sufixos _SEMVEG/_SEMTOPO no produto e fatores desligados registrados nos
  atributos do NetCDF; chaves tambem no YAML (execucao)
- rf_core.ler_precipitacao: regradeia automaticamente arquivos em grade
  diferente da referencia (GFS 0.25 + IMERG 0.1 no modo legado) e tolera
  latitude N->S
- Manual v1.7: opcoes na secao 5.2 e nova secao 5.6 (sensibilidade)
</commit_message>
<xml_diff>
--- a/docs/manual_usuario.docx
+++ b/docs/manual_usuario.docx
@@ -46,7 +46,7 @@
           <w:sz w:val="22"/>
           <w:szCs w:val="22"/>
         </w:rPr>
-        <w:t xml:space="preserve">Versão 1.6 · 5 de agosto de 2026</w:t>
+        <w:t xml:space="preserve">Versão 1.7 · 5 de agosto de 2026</w:t>
       </w:r>
     </w:p>
     <w:p>
@@ -3562,6 +3562,309 @@
                 <w:sz w:val="19"/>
                 <w:szCs w:val="19"/>
               </w:rPr>
+              <w:t xml:space="preserve">--sem-vegetacao</w:t>
+            </w:r>
+          </w:p>
+        </w:tc>
+        <w:tc>
+          <w:tcPr>
+            <w:tcW w:type="dxa" w:w="4694"/>
+            <w:tcBorders>
+              <w:top w:val="single" w:color="BFBFBF" w:sz="4"/>
+              <w:left w:val="single" w:color="BFBFBF" w:sz="4"/>
+              <w:bottom w:val="single" w:color="BFBFBF" w:sz="4"/>
+              <w:right w:val="single" w:color="BFBFBF" w:sz="4"/>
+            </w:tcBorders>
+            <w:tcMar>
+              <w:top w:type="dxa" w:w="60"/>
+              <w:left w:type="dxa" w:w="100"/>
+              <w:bottom w:type="dxa" w:w="60"/>
+              <w:right w:type="dxa" w:w="100"/>
+            </w:tcMar>
+          </w:tcPr>
+          <w:p>
+            <w:pPr>
+              <w:spacing w:after="0"/>
+            </w:pPr>
+            <w:r>
+              <w:rPr>
+                <w:rFonts w:ascii="Calibri" w:cs="Calibri" w:eastAsia="Calibri" w:hAnsi="Calibri"/>
+                <w:b w:val="false"/>
+                <w:bCs w:val="false"/>
+                <w:color w:val="000000"/>
+                <w:sz w:val="19"/>
+                <w:szCs w:val="19"/>
+              </w:rPr>
+              <w:t xml:space="preserve">Sensibilidade: desliga o efeito da vegetação (classe uniforme --classe-veg em toda a terra; água preservada); sufixo _SEMVEG no produto</w:t>
+            </w:r>
+          </w:p>
+        </w:tc>
+        <w:tc>
+          <w:tcPr>
+            <w:tcW w:type="dxa" w:w="2166"/>
+            <w:tcBorders>
+              <w:top w:val="single" w:color="BFBFBF" w:sz="4"/>
+              <w:left w:val="single" w:color="BFBFBF" w:sz="4"/>
+              <w:bottom w:val="single" w:color="BFBFBF" w:sz="4"/>
+              <w:right w:val="single" w:color="BFBFBF" w:sz="4"/>
+            </w:tcBorders>
+            <w:tcMar>
+              <w:top w:type="dxa" w:w="60"/>
+              <w:left w:type="dxa" w:w="100"/>
+              <w:bottom w:type="dxa" w:w="60"/>
+              <w:right w:type="dxa" w:w="100"/>
+            </w:tcMar>
+          </w:tcPr>
+          <w:p>
+            <w:pPr>
+              <w:spacing w:after="0"/>
+            </w:pPr>
+            <w:r>
+              <w:rPr>
+                <w:rFonts w:ascii="Calibri" w:cs="Calibri" w:eastAsia="Calibri" w:hAnsi="Calibri"/>
+                <w:b w:val="false"/>
+                <w:bCs w:val="false"/>
+                <w:color w:val="000000"/>
+                <w:sz w:val="19"/>
+                <w:szCs w:val="19"/>
+              </w:rPr>
+              <w:t xml:space="preserve">desativado</w:t>
+            </w:r>
+          </w:p>
+        </w:tc>
+      </w:tr>
+      <w:tr>
+        <w:tc>
+          <w:tcPr>
+            <w:tcW w:type="dxa" w:w="2166"/>
+            <w:tcBorders>
+              <w:top w:val="single" w:color="BFBFBF" w:sz="4"/>
+              <w:left w:val="single" w:color="BFBFBF" w:sz="4"/>
+              <w:bottom w:val="single" w:color="BFBFBF" w:sz="4"/>
+              <w:right w:val="single" w:color="BFBFBF" w:sz="4"/>
+            </w:tcBorders>
+            <w:tcMar>
+              <w:top w:type="dxa" w:w="60"/>
+              <w:left w:type="dxa" w:w="100"/>
+              <w:bottom w:type="dxa" w:w="60"/>
+              <w:right w:type="dxa" w:w="100"/>
+            </w:tcMar>
+          </w:tcPr>
+          <w:p>
+            <w:pPr>
+              <w:spacing w:after="0"/>
+            </w:pPr>
+            <w:r>
+              <w:rPr>
+                <w:rFonts w:ascii="Calibri" w:cs="Calibri" w:eastAsia="Calibri" w:hAnsi="Calibri"/>
+                <w:b w:val="false"/>
+                <w:bCs w:val="false"/>
+                <w:color w:val="000000"/>
+                <w:sz w:val="19"/>
+                <w:szCs w:val="19"/>
+              </w:rPr>
+              <w:t xml:space="preserve">--sem-topografia</w:t>
+            </w:r>
+          </w:p>
+        </w:tc>
+        <w:tc>
+          <w:tcPr>
+            <w:tcW w:type="dxa" w:w="4694"/>
+            <w:tcBorders>
+              <w:top w:val="single" w:color="BFBFBF" w:sz="4"/>
+              <w:left w:val="single" w:color="BFBFBF" w:sz="4"/>
+              <w:bottom w:val="single" w:color="BFBFBF" w:sz="4"/>
+              <w:right w:val="single" w:color="BFBFBF" w:sz="4"/>
+            </w:tcBorders>
+            <w:tcMar>
+              <w:top w:type="dxa" w:w="60"/>
+              <w:left w:type="dxa" w:w="100"/>
+              <w:bottom w:type="dxa" w:w="60"/>
+              <w:right w:type="dxa" w:w="100"/>
+            </w:tcMar>
+          </w:tcPr>
+          <w:p>
+            <w:pPr>
+              <w:spacing w:after="0"/>
+            </w:pPr>
+            <w:r>
+              <w:rPr>
+                <w:rFonts w:ascii="Calibri" w:cs="Calibri" w:eastAsia="Calibri" w:hAnsi="Calibri"/>
+                <w:b w:val="false"/>
+                <w:bCs w:val="false"/>
+                <w:color w:val="000000"/>
+                <w:sz w:val="19"/>
+                <w:szCs w:val="19"/>
+              </w:rPr>
+              <w:t xml:space="preserve">Sensibilidade: desliga o Fator Topográfico (FTOP=1; arquivo de topografia dispensado); sufixo _SEMTOPO no produto</w:t>
+            </w:r>
+          </w:p>
+        </w:tc>
+        <w:tc>
+          <w:tcPr>
+            <w:tcW w:type="dxa" w:w="2166"/>
+            <w:tcBorders>
+              <w:top w:val="single" w:color="BFBFBF" w:sz="4"/>
+              <w:left w:val="single" w:color="BFBFBF" w:sz="4"/>
+              <w:bottom w:val="single" w:color="BFBFBF" w:sz="4"/>
+              <w:right w:val="single" w:color="BFBFBF" w:sz="4"/>
+            </w:tcBorders>
+            <w:tcMar>
+              <w:top w:type="dxa" w:w="60"/>
+              <w:left w:type="dxa" w:w="100"/>
+              <w:bottom w:type="dxa" w:w="60"/>
+              <w:right w:type="dxa" w:w="100"/>
+            </w:tcMar>
+          </w:tcPr>
+          <w:p>
+            <w:pPr>
+              <w:spacing w:after="0"/>
+            </w:pPr>
+            <w:r>
+              <w:rPr>
+                <w:rFonts w:ascii="Calibri" w:cs="Calibri" w:eastAsia="Calibri" w:hAnsi="Calibri"/>
+                <w:b w:val="false"/>
+                <w:bCs w:val="false"/>
+                <w:color w:val="000000"/>
+                <w:sz w:val="19"/>
+                <w:szCs w:val="19"/>
+              </w:rPr>
+              <w:t xml:space="preserve">desativado</w:t>
+            </w:r>
+          </w:p>
+        </w:tc>
+      </w:tr>
+      <w:tr>
+        <w:tc>
+          <w:tcPr>
+            <w:tcW w:type="dxa" w:w="2166"/>
+            <w:tcBorders>
+              <w:top w:val="single" w:color="BFBFBF" w:sz="4"/>
+              <w:left w:val="single" w:color="BFBFBF" w:sz="4"/>
+              <w:bottom w:val="single" w:color="BFBFBF" w:sz="4"/>
+              <w:right w:val="single" w:color="BFBFBF" w:sz="4"/>
+            </w:tcBorders>
+            <w:tcMar>
+              <w:top w:type="dxa" w:w="60"/>
+              <w:left w:type="dxa" w:w="100"/>
+              <w:bottom w:type="dxa" w:w="60"/>
+              <w:right w:type="dxa" w:w="100"/>
+            </w:tcMar>
+          </w:tcPr>
+          <w:p>
+            <w:pPr>
+              <w:spacing w:after="0"/>
+            </w:pPr>
+            <w:r>
+              <w:rPr>
+                <w:rFonts w:ascii="Calibri" w:cs="Calibri" w:eastAsia="Calibri" w:hAnsi="Calibri"/>
+                <w:b w:val="false"/>
+                <w:bCs w:val="false"/>
+                <w:color w:val="000000"/>
+                <w:sz w:val="19"/>
+                <w:szCs w:val="19"/>
+              </w:rPr>
+              <w:t xml:space="preserve">--classe-veg N</w:t>
+            </w:r>
+          </w:p>
+        </w:tc>
+        <w:tc>
+          <w:tcPr>
+            <w:tcW w:type="dxa" w:w="4694"/>
+            <w:tcBorders>
+              <w:top w:val="single" w:color="BFBFBF" w:sz="4"/>
+              <w:left w:val="single" w:color="BFBFBF" w:sz="4"/>
+              <w:bottom w:val="single" w:color="BFBFBF" w:sz="4"/>
+              <w:right w:val="single" w:color="BFBFBF" w:sz="4"/>
+            </w:tcBorders>
+            <w:tcMar>
+              <w:top w:type="dxa" w:w="60"/>
+              <w:left w:type="dxa" w:w="100"/>
+              <w:bottom w:type="dxa" w:w="60"/>
+              <w:right w:type="dxa" w:w="100"/>
+            </w:tcMar>
+          </w:tcPr>
+          <w:p>
+            <w:pPr>
+              <w:spacing w:after="0"/>
+            </w:pPr>
+            <w:r>
+              <w:rPr>
+                <w:rFonts w:ascii="Calibri" w:cs="Calibri" w:eastAsia="Calibri" w:hAnsi="Calibri"/>
+                <w:b w:val="false"/>
+                <w:bCs w:val="false"/>
+                <w:color w:val="000000"/>
+                <w:sz w:val="19"/>
+                <w:szCs w:val="19"/>
+              </w:rPr>
+              <w:t xml:space="preserve">Classe usada com --sem-vegetacao</w:t>
+            </w:r>
+          </w:p>
+        </w:tc>
+        <w:tc>
+          <w:tcPr>
+            <w:tcW w:type="dxa" w:w="2166"/>
+            <w:tcBorders>
+              <w:top w:val="single" w:color="BFBFBF" w:sz="4"/>
+              <w:left w:val="single" w:color="BFBFBF" w:sz="4"/>
+              <w:bottom w:val="single" w:color="BFBFBF" w:sz="4"/>
+              <w:right w:val="single" w:color="BFBFBF" w:sz="4"/>
+            </w:tcBorders>
+            <w:tcMar>
+              <w:top w:type="dxa" w:w="60"/>
+              <w:left w:type="dxa" w:w="100"/>
+              <w:bottom w:type="dxa" w:w="60"/>
+              <w:right w:type="dxa" w:w="100"/>
+            </w:tcMar>
+          </w:tcPr>
+          <w:p>
+            <w:pPr>
+              <w:spacing w:after="0"/>
+            </w:pPr>
+            <w:r>
+              <w:rPr>
+                <w:rFonts w:ascii="Calibri" w:cs="Calibri" w:eastAsia="Calibri" w:hAnsi="Calibri"/>
+                <w:b w:val="false"/>
+                <w:bCs w:val="false"/>
+                <w:color w:val="000000"/>
+                <w:sz w:val="19"/>
+                <w:szCs w:val="19"/>
+              </w:rPr>
+              <w:t xml:space="preserve">4 (A=2,4; PSE_max=75)</w:t>
+            </w:r>
+          </w:p>
+        </w:tc>
+      </w:tr>
+      <w:tr>
+        <w:tc>
+          <w:tcPr>
+            <w:tcW w:type="dxa" w:w="2166"/>
+            <w:tcBorders>
+              <w:top w:val="single" w:color="BFBFBF" w:sz="4"/>
+              <w:left w:val="single" w:color="BFBFBF" w:sz="4"/>
+              <w:bottom w:val="single" w:color="BFBFBF" w:sz="4"/>
+              <w:right w:val="single" w:color="BFBFBF" w:sz="4"/>
+            </w:tcBorders>
+            <w:tcMar>
+              <w:top w:type="dxa" w:w="60"/>
+              <w:left w:type="dxa" w:w="100"/>
+              <w:bottom w:type="dxa" w:w="60"/>
+              <w:right w:type="dxa" w:w="100"/>
+            </w:tcMar>
+          </w:tcPr>
+          <w:p>
+            <w:pPr>
+              <w:spacing w:after="0"/>
+            </w:pPr>
+            <w:r>
+              <w:rPr>
+                <w:rFonts w:ascii="Calibri" w:cs="Calibri" w:eastAsia="Calibri" w:hAnsi="Calibri"/>
+                <w:b w:val="false"/>
+                <w:bCs w:val="false"/>
+                <w:color w:val="000000"/>
+                <w:sz w:val="19"/>
+                <w:szCs w:val="19"/>
+              </w:rPr>
               <w:t xml:space="preserve">--data-final / --jobs N</w:t>
             </w:r>
           </w:p>
@@ -5130,6 +5433,117 @@
           <w:szCs w:val="22"/>
         </w:rPr>
         <w:t xml:space="preserve">O arquivo config_exemplo.yaml traz o modelo completo comentado; as seções são validadas na leitura (chave desconhecida gera erro com a lista das válidas). Requer PyYAML (pip install pyyaml) — arquivos .json funcionam sem ele.</w:t>
+      </w:r>
+    </w:p>
+    <w:p>
+      <w:pPr>
+        <w:pStyle w:val="Heading2"/>
+        <w:spacing w:after="160" w:before="280"/>
+      </w:pPr>
+      <w:r>
+        <w:rPr>
+          <w:rFonts w:ascii="Calibri" w:cs="Calibri" w:eastAsia="Calibri" w:hAnsi="Calibri"/>
+          <w:b/>
+          <w:bCs/>
+          <w:color w:val="1F4E79"/>
+          <w:sz w:val="25"/>
+          <w:szCs w:val="25"/>
+        </w:rPr>
+        <w:t xml:space="preserve">5.6 Análise de sensibilidade (--sem-vegetacao / --sem-topografia)</w:t>
+      </w:r>
+    </w:p>
+    <w:p>
+      <w:pPr>
+        <w:spacing w:after="160" w:line="276"/>
+        <w:jc w:val="both"/>
+      </w:pPr>
+      <w:r>
+        <w:rPr>
+          <w:rFonts w:ascii="Calibri" w:cs="Calibri" w:eastAsia="Calibri" w:hAnsi="Calibri"/>
+          <w:b w:val="false"/>
+          <w:bCs w:val="false"/>
+          <w:i w:val="false"/>
+          <w:iCs w:val="false"/>
+          <w:color w:val="000000"/>
+          <w:sz w:val="22"/>
+          <w:szCs w:val="22"/>
+        </w:rPr>
+        <w:t xml:space="preserve">Para medir o impacto individual de cada componente do modelo, as duas chaves podem ser desligadas de forma independente (e combinadas):</w:t>
+      </w:r>
+    </w:p>
+    <w:p>
+      <w:pPr>
+        <w:shd w:fill="F2F2F2" w:val="clear"/>
+        <w:spacing w:after="0"/>
+      </w:pPr>
+      <w:r>
+        <w:rPr>
+          <w:rFonts w:ascii="Consolas" w:cs="Consolas" w:eastAsia="Consolas" w:hAnsi="Consolas"/>
+          <w:sz w:val="19"/>
+          <w:szCs w:val="19"/>
+        </w:rPr>
+        <w:t xml:space="preserve">python3 rf_previsto.py --data-final 20260804 --horizontes 3d              # referência</w:t>
+      </w:r>
+    </w:p>
+    <w:p>
+      <w:pPr>
+        <w:shd w:fill="F2F2F2" w:val="clear"/>
+        <w:spacing w:after="0"/>
+      </w:pPr>
+      <w:r>
+        <w:rPr>
+          <w:rFonts w:ascii="Consolas" w:cs="Consolas" w:eastAsia="Consolas" w:hAnsi="Consolas"/>
+          <w:sz w:val="19"/>
+          <w:szCs w:val="19"/>
+        </w:rPr>
+        <w:t xml:space="preserve">python3 rf_previsto.py --data-final 20260804 --horizontes 3d --sem-topografia</w:t>
+      </w:r>
+    </w:p>
+    <w:p>
+      <w:pPr>
+        <w:shd w:fill="F2F2F2" w:val="clear"/>
+        <w:spacing w:after="0"/>
+      </w:pPr>
+      <w:r>
+        <w:rPr>
+          <w:rFonts w:ascii="Consolas" w:cs="Consolas" w:eastAsia="Consolas" w:hAnsi="Consolas"/>
+          <w:sz w:val="19"/>
+          <w:szCs w:val="19"/>
+        </w:rPr>
+        <w:t xml:space="preserve">python3 rf_previsto.py --data-final 20260804 --horizontes 3d --sem-vegetacao</w:t>
+      </w:r>
+    </w:p>
+    <w:p>
+      <w:pPr>
+        <w:shd w:fill="F2F2F2" w:val="clear"/>
+        <w:spacing w:after="160"/>
+      </w:pPr>
+      <w:r>
+        <w:rPr>
+          <w:rFonts w:ascii="Consolas" w:cs="Consolas" w:eastAsia="Consolas" w:hAnsi="Consolas"/>
+          <w:sz w:val="19"/>
+          <w:szCs w:val="19"/>
+        </w:rPr>
+        <w:t xml:space="preserve">python3 rf_previsto.py --data-final 20260804 --horizontes 3d --sem-vegetacao --sem-topografia</w:t>
+      </w:r>
+    </w:p>
+    <w:p>
+      <w:pPr>
+        <w:spacing w:after="160" w:line="276"/>
+        <w:jc w:val="both"/>
+      </w:pPr>
+      <w:r>
+        <w:rPr>
+          <w:rFonts w:ascii="Calibri" w:cs="Calibri" w:eastAsia="Calibri" w:hAnsi="Calibri"/>
+          <w:b w:val="false"/>
+          <w:bCs w:val="false"/>
+          <w:i w:val="false"/>
+          <w:iCs w:val="false"/>
+          <w:color w:val="000000"/>
+          <w:sz w:val="22"/>
+          <w:szCs w:val="22"/>
+        </w:rPr>
+        <w:t xml:space="preserve">Semântica: topografia desligada zera a correção (FTOP≡1) e dispensa o arquivo de topografia; vegetação desligada substitui as classes por uma classe uniforme (--classe-veg, padrão 4) mantendo a máscara d'água e a grade de 1 km — o domínio fica idêntico ao da referência, e a diferença entre os campos mede só o efeito das classes. Os fatores de latitude e meteorológicos permanecem ativos. Proteções: o produto ganha sufixo automático (_SEMVEG/_SEMTOPO), nunca sobrescrevendo a referência, e o NetCDF registra os fatores desligados nos atributos globais (fator_vegetacao/fator_topografia). As chaves também existem no YAML (sem_vegetacao, sem_topografia, classe_veg).</w:t>
       </w:r>
     </w:p>
     <w:p>

</xml_diff>

<commit_message>
Sensibilidade sem arquivos estaticos e rodada diaria via YAML
- rf_core: com usar_vegetacao=False o mapa NAO e lido; classe uniforme em
  todos os pontos e saida na grade da precipitacao, sem mascara d'agua;
  topografia (se ligada) regradeada automaticamente (ler_topografia_grade);
  com --sem-vegetacao --sem-topografia o RF roda sem NENHUM arquivo estatico
- rf_previsto: --data-final aceita 'hoje'/'auto'/'sistema' (data do sistema),
  permitindo rodada diaria operacional definida so no YAML (data_final: hoje
  + horizontes pre-estabelecidos)
- config_exemplo.yaml: chaves de sensibilidade (sem_vegetacao,
  sem_topografia, classe_veg) comentadas com as combinacoes de rodada
- Manual v1.8: secoes 5.2, 5.5 e 5.6 atualizadas
</commit_message>
<xml_diff>
--- a/docs/manual_usuario.docx
+++ b/docs/manual_usuario.docx
@@ -46,7 +46,7 @@
           <w:sz w:val="22"/>
           <w:szCs w:val="22"/>
         </w:rPr>
-        <w:t xml:space="preserve">Versão 1.7 · 5 de agosto de 2026</w:t>
+        <w:t xml:space="preserve">Versão 1.8 · 5 de agosto de 2026</w:t>
       </w:r>
     </w:p>
     <w:p>
@@ -3595,7 +3595,7 @@
                 <w:sz w:val="19"/>
                 <w:szCs w:val="19"/>
               </w:rPr>
-              <w:t xml:space="preserve">Sensibilidade: desliga o efeito da vegetação (classe uniforme --classe-veg em toda a terra; água preservada); sufixo _SEMVEG no produto</w:t>
+              <w:t xml:space="preserve">Sensibilidade: desliga o efeito da vegetação; o mapa não é lido (classe uniforme --classe-veg, saída na grade da precipitação, sem máscara d'água); sufixo _SEMVEG no produto</w:t>
             </w:r>
           </w:p>
         </w:tc>
@@ -3898,7 +3898,7 @@
                 <w:sz w:val="19"/>
                 <w:szCs w:val="19"/>
               </w:rPr>
-              <w:t xml:space="preserve">Como nos demais scripts</w:t>
+              <w:t xml:space="preserve">Como nos demais scripts; aceita também "hoje" (= data do sistema, útil no YAML)</w:t>
             </w:r>
           </w:p>
         </w:tc>
@@ -5195,7 +5195,7 @@
                 <w:sz w:val="19"/>
                 <w:szCs w:val="19"/>
               </w:rPr>
-              <w:t xml:space="preserve">Padrões da linha de comando: fonte, horizontes ou de/ate/passo, data_final, rb_max, produto, jobs, fallback_gfs, sem_tif, fogograma</w:t>
+              <w:t xml:space="preserve">Padrões da linha de comando: fonte, horizontes ou de/ate/passo, data_final, rb_max, produto, jobs, fallback_gfs, sem_tif, fogograma, sem_vegetacao, sem_topografia, classe_veg</w:t>
             </w:r>
           </w:p>
         </w:tc>
@@ -5377,6 +5377,62 @@
     <w:p>
       <w:pPr>
         <w:shd w:fill="F2F2F2" w:val="clear"/>
+        <w:spacing w:after="0"/>
+      </w:pPr>
+      <w:r>
+        <w:rPr>
+          <w:rFonts w:ascii="Consolas" w:cs="Consolas" w:eastAsia="Consolas" w:hAnsi="Consolas"/>
+          <w:sz w:val="19"/>
+          <w:szCs w:val="19"/>
+        </w:rPr>
+        <w:t xml:space="preserve">  data_final: hoje       # data do sistema (tambem: auto, sistema) — ou "20260804"</w:t>
+      </w:r>
+    </w:p>
+    <w:p>
+      <w:pPr>
+        <w:shd w:fill="F2F2F2" w:val="clear"/>
+        <w:spacing w:after="0"/>
+      </w:pPr>
+      <w:r>
+        <w:rPr>
+          <w:rFonts w:ascii="Consolas" w:cs="Consolas" w:eastAsia="Consolas" w:hAnsi="Consolas"/>
+          <w:sz w:val="19"/>
+          <w:szCs w:val="19"/>
+        </w:rPr>
+        <w:t xml:space="preserve">  produto: RF_PREV_BESM</w:t>
+      </w:r>
+    </w:p>
+    <w:p>
+      <w:pPr>
+        <w:shd w:fill="F2F2F2" w:val="clear"/>
+        <w:spacing w:after="0"/>
+      </w:pPr>
+      <w:r>
+        <w:rPr>
+          <w:rFonts w:ascii="Consolas" w:cs="Consolas" w:eastAsia="Consolas" w:hAnsi="Consolas"/>
+          <w:sz w:val="19"/>
+          <w:szCs w:val="19"/>
+        </w:rPr>
+        <w:t xml:space="preserve">  sem_vegetacao: false   # sensibilidade (secao 5.6): true dispensa o mapa</w:t>
+      </w:r>
+    </w:p>
+    <w:p>
+      <w:pPr>
+        <w:shd w:fill="F2F2F2" w:val="clear"/>
+        <w:spacing w:after="0"/>
+      </w:pPr>
+      <w:r>
+        <w:rPr>
+          <w:rFonts w:ascii="Consolas" w:cs="Consolas" w:eastAsia="Consolas" w:hAnsi="Consolas"/>
+          <w:sz w:val="19"/>
+          <w:szCs w:val="19"/>
+        </w:rPr>
+        <w:t xml:space="preserve">  sem_topografia: false  # true dispensa a topografia (FTOP = 1)</w:t>
+      </w:r>
+    </w:p>
+    <w:p>
+      <w:pPr>
+        <w:shd w:fill="F2F2F2" w:val="clear"/>
         <w:spacing w:after="160"/>
       </w:pPr>
       <w:r>
@@ -5385,7 +5441,7 @@
           <w:sz w:val="19"/>
           <w:szCs w:val="19"/>
         </w:rPr>
-        <w:t xml:space="preserve">  produto: RF_PREV_BESM</w:t>
+        <w:t xml:space="preserve">  classe_veg: 4</w:t>
       </w:r>
     </w:p>
     <w:p>
@@ -5432,24 +5488,7 @@
           <w:sz w:val="22"/>
           <w:szCs w:val="22"/>
         </w:rPr>
-        <w:t xml:space="preserve">O arquivo config_exemplo.yaml traz o modelo completo comentado; as seções são validadas na leitura (chave desconhecida gera erro com a lista das válidas). Requer PyYAML (pip install pyyaml) — arquivos .json funcionam sem ele.</w:t>
-      </w:r>
-    </w:p>
-    <w:p>
-      <w:pPr>
-        <w:pStyle w:val="Heading2"/>
-        <w:spacing w:after="160" w:before="280"/>
-      </w:pPr>
-      <w:r>
-        <w:rPr>
-          <w:rFonts w:ascii="Calibri" w:cs="Calibri" w:eastAsia="Calibri" w:hAnsi="Calibri"/>
-          <w:b/>
-          <w:bCs/>
-          <w:color w:val="1F4E79"/>
-          <w:sz w:val="25"/>
-          <w:szCs w:val="25"/>
-        </w:rPr>
-        <w:t xml:space="preserve">5.6 Análise de sensibilidade (--sem-vegetacao / --sem-topografia)</w:t>
+        <w:t xml:space="preserve">Com data_final: hoje (equivalente a omitir a chave) e horizontes (ou de/ate/passo) declarados no arquivo, o YAML define uma rodada diária operacional: cada execução usa a data corrente do sistema e produz sempre os mesmos horizontes pré-estabelecidos — ideal para agendar no cron. As chaves de sensibilidade permitem manter arquivos separados por experimento (ex.: config.yaml de referência e config_semveg.yaml com sem_vegetacao: true), sem alterar a linha de comando.</w:t>
       </w:r>
     </w:p>
     <w:p>
@@ -5468,63 +5507,24 @@
           <w:sz w:val="22"/>
           <w:szCs w:val="22"/>
         </w:rPr>
-        <w:t xml:space="preserve">Para medir o impacto individual de cada componente do modelo, as duas chaves podem ser desligadas de forma independente (e combinadas):</w:t>
-      </w:r>
-    </w:p>
-    <w:p>
-      <w:pPr>
-        <w:shd w:fill="F2F2F2" w:val="clear"/>
-        <w:spacing w:after="0"/>
-      </w:pPr>
-      <w:r>
-        <w:rPr>
-          <w:rFonts w:ascii="Consolas" w:cs="Consolas" w:eastAsia="Consolas" w:hAnsi="Consolas"/>
-          <w:sz w:val="19"/>
-          <w:szCs w:val="19"/>
-        </w:rPr>
-        <w:t xml:space="preserve">python3 rf_previsto.py --data-final 20260804 --horizontes 3d              # referência</w:t>
-      </w:r>
-    </w:p>
-    <w:p>
-      <w:pPr>
-        <w:shd w:fill="F2F2F2" w:val="clear"/>
-        <w:spacing w:after="0"/>
-      </w:pPr>
-      <w:r>
-        <w:rPr>
-          <w:rFonts w:ascii="Consolas" w:cs="Consolas" w:eastAsia="Consolas" w:hAnsi="Consolas"/>
-          <w:sz w:val="19"/>
-          <w:szCs w:val="19"/>
-        </w:rPr>
-        <w:t xml:space="preserve">python3 rf_previsto.py --data-final 20260804 --horizontes 3d --sem-topografia</w:t>
-      </w:r>
-    </w:p>
-    <w:p>
-      <w:pPr>
-        <w:shd w:fill="F2F2F2" w:val="clear"/>
-        <w:spacing w:after="0"/>
-      </w:pPr>
-      <w:r>
-        <w:rPr>
-          <w:rFonts w:ascii="Consolas" w:cs="Consolas" w:eastAsia="Consolas" w:hAnsi="Consolas"/>
-          <w:sz w:val="19"/>
-          <w:szCs w:val="19"/>
-        </w:rPr>
-        <w:t xml:space="preserve">python3 rf_previsto.py --data-final 20260804 --horizontes 3d --sem-vegetacao</w:t>
-      </w:r>
-    </w:p>
-    <w:p>
-      <w:pPr>
-        <w:shd w:fill="F2F2F2" w:val="clear"/>
-        <w:spacing w:after="160"/>
-      </w:pPr>
-      <w:r>
-        <w:rPr>
-          <w:rFonts w:ascii="Consolas" w:cs="Consolas" w:eastAsia="Consolas" w:hAnsi="Consolas"/>
-          <w:sz w:val="19"/>
-          <w:szCs w:val="19"/>
-        </w:rPr>
-        <w:t xml:space="preserve">python3 rf_previsto.py --data-final 20260804 --horizontes 3d --sem-vegetacao --sem-topografia</w:t>
+        <w:t xml:space="preserve">O arquivo config_exemplo.yaml traz o modelo completo comentado; as seções são validadas na leitura (chave desconhecida gera erro com a lista das válidas). Requer PyYAML (pip install pyyaml) — arquivos .json funcionam sem ele.</w:t>
+      </w:r>
+    </w:p>
+    <w:p>
+      <w:pPr>
+        <w:pStyle w:val="Heading2"/>
+        <w:spacing w:after="160" w:before="280"/>
+      </w:pPr>
+      <w:r>
+        <w:rPr>
+          <w:rFonts w:ascii="Calibri" w:cs="Calibri" w:eastAsia="Calibri" w:hAnsi="Calibri"/>
+          <w:b/>
+          <w:bCs/>
+          <w:color w:val="1F4E79"/>
+          <w:sz w:val="25"/>
+          <w:szCs w:val="25"/>
+        </w:rPr>
+        <w:t xml:space="preserve">5.6 Análise de sensibilidade (--sem-vegetacao / --sem-topografia)</w:t>
       </w:r>
     </w:p>
     <w:p>
@@ -5543,7 +5543,82 @@
           <w:sz w:val="22"/>
           <w:szCs w:val="22"/>
         </w:rPr>
-        <w:t xml:space="preserve">Semântica: topografia desligada zera a correção (FTOP≡1) e dispensa o arquivo de topografia; vegetação desligada substitui as classes por uma classe uniforme (--classe-veg, padrão 4) mantendo a máscara d'água e a grade de 1 km — o domínio fica idêntico ao da referência, e a diferença entre os campos mede só o efeito das classes. Os fatores de latitude e meteorológicos permanecem ativos. Proteções: o produto ganha sufixo automático (_SEMVEG/_SEMTOPO), nunca sobrescrevendo a referência, e o NetCDF registra os fatores desligados nos atributos globais (fator_vegetacao/fator_topografia). As chaves também existem no YAML (sem_vegetacao, sem_topografia, classe_veg).</w:t>
+        <w:t xml:space="preserve">Para medir o impacto individual de cada componente do modelo, as duas chaves podem ser desligadas de forma independente (e combinadas):</w:t>
+      </w:r>
+    </w:p>
+    <w:p>
+      <w:pPr>
+        <w:shd w:fill="F2F2F2" w:val="clear"/>
+        <w:spacing w:after="0"/>
+      </w:pPr>
+      <w:r>
+        <w:rPr>
+          <w:rFonts w:ascii="Consolas" w:cs="Consolas" w:eastAsia="Consolas" w:hAnsi="Consolas"/>
+          <w:sz w:val="19"/>
+          <w:szCs w:val="19"/>
+        </w:rPr>
+        <w:t xml:space="preserve">python3 rf_previsto.py --data-final 20260804 --horizontes 3d              # referência</w:t>
+      </w:r>
+    </w:p>
+    <w:p>
+      <w:pPr>
+        <w:shd w:fill="F2F2F2" w:val="clear"/>
+        <w:spacing w:after="0"/>
+      </w:pPr>
+      <w:r>
+        <w:rPr>
+          <w:rFonts w:ascii="Consolas" w:cs="Consolas" w:eastAsia="Consolas" w:hAnsi="Consolas"/>
+          <w:sz w:val="19"/>
+          <w:szCs w:val="19"/>
+        </w:rPr>
+        <w:t xml:space="preserve">python3 rf_previsto.py --data-final 20260804 --horizontes 3d --sem-topografia</w:t>
+      </w:r>
+    </w:p>
+    <w:p>
+      <w:pPr>
+        <w:shd w:fill="F2F2F2" w:val="clear"/>
+        <w:spacing w:after="0"/>
+      </w:pPr>
+      <w:r>
+        <w:rPr>
+          <w:rFonts w:ascii="Consolas" w:cs="Consolas" w:eastAsia="Consolas" w:hAnsi="Consolas"/>
+          <w:sz w:val="19"/>
+          <w:szCs w:val="19"/>
+        </w:rPr>
+        <w:t xml:space="preserve">python3 rf_previsto.py --data-final 20260804 --horizontes 3d --sem-vegetacao</w:t>
+      </w:r>
+    </w:p>
+    <w:p>
+      <w:pPr>
+        <w:shd w:fill="F2F2F2" w:val="clear"/>
+        <w:spacing w:after="160"/>
+      </w:pPr>
+      <w:r>
+        <w:rPr>
+          <w:rFonts w:ascii="Consolas" w:cs="Consolas" w:eastAsia="Consolas" w:hAnsi="Consolas"/>
+          <w:sz w:val="19"/>
+          <w:szCs w:val="19"/>
+        </w:rPr>
+        <w:t xml:space="preserve">python3 rf_previsto.py --data-final 20260804 --horizontes 3d --sem-vegetacao --sem-topografia</w:t>
+      </w:r>
+    </w:p>
+    <w:p>
+      <w:pPr>
+        <w:spacing w:after="160" w:line="276"/>
+        <w:jc w:val="both"/>
+      </w:pPr>
+      <w:r>
+        <w:rPr>
+          <w:rFonts w:ascii="Calibri" w:cs="Calibri" w:eastAsia="Calibri" w:hAnsi="Calibri"/>
+          <w:b w:val="false"/>
+          <w:bCs w:val="false"/>
+          <w:i w:val="false"/>
+          <w:iCs w:val="false"/>
+          <w:color w:val="000000"/>
+          <w:sz w:val="22"/>
+          <w:szCs w:val="22"/>
+        </w:rPr>
+        <w:t xml:space="preserve">Semântica: topografia desligada zera a correção (FTOP≡1) e dispensa o arquivo de topografia; vegetação desligada dispensa o mapa de vegetação (o arquivo não é lido): todos os pontos recebem uma classe uniforme (--classe-veg, padrão 4) e a saída passa a usar a grade da precipitação — sem interpolação para 1 km e sem máscara d'água. Com as duas chaves ligadas, o RF roda sem nenhum arquivo estático (útil quando o mapa de vegetação e a topografia ainda não estão disponíveis); se a topografia permanecer ligada com a vegetação desligada, a elevação é regradeada automaticamente para a grade da precipitação. Os fatores de latitude e meteorológicos permanecem ativos. Proteções: o produto ganha sufixo automático (_SEMVEG/_SEMTOPO), nunca sobrescrevendo a referência, e o NetCDF registra os fatores desligados nos atributos globais (fator_vegetacao/fator_topografia). As chaves também existem no YAML (sem_vegetacao, sem_topografia, classe_veg).</w:t>
       </w:r>
     </w:p>
     <w:p>

</xml_diff>

<commit_message>
Sensibilidade sem arquivos estaticos, rodada diaria via YAML e fonte padrao GFS
- rf_core: com usar_vegetacao=False o mapa NAO e lido; classe uniforme em
  todos os pontos e saida na grade da precipitacao, sem mascara d'agua;
  topografia (se ligada) regradeada automaticamente (ler_topografia_grade);
  com --sem-vegetacao --sem-topografia o RF roda sem NENHUM arquivo estatico
- rf_previsto: --data-final aceita 'hoje'/'auto'/'sistema' (data do sistema),
  permitindo rodada diaria operacional definida so no YAML (data_final: hoje
  + horizontes pre-estabelecidos)
- Sem fonte definida (YAML ou CLI) a rodada volta ao GFS (composicao
  legada): fonte comentada no config_exemplo.yaml e novo valor
  --fonte padrao (legado/nenhuma) para sobrepor a fonte do YAML
- config_exemplo.yaml: chaves de sensibilidade (sem_vegetacao,
  sem_topografia, classe_veg) com as combinacoes de rodada
- Manual v1.8: secoes 5.2, 5.5 e 5.6 atualizadas
</commit_message>
<xml_diff>
--- a/docs/manual_usuario.docx
+++ b/docs/manual_usuario.docx
@@ -2686,7 +2686,7 @@
                 <w:sz w:val="19"/>
                 <w:szCs w:val="19"/>
               </w:rPr>
-              <w:t xml:space="preserve">Fonte de previsão: gfs, eta, besm ou outra definida via JSON (seção 5.4)</w:t>
+              <w:t xml:space="preserve">Fonte de previsão: gfs, eta, besm ou outra definida via JSON (seção 5.4); padrao (ou legado/nenhuma) força a composição legada do GFS mesmo com fonte no YAML</w:t>
             </w:r>
           </w:p>
         </w:tc>
@@ -5489,6 +5489,25 @@
           <w:szCs w:val="22"/>
         </w:rPr>
         <w:t xml:space="preserve">Com data_final: hoje (equivalente a omitir a chave) e horizontes (ou de/ate/passo) declarados no arquivo, o YAML define uma rodada diária operacional: cada execução usa a data corrente do sistema e produz sempre os mesmos horizontes pré-estabelecidos — ideal para agendar no cron. As chaves de sensibilidade permitem manter arquivos separados por experimento (ex.: config.yaml de referência e config_semveg.yaml com sem_vegetacao: true), sem alterar a linha de comando.</w:t>
+      </w:r>
+    </w:p>
+    <w:p>
+      <w:pPr>
+        <w:spacing w:after="160" w:line="276"/>
+        <w:jc w:val="both"/>
+      </w:pPr>
+      <w:r>
+        <w:rPr>
+          <w:rFonts w:ascii="Calibri" w:cs="Calibri" w:eastAsia="Calibri" w:hAnsi="Calibri"/>
+          <w:b w:val="false"/>
+          <w:bCs w:val="false"/>
+          <w:i w:val="false"/>
+          <w:iCs w:val="false"/>
+          <w:color w:val="000000"/>
+          <w:sz w:val="22"/>
+          <w:szCs w:val="22"/>
+        </w:rPr>
+        <w:t xml:space="preserve">Atenção com a chave fonte: sem ela (e sem --fonte na CLI), a rodada usa a composição original dos produtos operacionais com o GFS — este é o padrão. Se o YAML declarar fonte: besm (ou outra), essa fonte vale em toda execução que não passar --fonte na linha de comando (precedência CLI &gt; YAML). Para forçar o GFS sem editar o arquivo, use --fonte padrao (aceita também legado/nenhuma). Por isso o config_exemplo.yaml traz a chave comentada: declare-a apenas em arquivos dedicados a uma fonte específica (ex.: config_besm.yaml).</w:t>
       </w:r>
     </w:p>
     <w:p>

</xml_diff>

<commit_message>
Adiciona ERA5 (prepara_era5) e Risco de Fogo observado (rf_observado)
- prepara_era5.py: baixa t2m, td2m, u10 e v10 da ERA5 (API do CDS/
  Copernicus, requisicoes agrupadas por mes, dominio recortado), calcula a
  UR de t+td (formula de Magnus) e grava no padrao de leitura do RF:
  ERA5.OBS.TEMP2m.RH2m.{data}{hora}.nc e ERA5.OBS.U10m.V10m.{data}{hora}.nc
- rf_observado.py: RF OBSERVADO com IMERG (120 dias, incluindo o dia
  analisado) + ERA5 na hora da analise (18 UTC); periodos --dias/--semanas/
  --meses/--de+--ate; --simular confere as entradas; dias incompletos sao
  pulados com aviso; saidas RF.OBS.* em data/output/2.2/RF_OBS; suporta
  --sem-vegetacao/--sem-topografia
- rf_config: caminhos era5_dir/era5_padrao/era5_padrao_vento e
  caminho_era5(); config_exemplo.yaml atualizado
- requirements.txt: + cdsapi
- Testes: teste_prepara_era5.py e teste_rf_observado.py
- Manual v1.9: secoes 6.3 (ERA5) e 6.4 (RF observado)
</commit_message>
<xml_diff>
--- a/docs/manual_usuario.docx
+++ b/docs/manual_usuario.docx
@@ -46,7 +46,7 @@
           <w:sz w:val="22"/>
           <w:szCs w:val="22"/>
         </w:rPr>
-        <w:t xml:space="preserve">Versão 1.8 · 5 de agosto de 2026</w:t>
+        <w:t xml:space="preserve">Versão 1.9 · 5 de agosto de 2026</w:t>
       </w:r>
     </w:p>
     <w:p>
@@ -251,6 +251,37 @@
           <w:szCs w:val="22"/>
         </w:rPr>
         <w:t xml:space="preserve"> — script genérico: gera o RF para qualquer horizonte de previsão e diferentes fontes de dados (GFS, Eta, BESM) informados na linha de comando (seção 5).</w:t>
+      </w:r>
+    </w:p>
+    <w:p>
+      <w:pPr>
+        <w:pStyle w:val="ListParagraph"/>
+        <w:numPr>
+          <w:ilvl w:val="0"/>
+          <w:numId w:val="2"/>
+        </w:numPr>
+        <w:spacing w:after="100" w:line="276"/>
+        <w:jc w:val="both"/>
+      </w:pPr>
+      <w:r>
+        <w:rPr>
+          <w:rFonts w:ascii="Calibri" w:cs="Calibri" w:eastAsia="Calibri" w:hAnsi="Calibri"/>
+          <w:b/>
+          <w:bCs/>
+          <w:sz w:val="22"/>
+          <w:szCs w:val="22"/>
+        </w:rPr>
+        <w:t xml:space="preserve">rf_observado.py</w:t>
+      </w:r>
+      <w:r>
+        <w:rPr>
+          <w:rFonts w:ascii="Calibri" w:cs="Calibri" w:eastAsia="Calibri" w:hAnsi="Calibri"/>
+          <w:b w:val="false"/>
+          <w:bCs w:val="false"/>
+          <w:sz w:val="22"/>
+          <w:szCs w:val="22"/>
+        </w:rPr>
+        <w:t xml:space="preserve"> — RF observado dos últimos dias, semanas ou meses, com IMERG + ERA5 (seção 6.4).</w:t>
       </w:r>
     </w:p>
     <w:p>
@@ -1175,6 +1206,34 @@
           <w:sz w:val="19"/>
           <w:szCs w:val="19"/>
         </w:rPr>
+        <w:t xml:space="preserve">prepara_era5.py</w:t>
+      </w:r>
+    </w:p>
+    <w:p>
+      <w:pPr>
+        <w:shd w:fill="F2F2F2" w:val="clear"/>
+        <w:spacing w:after="0"/>
+      </w:pPr>
+      <w:r>
+        <w:rPr>
+          <w:rFonts w:ascii="Consolas" w:cs="Consolas" w:eastAsia="Consolas" w:hAnsi="Consolas"/>
+          <w:sz w:val="19"/>
+          <w:szCs w:val="19"/>
+        </w:rPr>
+        <w:t xml:space="preserve">rf_observado.py</w:t>
+      </w:r>
+    </w:p>
+    <w:p>
+      <w:pPr>
+        <w:shd w:fill="F2F2F2" w:val="clear"/>
+        <w:spacing w:after="0"/>
+      </w:pPr>
+      <w:r>
+        <w:rPr>
+          <w:rFonts w:ascii="Consolas" w:cs="Consolas" w:eastAsia="Consolas" w:hAnsi="Consolas"/>
+          <w:sz w:val="19"/>
+          <w:szCs w:val="19"/>
+        </w:rPr>
         <w:t xml:space="preserve">teste_rf.py</w:t>
       </w:r>
     </w:p>
@@ -1223,6 +1282,34 @@
     <w:p>
       <w:pPr>
         <w:shd w:fill="F2F2F2" w:val="clear"/>
+        <w:spacing w:after="0"/>
+      </w:pPr>
+      <w:r>
+        <w:rPr>
+          <w:rFonts w:ascii="Consolas" w:cs="Consolas" w:eastAsia="Consolas" w:hAnsi="Consolas"/>
+          <w:sz w:val="19"/>
+          <w:szCs w:val="19"/>
+        </w:rPr>
+        <w:t xml:space="preserve">teste_prepara_imerg.py</w:t>
+      </w:r>
+    </w:p>
+    <w:p>
+      <w:pPr>
+        <w:shd w:fill="F2F2F2" w:val="clear"/>
+        <w:spacing w:after="0"/>
+      </w:pPr>
+      <w:r>
+        <w:rPr>
+          <w:rFonts w:ascii="Consolas" w:cs="Consolas" w:eastAsia="Consolas" w:hAnsi="Consolas"/>
+          <w:sz w:val="19"/>
+          <w:szCs w:val="19"/>
+        </w:rPr>
+        <w:t xml:space="preserve">teste_prepara_era5.py</w:t>
+      </w:r>
+    </w:p>
+    <w:p>
+      <w:pPr>
+        <w:shd w:fill="F2F2F2" w:val="clear"/>
         <w:spacing w:after="160"/>
       </w:pPr>
       <w:r>
@@ -1231,7 +1318,7 @@
           <w:sz w:val="19"/>
           <w:szCs w:val="19"/>
         </w:rPr>
-        <w:t xml:space="preserve">teste_prepara_imerg.py</w:t>
+        <w:t xml:space="preserve">teste_rf_observado.py</w:t>
       </w:r>
     </w:p>
     <w:p>
@@ -5654,7 +5741,7 @@
           <w:sz w:val="30"/>
           <w:szCs w:val="30"/>
         </w:rPr>
-        <w:t xml:space="preserve">6. Preparo dos dados de entrada (prepara_gfs.py e prepara_imerg.py)</w:t>
+        <w:t xml:space="preserve">6. Preparo dos dados de entrada e RF observado (prepara_gfs, prepara_imerg, prepara_era5, rf_observado)</w:t>
       </w:r>
     </w:p>
     <w:p>
@@ -6462,6 +6549,561 @@
           <w:szCs w:val="22"/>
         </w:rPr>
         <w:t xml:space="preserve">O script pula dias já existentes (rodar de novo completa o que faltou; --sobrescrever regrava), tenta as letras de versão da NASA automaticamente (V07D→V07A), baixa em paralelo (--jobs) e trata a transposição lon/lat e os valores inválidos do formato IMERG. Cada dia baixa ~25 MB do arquivo global e grava ~2–3 MB recortados. Produtos: early (padrão), late (~14 h) e final (pesquisa, meses de latência — ideal para períodos históricos).</w:t>
+      </w:r>
+    </w:p>
+    <w:p>
+      <w:pPr>
+        <w:pStyle w:val="Heading2"/>
+        <w:spacing w:after="160" w:before="280"/>
+      </w:pPr>
+      <w:r>
+        <w:rPr>
+          <w:rFonts w:ascii="Calibri" w:cs="Calibri" w:eastAsia="Calibri" w:hAnsi="Calibri"/>
+          <w:b/>
+          <w:bCs/>
+          <w:color w:val="1F4E79"/>
+          <w:sz w:val="25"/>
+          <w:szCs w:val="25"/>
+        </w:rPr>
+        <w:t xml:space="preserve">6.3 ERA5 (prepara_era5.py)</w:t>
+      </w:r>
+    </w:p>
+    <w:p>
+      <w:pPr>
+        <w:spacing w:after="160" w:line="276"/>
+        <w:jc w:val="both"/>
+      </w:pPr>
+      <w:r>
+        <w:rPr>
+          <w:rFonts w:ascii="Calibri" w:cs="Calibri" w:eastAsia="Calibri" w:hAnsi="Calibri"/>
+          <w:b w:val="false"/>
+          <w:bCs w:val="false"/>
+          <w:i w:val="false"/>
+          <w:iCs w:val="false"/>
+          <w:color w:val="000000"/>
+          <w:sz w:val="22"/>
+          <w:szCs w:val="22"/>
+        </w:rPr>
+        <w:t xml:space="preserve">O prepara_era5.py baixa a reanálise ERA5 (Copernicus/ECMWF, 0,25°) e converte para o padrão de leitura do RF: temperatura a 2 m, umidade relativa a 2 m calculada da temperatura + ponto de orvalho (fórmula de Magnus, Alduchov &amp; Eskridge 1996) e vento a 10 m (u10/v10, para uso futuro). Para cada dia são gravados dois arquivos no destino da chave era5_dir do config.yaml:</w:t>
+      </w:r>
+    </w:p>
+    <w:tbl>
+      <w:tblPr>
+        <w:tblW w:type="dxa" w:w="9026"/>
+        <w:tblBorders>
+          <w:top w:val="single" w:color="auto" w:sz="4"/>
+          <w:left w:val="single" w:color="auto" w:sz="4"/>
+          <w:bottom w:val="single" w:color="auto" w:sz="4"/>
+          <w:right w:val="single" w:color="auto" w:sz="4"/>
+          <w:insideH w:val="single" w:color="auto" w:sz="4"/>
+          <w:insideV w:val="single" w:color="auto" w:sz="4"/>
+        </w:tblBorders>
+      </w:tblPr>
+      <w:tblGrid>
+        <w:gridCol w:w="4062"/>
+        <w:gridCol w:w="4964"/>
+      </w:tblGrid>
+      <w:tr>
+        <w:trPr>
+          <w:tblHeader/>
+        </w:trPr>
+        <w:tc>
+          <w:tcPr>
+            <w:tcW w:type="dxa" w:w="4062"/>
+            <w:tcBorders>
+              <w:top w:val="single" w:color="BFBFBF" w:sz="4"/>
+              <w:left w:val="single" w:color="BFBFBF" w:sz="4"/>
+              <w:bottom w:val="single" w:color="BFBFBF" w:sz="4"/>
+              <w:right w:val="single" w:color="BFBFBF" w:sz="4"/>
+            </w:tcBorders>
+            <w:shd w:fill="1F4E79" w:val="clear"/>
+            <w:tcMar>
+              <w:top w:type="dxa" w:w="60"/>
+              <w:left w:type="dxa" w:w="100"/>
+              <w:bottom w:type="dxa" w:w="60"/>
+              <w:right w:type="dxa" w:w="100"/>
+            </w:tcMar>
+          </w:tcPr>
+          <w:p>
+            <w:pPr>
+              <w:spacing w:after="0"/>
+            </w:pPr>
+            <w:r>
+              <w:rPr>
+                <w:rFonts w:ascii="Calibri" w:cs="Calibri" w:eastAsia="Calibri" w:hAnsi="Calibri"/>
+                <w:b/>
+                <w:bCs/>
+                <w:color w:val="FFFFFF"/>
+                <w:sz w:val="19"/>
+                <w:szCs w:val="19"/>
+              </w:rPr>
+              <w:t xml:space="preserve">Arquivo</w:t>
+            </w:r>
+          </w:p>
+        </w:tc>
+        <w:tc>
+          <w:tcPr>
+            <w:tcW w:type="dxa" w:w="4964"/>
+            <w:tcBorders>
+              <w:top w:val="single" w:color="BFBFBF" w:sz="4"/>
+              <w:left w:val="single" w:color="BFBFBF" w:sz="4"/>
+              <w:bottom w:val="single" w:color="BFBFBF" w:sz="4"/>
+              <w:right w:val="single" w:color="BFBFBF" w:sz="4"/>
+            </w:tcBorders>
+            <w:shd w:fill="1F4E79" w:val="clear"/>
+            <w:tcMar>
+              <w:top w:type="dxa" w:w="60"/>
+              <w:left w:type="dxa" w:w="100"/>
+              <w:bottom w:type="dxa" w:w="60"/>
+              <w:right w:type="dxa" w:w="100"/>
+            </w:tcMar>
+          </w:tcPr>
+          <w:p>
+            <w:pPr>
+              <w:spacing w:after="0"/>
+            </w:pPr>
+            <w:r>
+              <w:rPr>
+                <w:rFonts w:ascii="Calibri" w:cs="Calibri" w:eastAsia="Calibri" w:hAnsi="Calibri"/>
+                <w:b/>
+                <w:bCs/>
+                <w:color w:val="FFFFFF"/>
+                <w:sz w:val="19"/>
+                <w:szCs w:val="19"/>
+              </w:rPr>
+              <w:t xml:space="preserve">Variáveis</w:t>
+            </w:r>
+          </w:p>
+        </w:tc>
+      </w:tr>
+      <w:tr>
+        <w:tc>
+          <w:tcPr>
+            <w:tcW w:type="dxa" w:w="4062"/>
+            <w:tcBorders>
+              <w:top w:val="single" w:color="BFBFBF" w:sz="4"/>
+              <w:left w:val="single" w:color="BFBFBF" w:sz="4"/>
+              <w:bottom w:val="single" w:color="BFBFBF" w:sz="4"/>
+              <w:right w:val="single" w:color="BFBFBF" w:sz="4"/>
+            </w:tcBorders>
+            <w:tcMar>
+              <w:top w:type="dxa" w:w="60"/>
+              <w:left w:type="dxa" w:w="100"/>
+              <w:bottom w:type="dxa" w:w="60"/>
+              <w:right w:type="dxa" w:w="100"/>
+            </w:tcMar>
+          </w:tcPr>
+          <w:p>
+            <w:pPr>
+              <w:spacing w:after="0"/>
+            </w:pPr>
+            <w:r>
+              <w:rPr>
+                <w:rFonts w:ascii="Calibri" w:cs="Calibri" w:eastAsia="Calibri" w:hAnsi="Calibri"/>
+                <w:b w:val="false"/>
+                <w:bCs w:val="false"/>
+                <w:color w:val="000000"/>
+                <w:sz w:val="19"/>
+                <w:szCs w:val="19"/>
+              </w:rPr>
+              <w:t xml:space="preserve">ERA5.OBS.TEMP2m.RH2m.{data}{hora}.nc</w:t>
+            </w:r>
+          </w:p>
+        </w:tc>
+        <w:tc>
+          <w:tcPr>
+            <w:tcW w:type="dxa" w:w="4964"/>
+            <w:tcBorders>
+              <w:top w:val="single" w:color="BFBFBF" w:sz="4"/>
+              <w:left w:val="single" w:color="BFBFBF" w:sz="4"/>
+              <w:bottom w:val="single" w:color="BFBFBF" w:sz="4"/>
+              <w:right w:val="single" w:color="BFBFBF" w:sz="4"/>
+            </w:tcBorders>
+            <w:tcMar>
+              <w:top w:type="dxa" w:w="60"/>
+              <w:left w:type="dxa" w:w="100"/>
+              <w:bottom w:type="dxa" w:w="60"/>
+              <w:right w:type="dxa" w:w="100"/>
+            </w:tcMar>
+          </w:tcPr>
+          <w:p>
+            <w:pPr>
+              <w:spacing w:after="0"/>
+            </w:pPr>
+            <w:r>
+              <w:rPr>
+                <w:rFonts w:ascii="Calibri" w:cs="Calibri" w:eastAsia="Calibri" w:hAnsi="Calibri"/>
+                <w:b w:val="false"/>
+                <w:bCs w:val="false"/>
+                <w:color w:val="000000"/>
+                <w:sz w:val="19"/>
+                <w:szCs w:val="19"/>
+              </w:rPr>
+              <w:t xml:space="preserve">TEMP2m (K) e RH2m (%) — lido por rf_core.ler_temp_ur, mesmo formato do GFS</w:t>
+            </w:r>
+          </w:p>
+        </w:tc>
+      </w:tr>
+      <w:tr>
+        <w:tc>
+          <w:tcPr>
+            <w:tcW w:type="dxa" w:w="4062"/>
+            <w:tcBorders>
+              <w:top w:val="single" w:color="BFBFBF" w:sz="4"/>
+              <w:left w:val="single" w:color="BFBFBF" w:sz="4"/>
+              <w:bottom w:val="single" w:color="BFBFBF" w:sz="4"/>
+              <w:right w:val="single" w:color="BFBFBF" w:sz="4"/>
+            </w:tcBorders>
+            <w:tcMar>
+              <w:top w:type="dxa" w:w="60"/>
+              <w:left w:type="dxa" w:w="100"/>
+              <w:bottom w:type="dxa" w:w="60"/>
+              <w:right w:type="dxa" w:w="100"/>
+            </w:tcMar>
+          </w:tcPr>
+          <w:p>
+            <w:pPr>
+              <w:spacing w:after="0"/>
+            </w:pPr>
+            <w:r>
+              <w:rPr>
+                <w:rFonts w:ascii="Calibri" w:cs="Calibri" w:eastAsia="Calibri" w:hAnsi="Calibri"/>
+                <w:b w:val="false"/>
+                <w:bCs w:val="false"/>
+                <w:color w:val="000000"/>
+                <w:sz w:val="19"/>
+                <w:szCs w:val="19"/>
+              </w:rPr>
+              <w:t xml:space="preserve">ERA5.OBS.U10m.V10m.{data}{hora}.nc</w:t>
+            </w:r>
+          </w:p>
+        </w:tc>
+        <w:tc>
+          <w:tcPr>
+            <w:tcW w:type="dxa" w:w="4964"/>
+            <w:tcBorders>
+              <w:top w:val="single" w:color="BFBFBF" w:sz="4"/>
+              <w:left w:val="single" w:color="BFBFBF" w:sz="4"/>
+              <w:bottom w:val="single" w:color="BFBFBF" w:sz="4"/>
+              <w:right w:val="single" w:color="BFBFBF" w:sz="4"/>
+            </w:tcBorders>
+            <w:tcMar>
+              <w:top w:type="dxa" w:w="60"/>
+              <w:left w:type="dxa" w:w="100"/>
+              <w:bottom w:type="dxa" w:w="60"/>
+              <w:right w:type="dxa" w:w="100"/>
+            </w:tcMar>
+          </w:tcPr>
+          <w:p>
+            <w:pPr>
+              <w:spacing w:after="0"/>
+            </w:pPr>
+            <w:r>
+              <w:rPr>
+                <w:rFonts w:ascii="Calibri" w:cs="Calibri" w:eastAsia="Calibri" w:hAnsi="Calibri"/>
+                <w:b w:val="false"/>
+                <w:bCs w:val="false"/>
+                <w:color w:val="000000"/>
+                <w:sz w:val="19"/>
+                <w:szCs w:val="19"/>
+              </w:rPr>
+              <w:t xml:space="preserve">U10m e V10m (m/s)</w:t>
+            </w:r>
+          </w:p>
+        </w:tc>
+      </w:tr>
+    </w:tbl>
+    <w:p>
+      <w:pPr>
+        <w:spacing w:after="160" w:line="276"/>
+        <w:jc w:val="both"/>
+      </w:pPr>
+      <w:r>
+        <w:rPr>
+          <w:rFonts w:ascii="Calibri" w:cs="Calibri" w:eastAsia="Calibri" w:hAnsi="Calibri"/>
+          <w:b/>
+          <w:bCs/>
+          <w:i w:val="false"/>
+          <w:iCs w:val="false"/>
+          <w:color w:val="000000"/>
+          <w:sz w:val="22"/>
+          <w:szCs w:val="22"/>
+        </w:rPr>
+        <w:t xml:space="preserve">Pré-requisito (uma única vez): </w:t>
+      </w:r>
+      <w:r>
+        <w:rPr>
+          <w:rFonts w:ascii="Calibri" w:cs="Calibri" w:eastAsia="Calibri" w:hAnsi="Calibri"/>
+          <w:b w:val="false"/>
+          <w:bCs w:val="false"/>
+          <w:i w:val="false"/>
+          <w:iCs w:val="false"/>
+          <w:color w:val="000000"/>
+          <w:sz w:val="22"/>
+          <w:szCs w:val="22"/>
+        </w:rPr>
+        <w:t xml:space="preserve">conta gratuita no CDS (cds.climate.copernicus.eu), aceitar no site a licença do dataset "ERA5 hourly data on single levels", instalar a API (python3 -m pip install cdsapi) e criar o ~/.cdsapirc (chmod 600):</w:t>
+      </w:r>
+    </w:p>
+    <w:p>
+      <w:pPr>
+        <w:shd w:fill="F2F2F2" w:val="clear"/>
+        <w:spacing w:after="0"/>
+      </w:pPr>
+      <w:r>
+        <w:rPr>
+          <w:rFonts w:ascii="Consolas" w:cs="Consolas" w:eastAsia="Consolas" w:hAnsi="Consolas"/>
+          <w:sz w:val="19"/>
+          <w:szCs w:val="19"/>
+        </w:rPr>
+        <w:t xml:space="preserve">url: https://cds.climate.copernicus.eu/api</w:t>
+      </w:r>
+    </w:p>
+    <w:p>
+      <w:pPr>
+        <w:shd w:fill="F2F2F2" w:val="clear"/>
+        <w:spacing w:after="160"/>
+      </w:pPr>
+      <w:r>
+        <w:rPr>
+          <w:rFonts w:ascii="Consolas" w:cs="Consolas" w:eastAsia="Consolas" w:hAnsi="Consolas"/>
+          <w:sz w:val="19"/>
+          <w:szCs w:val="19"/>
+        </w:rPr>
+        <w:t xml:space="preserve">key: SEU-TOKEN-PESSOAL</w:t>
+      </w:r>
+    </w:p>
+    <w:p>
+      <w:pPr>
+        <w:spacing w:after="160" w:line="276"/>
+        <w:jc w:val="both"/>
+      </w:pPr>
+      <w:r>
+        <w:rPr>
+          <w:rFonts w:ascii="Calibri" w:cs="Calibri" w:eastAsia="Calibri" w:hAnsi="Calibri"/>
+          <w:b w:val="false"/>
+          <w:bCs w:val="false"/>
+          <w:i w:val="false"/>
+          <w:iCs w:val="false"/>
+          <w:color w:val="000000"/>
+          <w:sz w:val="22"/>
+          <w:szCs w:val="22"/>
+        </w:rPr>
+        <w:t xml:space="preserve">Modos de uso:</w:t>
+      </w:r>
+    </w:p>
+    <w:p>
+      <w:pPr>
+        <w:shd w:fill="F2F2F2" w:val="clear"/>
+        <w:spacing w:after="0"/>
+      </w:pPr>
+      <w:r>
+        <w:rPr>
+          <w:rFonts w:ascii="Consolas" w:cs="Consolas" w:eastAsia="Consolas" w:hAnsi="Consolas"/>
+          <w:sz w:val="19"/>
+          <w:szCs w:val="19"/>
+        </w:rPr>
+        <w:t xml:space="preserve">python3 prepara_era5.py --config config.yaml                 # últimos 7 dias disponíveis</w:t>
+      </w:r>
+    </w:p>
+    <w:p>
+      <w:pPr>
+        <w:shd w:fill="F2F2F2" w:val="clear"/>
+        <w:spacing w:after="0"/>
+      </w:pPr>
+      <w:r>
+        <w:rPr>
+          <w:rFonts w:ascii="Consolas" w:cs="Consolas" w:eastAsia="Consolas" w:hAnsi="Consolas"/>
+          <w:sz w:val="19"/>
+          <w:szCs w:val="19"/>
+        </w:rPr>
+        <w:t xml:space="preserve">python3 prepara_era5.py --inicio 20260601 --fim 20260731     # período explícito</w:t>
+      </w:r>
+    </w:p>
+    <w:p>
+      <w:pPr>
+        <w:shd w:fill="F2F2F2" w:val="clear"/>
+        <w:spacing w:after="0"/>
+      </w:pPr>
+      <w:r>
+        <w:rPr>
+          <w:rFonts w:ascii="Consolas" w:cs="Consolas" w:eastAsia="Consolas" w:hAnsi="Consolas"/>
+          <w:sz w:val="19"/>
+          <w:szCs w:val="19"/>
+        </w:rPr>
+        <w:t xml:space="preserve">python3 prepara_era5.py --data-final 20260730 --dias 120     # janela p/ rf_observado</w:t>
+      </w:r>
+    </w:p>
+    <w:p>
+      <w:pPr>
+        <w:shd w:fill="F2F2F2" w:val="clear"/>
+        <w:spacing w:after="160"/>
+      </w:pPr>
+      <w:r>
+        <w:rPr>
+          <w:rFonts w:ascii="Consolas" w:cs="Consolas" w:eastAsia="Consolas" w:hAnsi="Consolas"/>
+          <w:sz w:val="19"/>
+          <w:szCs w:val="19"/>
+        </w:rPr>
+        <w:t xml:space="preserve">python3 prepara_era5.py --simular                            # só o plano (sem baixar)</w:t>
+      </w:r>
+    </w:p>
+    <w:p>
+      <w:pPr>
+        <w:spacing w:after="160" w:line="276"/>
+        <w:jc w:val="both"/>
+      </w:pPr>
+      <w:r>
+        <w:rPr>
+          <w:rFonts w:ascii="Calibri" w:cs="Calibri" w:eastAsia="Calibri" w:hAnsi="Calibri"/>
+          <w:b w:val="false"/>
+          <w:bCs w:val="false"/>
+          <w:i w:val="false"/>
+          <w:iCs w:val="false"/>
+          <w:color w:val="000000"/>
+          <w:sz w:val="22"/>
+          <w:szCs w:val="22"/>
+        </w:rPr>
+        <w:t xml:space="preserve">A ERA5 tem atraso de ~5 dias (dias recentes vêm do produto preliminar ERA5T, tratado automaticamente), por isso a janela padrão termina 6 dias atrás. As requisições ao CDS são agrupadas por mês (mais eficientes na fila do Copernicus — cada uma pode esperar alguns minutos); a hora da análise é configurável (--hora, padrão 18 UTC, a mesma dos produtos do RF), dias completos são pulados e --sobrescrever regrava.</w:t>
+      </w:r>
+    </w:p>
+    <w:p>
+      <w:pPr>
+        <w:pStyle w:val="Heading2"/>
+        <w:spacing w:after="160" w:before="280"/>
+      </w:pPr>
+      <w:r>
+        <w:rPr>
+          <w:rFonts w:ascii="Calibri" w:cs="Calibri" w:eastAsia="Calibri" w:hAnsi="Calibri"/>
+          <w:b/>
+          <w:bCs/>
+          <w:color w:val="1F4E79"/>
+          <w:sz w:val="25"/>
+          <w:szCs w:val="25"/>
+        </w:rPr>
+        <w:t xml:space="preserve">6.4 Risco de Fogo observado (rf_observado.py)</w:t>
+      </w:r>
+    </w:p>
+    <w:p>
+      <w:pPr>
+        <w:spacing w:after="160" w:line="276"/>
+        <w:jc w:val="both"/>
+      </w:pPr>
+      <w:r>
+        <w:rPr>
+          <w:rFonts w:ascii="Calibri" w:cs="Calibri" w:eastAsia="Calibri" w:hAnsi="Calibri"/>
+          <w:b w:val="false"/>
+          <w:bCs w:val="false"/>
+          <w:i w:val="false"/>
+          <w:iCs w:val="false"/>
+          <w:color w:val="000000"/>
+          <w:sz w:val="22"/>
+          <w:szCs w:val="22"/>
+        </w:rPr>
+        <w:t xml:space="preserve">O rf_observado.py calcula o RF observado de dias que já passaram — últimos dias, semanas ou meses — usando apenas observações: a série completa de 120 dias do IMERG (incluindo o próprio dia analisado) e a T2m/UR2m da ERA5 na hora da análise. É a mesma formulação do modelo (rb_max 0,9 e fatores FU/FT/FLAT/FTOP), o que permite reconstituir o histórico recente e comparar com as previsões (RF.PREV.* × RF.OBS.*).</w:t>
+      </w:r>
+    </w:p>
+    <w:p>
+      <w:pPr>
+        <w:shd w:fill="F2F2F2" w:val="clear"/>
+        <w:spacing w:after="0"/>
+      </w:pPr>
+      <w:r>
+        <w:rPr>
+          <w:rFonts w:ascii="Consolas" w:cs="Consolas" w:eastAsia="Consolas" w:hAnsi="Consolas"/>
+          <w:sz w:val="19"/>
+          <w:szCs w:val="19"/>
+        </w:rPr>
+        <w:t xml:space="preserve">python3 rf_observado.py --config config.yaml --dias 7        # últimos 7 dias</w:t>
+      </w:r>
+    </w:p>
+    <w:p>
+      <w:pPr>
+        <w:shd w:fill="F2F2F2" w:val="clear"/>
+        <w:spacing w:after="0"/>
+      </w:pPr>
+      <w:r>
+        <w:rPr>
+          <w:rFonts w:ascii="Consolas" w:cs="Consolas" w:eastAsia="Consolas" w:hAnsi="Consolas"/>
+          <w:sz w:val="19"/>
+          <w:szCs w:val="19"/>
+        </w:rPr>
+        <w:t xml:space="preserve">python3 rf_observado.py --config config.yaml --semanas 2     # últimas 2 semanas</w:t>
+      </w:r>
+    </w:p>
+    <w:p>
+      <w:pPr>
+        <w:shd w:fill="F2F2F2" w:val="clear"/>
+        <w:spacing w:after="0"/>
+      </w:pPr>
+      <w:r>
+        <w:rPr>
+          <w:rFonts w:ascii="Consolas" w:cs="Consolas" w:eastAsia="Consolas" w:hAnsi="Consolas"/>
+          <w:sz w:val="19"/>
+          <w:szCs w:val="19"/>
+        </w:rPr>
+        <w:t xml:space="preserve">python3 rf_observado.py --config config.yaml --meses 3       # últimos 3 meses-calendário</w:t>
+      </w:r>
+    </w:p>
+    <w:p>
+      <w:pPr>
+        <w:shd w:fill="F2F2F2" w:val="clear"/>
+        <w:spacing w:after="0"/>
+      </w:pPr>
+      <w:r>
+        <w:rPr>
+          <w:rFonts w:ascii="Consolas" w:cs="Consolas" w:eastAsia="Consolas" w:hAnsi="Consolas"/>
+          <w:sz w:val="19"/>
+          <w:szCs w:val="19"/>
+        </w:rPr>
+        <w:t xml:space="preserve">python3 rf_observado.py --config config.yaml --de 20260601 --ate 20260731</w:t>
+      </w:r>
+    </w:p>
+    <w:p>
+      <w:pPr>
+        <w:shd w:fill="F2F2F2" w:val="clear"/>
+        <w:spacing w:after="0"/>
+      </w:pPr>
+      <w:r>
+        <w:rPr>
+          <w:rFonts w:ascii="Consolas" w:cs="Consolas" w:eastAsia="Consolas" w:hAnsi="Consolas"/>
+          <w:sz w:val="19"/>
+          <w:szCs w:val="19"/>
+        </w:rPr>
+        <w:t xml:space="preserve">python3 rf_observado.py --config config.yaml --dias 7 --simular   # confere as entradas</w:t>
+      </w:r>
+    </w:p>
+    <w:p>
+      <w:pPr>
+        <w:shd w:fill="F2F2F2" w:val="clear"/>
+        <w:spacing w:after="160"/>
+      </w:pPr>
+      <w:r>
+        <w:rPr>
+          <w:rFonts w:ascii="Consolas" w:cs="Consolas" w:eastAsia="Consolas" w:hAnsi="Consolas"/>
+          <w:sz w:val="19"/>
+          <w:szCs w:val="19"/>
+        </w:rPr>
+        <w:t xml:space="preserve">python3 rf_observado.py --config config.yaml --dias 7 --sem-vegetacao --sem-topografia</w:t>
+      </w:r>
+    </w:p>
+    <w:p>
+      <w:pPr>
+        <w:spacing w:after="160" w:line="276"/>
+        <w:jc w:val="both"/>
+      </w:pPr>
+      <w:r>
+        <w:rPr>
+          <w:rFonts w:ascii="Calibri" w:cs="Calibri" w:eastAsia="Calibri" w:hAnsi="Calibri"/>
+          <w:b w:val="false"/>
+          <w:bCs w:val="false"/>
+          <w:i w:val="false"/>
+          <w:iCs w:val="false"/>
+          <w:color w:val="000000"/>
+          <w:sz w:val="22"/>
+          <w:szCs w:val="22"/>
+        </w:rPr>
+        <w:t xml:space="preserve">O fluxo completo é: prepara_imerg.py (precipitação do período + 119 dias anteriores) → prepara_era5.py (T/UR do período) → rf_observado.py. O --simular confere as entradas e aponta o que falta; dias com entradas incompletas são pulados com aviso (e o comando de preparo sugerido), sem interromper os demais. As saídas RF.OBS.{data}{hora}.nc (e .tif) vão para data/output/2.2/RF_OBS/netcdf (produto configurável via --produto, com os sufixos automáticos _SEMVEG/_SEMTOPO da análise de sensibilidade). Demais opções como no rf_previsto.py: --hora, --rb-max, --jobs, --sem-tif, --classe-veg, --data-final (aceita 'hoje'; padrão 6 dias atrás, pelo atraso da ERA5).</w:t>
       </w:r>
     </w:p>
     <w:p>
@@ -8879,6 +9521,34 @@
     <w:p>
       <w:pPr>
         <w:shd w:fill="F2F2F2" w:val="clear"/>
+        <w:spacing w:after="0"/>
+      </w:pPr>
+      <w:r>
+        <w:rPr>
+          <w:rFonts w:ascii="Consolas" w:cs="Consolas" w:eastAsia="Consolas" w:hAnsi="Consolas"/>
+          <w:sz w:val="19"/>
+          <w:szCs w:val="19"/>
+        </w:rPr>
+        <w:t xml:space="preserve">python3 teste_prepara_imerg.py # valida o preparo do IMERG (conversão, caminhos)</w:t>
+      </w:r>
+    </w:p>
+    <w:p>
+      <w:pPr>
+        <w:shd w:fill="F2F2F2" w:val="clear"/>
+        <w:spacing w:after="0"/>
+      </w:pPr>
+      <w:r>
+        <w:rPr>
+          <w:rFonts w:ascii="Consolas" w:cs="Consolas" w:eastAsia="Consolas" w:hAnsi="Consolas"/>
+          <w:sz w:val="19"/>
+          <w:szCs w:val="19"/>
+        </w:rPr>
+        <w:t xml:space="preserve">python3 teste_prepara_era5.py  # valida o preparo da ERA5 (UR de T+Td, conversão)</w:t>
+      </w:r>
+    </w:p>
+    <w:p>
+      <w:pPr>
+        <w:shd w:fill="F2F2F2" w:val="clear"/>
         <w:spacing w:after="160"/>
       </w:pPr>
       <w:r>
@@ -8887,7 +9557,7 @@
           <w:sz w:val="19"/>
           <w:szCs w:val="19"/>
         </w:rPr>
-        <w:t xml:space="preserve">python3 teste_prepara_imerg.py # valida o preparo do IMERG (conversão, caminhos)</w:t>
+        <w:t xml:space="preserve">python3 teste_rf_observado.py  # valida o RF observado de ponta a ponta</w:t>
       </w:r>
     </w:p>
     <w:p>

</xml_diff>

<commit_message>
Muda o base padrao para o diretorio do ian01 e melhora os preparos
</commit_message>
<xml_diff>
--- a/docs/manual_usuario.docx
+++ b/docs/manual_usuario.docx
@@ -1016,7 +1016,7 @@
           <w:sz w:val="22"/>
           <w:szCs w:val="22"/>
         </w:rPr>
-        <w:t xml:space="preserve">Todos os caminhos partem de /home/queimadas/INPE_FireRiskModel e estão definidos como constantes no topo de cada script (seção "Configurações"). Para rodar em outra máquina, basta editar a constante BASE.</w:t>
+        <w:t xml:space="preserve">Todos os caminhos partem do diretório base. O padrão embutido (em rf_config.py) é /p/projetos/grpeta/Team/jorge.gomes/risco-fogo-python; a precedência é --base (CLI) &gt; base do --config &gt; variável de ambiente RF_BASE &gt; padrão embutido. Exceção: os dois scripts legados (rf_previsto_1_5dias.py e rf_previsto_1_2_semanas.py) mantêm a constante BASE = /home/queimadas/INPE_FireRiskModel da produção, editável no topo de cada um.</w:t>
       </w:r>
     </w:p>
     <w:p>
@@ -3278,7 +3278,7 @@
                 <w:sz w:val="19"/>
                 <w:szCs w:val="19"/>
               </w:rPr>
-              <w:t xml:space="preserve">Diretório base do modelo (permite rodar fora da produção)</w:t>
+              <w:t xml:space="preserve">Diretório base do modelo (precedência: --base &gt; base do --config &gt; variável RF_BASE &gt; padrão embutido; produção: /home/queimadas/INPE_FireRiskModel)</w:t>
             </w:r>
           </w:p>
         </w:tc>
@@ -3311,7 +3311,7 @@
                 <w:sz w:val="19"/>
                 <w:szCs w:val="19"/>
               </w:rPr>
-              <w:t xml:space="preserve">/home/queimadas/INPE_FireRiskModel</w:t>
+              <w:t xml:space="preserve">/p/projetos/grpeta/Team/jorge.gomes/risco-fogo-python</w:t>
             </w:r>
           </w:p>
         </w:tc>

</xml_diff>

<commit_message>
Baixa o vento a 10 m do GFS (insumo do FWI previsto)
</commit_message>
<xml_diff>
--- a/docs/manual_usuario.docx
+++ b/docs/manual_usuario.docx
@@ -46,7 +46,7 @@
           <w:sz w:val="22"/>
           <w:szCs w:val="22"/>
         </w:rPr>
-        <w:t xml:space="preserve">Versão 2.2 · 5 de agosto de 2026</w:t>
+        <w:t xml:space="preserve">Versão 2.3 · 5 de agosto de 2026</w:t>
       </w:r>
     </w:p>
     <w:p>
@@ -6841,7 +6841,39 @@
           <w:sz w:val="22"/>
           <w:szCs w:val="22"/>
         </w:rPr>
-        <w:t xml:space="preserve">O prepara_gfs.py baixa a previsão do GFS 0,25° da NOAA e grava os arquivos GFS.PREV.PREC.* (prec em mm/dia) e GFS.PREV.TEMP2m.RH2m.* (T2m em K, UR2m em %) na convenção da seção 2.2, prontos para o rf_previsto.py. Requer o pygrib (python3 -m pip install pygrib).</w:t>
+        <w:t xml:space="preserve">O prepara_gfs.py baixa a previsão do GFS 0,25° da NOAA e grava, na convenção da seção 2.2, GFS.PREV.PREC.* (prec em mm/dia), GFS.PREV.TEMP2m.RH2m.* (T2m em K, UR2m em %) e GFS.PREV.U10m.V10m.* (vento a 10 m em m/s). Requer o pygrib (python3 -m pip install pygrib).</w:t>
+      </w:r>
+    </w:p>
+    <w:p>
+      <w:pPr>
+        <w:spacing w:after="160" w:line="276"/>
+        <w:jc w:val="both"/>
+      </w:pPr>
+      <w:r>
+        <w:rPr>
+          <w:rFonts w:ascii="Calibri" w:cs="Calibri" w:eastAsia="Calibri" w:hAnsi="Calibri"/>
+          <w:b/>
+          <w:bCs/>
+          <w:i w:val="false"/>
+          <w:iCs w:val="false"/>
+          <w:color w:val="000000"/>
+          <w:sz w:val="22"/>
+          <w:szCs w:val="22"/>
+        </w:rPr>
+        <w:t xml:space="preserve">Vento a 10 m. </w:t>
+      </w:r>
+      <w:r>
+        <w:rPr>
+          <w:rFonts w:ascii="Calibri" w:cs="Calibri" w:eastAsia="Calibri" w:hAnsi="Calibri"/>
+          <w:b w:val="false"/>
+          <w:bCs w:val="false"/>
+          <w:i w:val="false"/>
+          <w:iCs w:val="false"/>
+          <w:color w:val="000000"/>
+          <w:sz w:val="22"/>
+          <w:szCs w:val="22"/>
+        </w:rPr>
+        <w:t xml:space="preserve">O RF não usa vento, mas o FWI exige (é o insumo do ISI), então o download traz UGRD/VGRD por padrão — duas mensagens GRIB a mais por horário (~1 MB, de ~2 para ~3 MB). O arquivo de vento segue o mesmo formato do gerado pelo prepara_era5.py e é lido pela mesma função, o que permitirá encadear a análise observada com a previsão no FWI. Use --sem-vento para baixar apenas o necessário ao RF.</w:t>
       </w:r>
     </w:p>
     <w:p>
@@ -7028,7 +7060,7 @@
                 <w:sz w:val="19"/>
                 <w:szCs w:val="19"/>
               </w:rPr>
-              <w:t xml:space="preserve">"Fast download method": lê o índice .idx de cada horário e baixa por byte-range só as 3 mensagens GRIB necessárias, no espelho oficial da AWS (noaa-gfs-bdp-pds), ~2 MB por horário</w:t>
+              <w:t xml:space="preserve">"Fast download method": lê o índice .idx de cada horário e baixa por byte-range só as mensagens GRIB necessárias (3 sem vento, 5 com), no espelho oficial da AWS (noaa-gfs-bdp-pds), ~2–3 MB por horário</w:t>
             </w:r>
           </w:p>
         </w:tc>
@@ -11032,7 +11064,100 @@
           <w:sz w:val="22"/>
           <w:szCs w:val="22"/>
         </w:rPr>
-        <w:t xml:space="preserve">O FWI observado fecha a "análise de fogo contínua" da metodologia. Para o FWI previsto falta apenas o vento nas fontes de previsão: o prepara_gfs.py hoje baixa APCP, TMP e RH — acrescentar UGRD/VGRD a 10 m habilita o FWI de curto prazo; nas fontes sazonais (BESM/Eta) o vento precisa vir no pacote de dados. A condição inicial dos códigos de umidade sai naturalmente do estado salvo pelo fwi_observado.py (--estado-inicial).</w:t>
+        <w:t xml:space="preserve">O FWI observado fecha a "análise de fogo contínua" da metodologia. Para o FWI previsto faltam, nesta ordem:</w:t>
+      </w:r>
+    </w:p>
+    <w:p>
+      <w:pPr>
+        <w:pStyle w:val="ListParagraph"/>
+        <w:numPr>
+          <w:ilvl w:val="0"/>
+          <w:numId w:val="{num-fwi-0}"/>
+        </w:numPr>
+        <w:spacing w:after="100" w:line="276"/>
+        <w:jc w:val="both"/>
+      </w:pPr>
+      <w:r>
+        <w:rPr>
+          <w:rFonts w:ascii="Calibri" w:cs="Calibri" w:eastAsia="Calibri" w:hAnsi="Calibri"/>
+          <w:b/>
+          <w:bCs/>
+          <w:sz w:val="22"/>
+          <w:szCs w:val="22"/>
+        </w:rPr>
+        <w:t xml:space="preserve">Vento nas fontes — </w:t>
+      </w:r>
+      <w:r>
+        <w:rPr>
+          <w:rFonts w:ascii="Calibri" w:cs="Calibri" w:eastAsia="Calibri" w:hAnsi="Calibri"/>
+          <w:b w:val="false"/>
+          <w:bCs w:val="false"/>
+          <w:sz w:val="22"/>
+          <w:szCs w:val="22"/>
+        </w:rPr>
+        <w:t xml:space="preserve">resolvido para o GFS: o prepara_gfs.py já grava GFS.PREV.U10m.V10m.* (seção 6.1). Nas fontes sazonais (BESM/Eta) o vento ainda não vem no pacote de dados e precisa ser solicitado ao CPTEC — sem ele não há ISI e, portanto, não há FWI sazonal.</w:t>
+      </w:r>
+    </w:p>
+    <w:p>
+      <w:pPr>
+        <w:pStyle w:val="ListParagraph"/>
+        <w:numPr>
+          <w:ilvl w:val="0"/>
+          <w:numId w:val="{num-fwi-0}"/>
+        </w:numPr>
+        <w:spacing w:after="100" w:line="276"/>
+        <w:jc w:val="both"/>
+      </w:pPr>
+      <w:r>
+        <w:rPr>
+          <w:rFonts w:ascii="Calibri" w:cs="Calibri" w:eastAsia="Calibri" w:hAnsi="Calibri"/>
+          <w:b/>
+          <w:bCs/>
+          <w:sz w:val="22"/>
+          <w:szCs w:val="22"/>
+        </w:rPr>
+        <w:t xml:space="preserve">Camada de fontes — </w:t>
+      </w:r>
+      <w:r>
+        <w:rPr>
+          <w:rFonts w:ascii="Calibri" w:cs="Calibri" w:eastAsia="Calibri" w:hAnsi="Calibri"/>
+          <w:b w:val="false"/>
+          <w:bCs w:val="false"/>
+          <w:sz w:val="22"/>
+          <w:szCs w:val="22"/>
+        </w:rPr>
+        <w:t xml:space="preserve">o rf_fontes.py entrega precipitação, temperatura e umidade; falta declarar os padrões de arquivo e variáveis do vento.</w:t>
+      </w:r>
+    </w:p>
+    <w:p>
+      <w:pPr>
+        <w:pStyle w:val="ListParagraph"/>
+        <w:numPr>
+          <w:ilvl w:val="0"/>
+          <w:numId w:val="{num-fwi-0}"/>
+        </w:numPr>
+        <w:spacing w:after="100" w:line="276"/>
+        <w:jc w:val="both"/>
+      </w:pPr>
+      <w:r>
+        <w:rPr>
+          <w:rFonts w:ascii="Calibri" w:cs="Calibri" w:eastAsia="Calibri" w:hAnsi="Calibri"/>
+          <w:b/>
+          <w:bCs/>
+          <w:sz w:val="22"/>
+          <w:szCs w:val="22"/>
+        </w:rPr>
+        <w:t xml:space="preserve">Um fwi_previsto.py — </w:t>
+      </w:r>
+      <w:r>
+        <w:rPr>
+          <w:rFonts w:ascii="Calibri" w:cs="Calibri" w:eastAsia="Calibri" w:hAnsi="Calibri"/>
+          <w:b w:val="false"/>
+          <w:bCs w:val="false"/>
+          <w:sz w:val="22"/>
+          <w:szCs w:val="22"/>
+        </w:rPr>
+        <w:t xml:space="preserve">diferente do RF (independente por horizonte), o FWI previsto é sequencial: parte do estado dos códigos de umidade no dia da rodada e avança dia a dia até o horizonte. Essa peça já existe: o fwi_observado.py salva o estado (--salvar-estado) e o fwi_previsto o consumiria com --estado-inicial.</w:t>
       </w:r>
     </w:p>
     <w:p>

</xml_diff>